<commit_message>
Made changes to report
</commit_message>
<xml_diff>
--- a/LNER Disruption Prediction report.docx
+++ b/LNER Disruption Prediction report.docx
@@ -1163,7 +1163,7 @@
           <w:r>
             <w:fldChar w:fldCharType="separate"/>
           </w:r>
-          <w:hyperlink w:anchor="_Toc224748083" w:history="1">
+          <w:hyperlink w:anchor="_Toc224758561" w:history="1">
             <w:r>
               <w:rPr>
                 <w:rStyle w:val="Hyperlink"/>
@@ -1193,7 +1193,7 @@
                 <w:noProof/>
                 <w:webHidden/>
               </w:rPr>
-              <w:instrText xml:space="preserve"> PAGEREF _Toc224748083 \h </w:instrText>
+              <w:instrText xml:space="preserve"> PAGEREF _Toc224758561 \h </w:instrText>
             </w:r>
             <w:r>
               <w:rPr>
@@ -1238,7 +1238,7 @@
               <w:sz w:val="24"/>
             </w:rPr>
           </w:pPr>
-          <w:hyperlink w:anchor="_Toc224748084" w:history="1">
+          <w:hyperlink w:anchor="_Toc224758562" w:history="1">
             <w:r>
               <w:rPr>
                 <w:rStyle w:val="Hyperlink"/>
@@ -1287,7 +1287,7 @@
                 <w:noProof/>
                 <w:webHidden/>
               </w:rPr>
-              <w:instrText xml:space="preserve"> PAGEREF _Toc224748084 \h </w:instrText>
+              <w:instrText xml:space="preserve"> PAGEREF _Toc224758562 \h </w:instrText>
             </w:r>
             <w:r>
               <w:rPr>
@@ -1331,7 +1331,7 @@
               <w:sz w:val="24"/>
             </w:rPr>
           </w:pPr>
-          <w:hyperlink w:anchor="_Toc224748085" w:history="1">
+          <w:hyperlink w:anchor="_Toc224758563" w:history="1">
             <w:r>
               <w:rPr>
                 <w:rStyle w:val="Hyperlink"/>
@@ -1361,7 +1361,7 @@
                 <w:noProof/>
                 <w:webHidden/>
               </w:rPr>
-              <w:instrText xml:space="preserve"> PAGEREF _Toc224748085 \h </w:instrText>
+              <w:instrText xml:space="preserve"> PAGEREF _Toc224758563 \h </w:instrText>
             </w:r>
             <w:r>
               <w:rPr>
@@ -1405,7 +1405,7 @@
               <w:sz w:val="24"/>
             </w:rPr>
           </w:pPr>
-          <w:hyperlink w:anchor="_Toc224748086" w:history="1">
+          <w:hyperlink w:anchor="_Toc224758564" w:history="1">
             <w:r>
               <w:rPr>
                 <w:rStyle w:val="Hyperlink"/>
@@ -1435,7 +1435,7 @@
                 <w:noProof/>
                 <w:webHidden/>
               </w:rPr>
-              <w:instrText xml:space="preserve"> PAGEREF _Toc224748086 \h </w:instrText>
+              <w:instrText xml:space="preserve"> PAGEREF _Toc224758564 \h </w:instrText>
             </w:r>
             <w:r>
               <w:rPr>
@@ -1479,7 +1479,7 @@
               <w:sz w:val="24"/>
             </w:rPr>
           </w:pPr>
-          <w:hyperlink w:anchor="_Toc224748087" w:history="1">
+          <w:hyperlink w:anchor="_Toc224758565" w:history="1">
             <w:r>
               <w:rPr>
                 <w:rStyle w:val="Hyperlink"/>
@@ -1509,7 +1509,7 @@
                 <w:noProof/>
                 <w:webHidden/>
               </w:rPr>
-              <w:instrText xml:space="preserve"> PAGEREF _Toc224748087 \h </w:instrText>
+              <w:instrText xml:space="preserve"> PAGEREF _Toc224758565 \h </w:instrText>
             </w:r>
             <w:r>
               <w:rPr>
@@ -1553,7 +1553,7 @@
               <w:sz w:val="24"/>
             </w:rPr>
           </w:pPr>
-          <w:hyperlink w:anchor="_Toc224748088" w:history="1">
+          <w:hyperlink w:anchor="_Toc224758566" w:history="1">
             <w:r>
               <w:rPr>
                 <w:rStyle w:val="Hyperlink"/>
@@ -1583,7 +1583,7 @@
                 <w:noProof/>
                 <w:webHidden/>
               </w:rPr>
-              <w:instrText xml:space="preserve"> PAGEREF _Toc224748088 \h </w:instrText>
+              <w:instrText xml:space="preserve"> PAGEREF _Toc224758566 \h </w:instrText>
             </w:r>
             <w:r>
               <w:rPr>
@@ -1627,7 +1627,7 @@
               <w:sz w:val="24"/>
             </w:rPr>
           </w:pPr>
-          <w:hyperlink w:anchor="_Toc224748089" w:history="1">
+          <w:hyperlink w:anchor="_Toc224758567" w:history="1">
             <w:r>
               <w:rPr>
                 <w:rStyle w:val="Hyperlink"/>
@@ -1657,7 +1657,7 @@
                 <w:noProof/>
                 <w:webHidden/>
               </w:rPr>
-              <w:instrText xml:space="preserve"> PAGEREF _Toc224748089 \h </w:instrText>
+              <w:instrText xml:space="preserve"> PAGEREF _Toc224758567 \h </w:instrText>
             </w:r>
             <w:r>
               <w:rPr>
@@ -1701,7 +1701,7 @@
               <w:sz w:val="24"/>
             </w:rPr>
           </w:pPr>
-          <w:hyperlink w:anchor="_Toc224748090" w:history="1">
+          <w:hyperlink w:anchor="_Toc224758568" w:history="1">
             <w:r>
               <w:rPr>
                 <w:rStyle w:val="Hyperlink"/>
@@ -1731,7 +1731,7 @@
                 <w:noProof/>
                 <w:webHidden/>
               </w:rPr>
-              <w:instrText xml:space="preserve"> PAGEREF _Toc224748090 \h </w:instrText>
+              <w:instrText xml:space="preserve"> PAGEREF _Toc224758568 \h </w:instrText>
             </w:r>
             <w:r>
               <w:rPr>
@@ -1751,7 +1751,7 @@
                 <w:noProof/>
                 <w:webHidden/>
               </w:rPr>
-              <w:t>4</w:t>
+              <w:t>5</w:t>
             </w:r>
             <w:r>
               <w:rPr>
@@ -1775,7 +1775,7 @@
               <w:sz w:val="24"/>
             </w:rPr>
           </w:pPr>
-          <w:hyperlink w:anchor="_Toc224748091" w:history="1">
+          <w:hyperlink w:anchor="_Toc224758569" w:history="1">
             <w:r>
               <w:rPr>
                 <w:rStyle w:val="Hyperlink"/>
@@ -1805,7 +1805,7 @@
                 <w:noProof/>
                 <w:webHidden/>
               </w:rPr>
-              <w:instrText xml:space="preserve"> PAGEREF _Toc224748091 \h </w:instrText>
+              <w:instrText xml:space="preserve"> PAGEREF _Toc224758569 \h </w:instrText>
             </w:r>
             <w:r>
               <w:rPr>
@@ -1825,7 +1825,7 @@
                 <w:noProof/>
                 <w:webHidden/>
               </w:rPr>
-              <w:t>5</w:t>
+              <w:t>6</w:t>
             </w:r>
             <w:r>
               <w:rPr>
@@ -1849,7 +1849,7 @@
               <w:sz w:val="24"/>
             </w:rPr>
           </w:pPr>
-          <w:hyperlink w:anchor="_Toc224748092" w:history="1">
+          <w:hyperlink w:anchor="_Toc224758570" w:history="1">
             <w:r>
               <w:rPr>
                 <w:rStyle w:val="Hyperlink"/>
@@ -1879,7 +1879,7 @@
                 <w:noProof/>
                 <w:webHidden/>
               </w:rPr>
-              <w:instrText xml:space="preserve"> PAGEREF _Toc224748092 \h </w:instrText>
+              <w:instrText xml:space="preserve"> PAGEREF _Toc224758570 \h </w:instrText>
             </w:r>
             <w:r>
               <w:rPr>
@@ -1899,7 +1899,7 @@
                 <w:noProof/>
                 <w:webHidden/>
               </w:rPr>
-              <w:t>6</w:t>
+              <w:t>7</w:t>
             </w:r>
             <w:r>
               <w:rPr>
@@ -1923,7 +1923,7 @@
               <w:sz w:val="24"/>
             </w:rPr>
           </w:pPr>
-          <w:hyperlink w:anchor="_Toc224748093" w:history="1">
+          <w:hyperlink w:anchor="_Toc224758571" w:history="1">
             <w:r>
               <w:rPr>
                 <w:rStyle w:val="Hyperlink"/>
@@ -1953,7 +1953,7 @@
                 <w:noProof/>
                 <w:webHidden/>
               </w:rPr>
-              <w:instrText xml:space="preserve"> PAGEREF _Toc224748093 \h </w:instrText>
+              <w:instrText xml:space="preserve"> PAGEREF _Toc224758571 \h </w:instrText>
             </w:r>
             <w:r>
               <w:rPr>
@@ -1973,7 +1973,7 @@
                 <w:noProof/>
                 <w:webHidden/>
               </w:rPr>
-              <w:t>7</w:t>
+              <w:t>8</w:t>
             </w:r>
             <w:r>
               <w:rPr>
@@ -1994,7 +1994,7 @@
               <w:sz w:val="24"/>
             </w:rPr>
           </w:pPr>
-          <w:hyperlink w:anchor="_Toc224748094" w:history="1">
+          <w:hyperlink w:anchor="_Toc224758572" w:history="1">
             <w:r>
               <w:rPr>
                 <w:rStyle w:val="Hyperlink"/>
@@ -2024,7 +2024,7 @@
                 <w:noProof/>
                 <w:webHidden/>
               </w:rPr>
-              <w:instrText xml:space="preserve"> PAGEREF _Toc224748094 \h </w:instrText>
+              <w:instrText xml:space="preserve"> PAGEREF _Toc224758572 \h </w:instrText>
             </w:r>
             <w:r>
               <w:rPr>
@@ -2044,7 +2044,7 @@
                 <w:noProof/>
                 <w:webHidden/>
               </w:rPr>
-              <w:t>8</w:t>
+              <w:t>9</w:t>
             </w:r>
             <w:r>
               <w:rPr>
@@ -2068,7 +2068,7 @@
               <w:sz w:val="24"/>
             </w:rPr>
           </w:pPr>
-          <w:hyperlink w:anchor="_Toc224748095" w:history="1">
+          <w:hyperlink w:anchor="_Toc224758573" w:history="1">
             <w:r>
               <w:rPr>
                 <w:rStyle w:val="Hyperlink"/>
@@ -2098,7 +2098,7 @@
                 <w:noProof/>
                 <w:webHidden/>
               </w:rPr>
-              <w:instrText xml:space="preserve"> PAGEREF _Toc224748095 \h </w:instrText>
+              <w:instrText xml:space="preserve"> PAGEREF _Toc224758573 \h </w:instrText>
             </w:r>
             <w:r>
               <w:rPr>
@@ -2118,7 +2118,7 @@
                 <w:noProof/>
                 <w:webHidden/>
               </w:rPr>
-              <w:t>8</w:t>
+              <w:t>9</w:t>
             </w:r>
             <w:r>
               <w:rPr>
@@ -2142,7 +2142,7 @@
               <w:sz w:val="24"/>
             </w:rPr>
           </w:pPr>
-          <w:hyperlink w:anchor="_Toc224748096" w:history="1">
+          <w:hyperlink w:anchor="_Toc224758574" w:history="1">
             <w:r>
               <w:rPr>
                 <w:rStyle w:val="Hyperlink"/>
@@ -2172,7 +2172,7 @@
                 <w:noProof/>
                 <w:webHidden/>
               </w:rPr>
-              <w:instrText xml:space="preserve"> PAGEREF _Toc224748096 \h </w:instrText>
+              <w:instrText xml:space="preserve"> PAGEREF _Toc224758574 \h </w:instrText>
             </w:r>
             <w:r>
               <w:rPr>
@@ -2192,7 +2192,7 @@
                 <w:noProof/>
                 <w:webHidden/>
               </w:rPr>
-              <w:t>8</w:t>
+              <w:t>9</w:t>
             </w:r>
             <w:r>
               <w:rPr>
@@ -2216,7 +2216,7 @@
               <w:sz w:val="24"/>
             </w:rPr>
           </w:pPr>
-          <w:hyperlink w:anchor="_Toc224748097" w:history="1">
+          <w:hyperlink w:anchor="_Toc224758575" w:history="1">
             <w:r>
               <w:rPr>
                 <w:rStyle w:val="Hyperlink"/>
@@ -2246,7 +2246,7 @@
                 <w:noProof/>
                 <w:webHidden/>
               </w:rPr>
-              <w:instrText xml:space="preserve"> PAGEREF _Toc224748097 \h </w:instrText>
+              <w:instrText xml:space="preserve"> PAGEREF _Toc224758575 \h </w:instrText>
             </w:r>
             <w:r>
               <w:rPr>
@@ -2266,7 +2266,7 @@
                 <w:noProof/>
                 <w:webHidden/>
               </w:rPr>
-              <w:t>9</w:t>
+              <w:t>10</w:t>
             </w:r>
             <w:r>
               <w:rPr>
@@ -2287,7 +2287,7 @@
               <w:sz w:val="24"/>
             </w:rPr>
           </w:pPr>
-          <w:hyperlink w:anchor="_Toc224748098" w:history="1">
+          <w:hyperlink w:anchor="_Toc224758576" w:history="1">
             <w:r>
               <w:rPr>
                 <w:rStyle w:val="Hyperlink"/>
@@ -2317,7 +2317,7 @@
                 <w:noProof/>
                 <w:webHidden/>
               </w:rPr>
-              <w:instrText xml:space="preserve"> PAGEREF _Toc224748098 \h </w:instrText>
+              <w:instrText xml:space="preserve"> PAGEREF _Toc224758576 \h </w:instrText>
             </w:r>
             <w:r>
               <w:rPr>
@@ -2337,7 +2337,7 @@
                 <w:noProof/>
                 <w:webHidden/>
               </w:rPr>
-              <w:t>10</w:t>
+              <w:t>11</w:t>
             </w:r>
             <w:r>
               <w:rPr>
@@ -2361,7 +2361,7 @@
               <w:sz w:val="24"/>
             </w:rPr>
           </w:pPr>
-          <w:hyperlink w:anchor="_Toc224748099" w:history="1">
+          <w:hyperlink w:anchor="_Toc224758577" w:history="1">
             <w:r>
               <w:rPr>
                 <w:rStyle w:val="Hyperlink"/>
@@ -2391,7 +2391,7 @@
                 <w:noProof/>
                 <w:webHidden/>
               </w:rPr>
-              <w:instrText xml:space="preserve"> PAGEREF _Toc224748099 \h </w:instrText>
+              <w:instrText xml:space="preserve"> PAGEREF _Toc224758577 \h </w:instrText>
             </w:r>
             <w:r>
               <w:rPr>
@@ -2411,7 +2411,7 @@
                 <w:noProof/>
                 <w:webHidden/>
               </w:rPr>
-              <w:t>10</w:t>
+              <w:t>11</w:t>
             </w:r>
             <w:r>
               <w:rPr>
@@ -2435,7 +2435,7 @@
               <w:sz w:val="24"/>
             </w:rPr>
           </w:pPr>
-          <w:hyperlink w:anchor="_Toc224748100" w:history="1">
+          <w:hyperlink w:anchor="_Toc224758578" w:history="1">
             <w:r>
               <w:rPr>
                 <w:rStyle w:val="Hyperlink"/>
@@ -2465,7 +2465,7 @@
                 <w:noProof/>
                 <w:webHidden/>
               </w:rPr>
-              <w:instrText xml:space="preserve"> PAGEREF _Toc224748100 \h </w:instrText>
+              <w:instrText xml:space="preserve"> PAGEREF _Toc224758578 \h </w:instrText>
             </w:r>
             <w:r>
               <w:rPr>
@@ -2485,7 +2485,7 @@
                 <w:noProof/>
                 <w:webHidden/>
               </w:rPr>
-              <w:t>11</w:t>
+              <w:t>12</w:t>
             </w:r>
             <w:r>
               <w:rPr>
@@ -2509,7 +2509,7 @@
               <w:sz w:val="24"/>
             </w:rPr>
           </w:pPr>
-          <w:hyperlink w:anchor="_Toc224748101" w:history="1">
+          <w:hyperlink w:anchor="_Toc224758579" w:history="1">
             <w:r>
               <w:rPr>
                 <w:rStyle w:val="Hyperlink"/>
@@ -2539,7 +2539,7 @@
                 <w:noProof/>
                 <w:webHidden/>
               </w:rPr>
-              <w:instrText xml:space="preserve"> PAGEREF _Toc224748101 \h </w:instrText>
+              <w:instrText xml:space="preserve"> PAGEREF _Toc224758579 \h </w:instrText>
             </w:r>
             <w:r>
               <w:rPr>
@@ -2559,7 +2559,7 @@
                 <w:noProof/>
                 <w:webHidden/>
               </w:rPr>
-              <w:t>13</w:t>
+              <w:t>14</w:t>
             </w:r>
             <w:r>
               <w:rPr>
@@ -2583,7 +2583,7 @@
               <w:sz w:val="24"/>
             </w:rPr>
           </w:pPr>
-          <w:hyperlink w:anchor="_Toc224748102" w:history="1">
+          <w:hyperlink w:anchor="_Toc224758580" w:history="1">
             <w:r>
               <w:rPr>
                 <w:rStyle w:val="Hyperlink"/>
@@ -2613,7 +2613,7 @@
                 <w:noProof/>
                 <w:webHidden/>
               </w:rPr>
-              <w:instrText xml:space="preserve"> PAGEREF _Toc224748102 \h </w:instrText>
+              <w:instrText xml:space="preserve"> PAGEREF _Toc224758580 \h </w:instrText>
             </w:r>
             <w:r>
               <w:rPr>
@@ -2633,7 +2633,297 @@
                 <w:noProof/>
                 <w:webHidden/>
               </w:rPr>
-              <w:t>13</w:t>
+              <w:t>15</w:t>
+            </w:r>
+            <w:r>
+              <w:rPr>
+                <w:noProof/>
+                <w:webHidden/>
+              </w:rPr>
+              <w:fldChar w:fldCharType="end"/>
+            </w:r>
+          </w:hyperlink>
+        </w:p>
+        <w:p>
+          <w:pPr>
+            <w:pStyle w:val="TOC3"/>
+            <w:tabs>
+              <w:tab w:val="right" w:leader="dot" w:pos="9020"/>
+            </w:tabs>
+            <w:rPr>
+              <w:rFonts w:asciiTheme="minorHAnsi" w:eastAsiaTheme="minorEastAsia" w:hAnsiTheme="minorHAnsi" w:cstheme="minorBidi"/>
+              <w:noProof/>
+              <w:color w:val="auto"/>
+              <w:sz w:val="24"/>
+            </w:rPr>
+          </w:pPr>
+          <w:hyperlink w:anchor="_Toc224758581" w:history="1">
+            <w:r>
+              <w:rPr>
+                <w:rStyle w:val="Hyperlink"/>
+                <w:b/>
+                <w:bCs/>
+                <w:noProof/>
+                <w:lang w:val="en-US"/>
+              </w:rPr>
+              <w:t>4.5 Risk Analysis – Risk Mitigation Log</w:t>
+            </w:r>
+            <w:r>
+              <w:rPr>
+                <w:noProof/>
+                <w:webHidden/>
+              </w:rPr>
+              <w:tab/>
+            </w:r>
+            <w:r>
+              <w:rPr>
+                <w:noProof/>
+                <w:webHidden/>
+              </w:rPr>
+              <w:fldChar w:fldCharType="begin"/>
+            </w:r>
+            <w:r>
+              <w:rPr>
+                <w:noProof/>
+                <w:webHidden/>
+              </w:rPr>
+              <w:instrText xml:space="preserve"> PAGEREF _Toc224758581 \h </w:instrText>
+            </w:r>
+            <w:r>
+              <w:rPr>
+                <w:noProof/>
+                <w:webHidden/>
+              </w:rPr>
+            </w:r>
+            <w:r>
+              <w:rPr>
+                <w:noProof/>
+                <w:webHidden/>
+              </w:rPr>
+              <w:fldChar w:fldCharType="separate"/>
+            </w:r>
+            <w:r>
+              <w:rPr>
+                <w:noProof/>
+                <w:webHidden/>
+              </w:rPr>
+              <w:t>16</w:t>
+            </w:r>
+            <w:r>
+              <w:rPr>
+                <w:noProof/>
+                <w:webHidden/>
+              </w:rPr>
+              <w:fldChar w:fldCharType="end"/>
+            </w:r>
+          </w:hyperlink>
+        </w:p>
+        <w:p>
+          <w:pPr>
+            <w:pStyle w:val="TOC2"/>
+            <w:rPr>
+              <w:rFonts w:asciiTheme="minorHAnsi" w:eastAsiaTheme="minorEastAsia" w:hAnsiTheme="minorHAnsi" w:cstheme="minorBidi"/>
+              <w:noProof/>
+              <w:color w:val="auto"/>
+              <w:sz w:val="24"/>
+            </w:rPr>
+          </w:pPr>
+          <w:hyperlink w:anchor="_Toc224758582" w:history="1">
+            <w:r>
+              <w:rPr>
+                <w:rStyle w:val="Hyperlink"/>
+                <w:b/>
+                <w:bCs/>
+                <w:noProof/>
+                <w:lang w:val="en-US"/>
+              </w:rPr>
+              <w:t>5. Data Acquisition</w:t>
+            </w:r>
+            <w:r>
+              <w:rPr>
+                <w:noProof/>
+                <w:webHidden/>
+              </w:rPr>
+              <w:tab/>
+            </w:r>
+            <w:r>
+              <w:rPr>
+                <w:noProof/>
+                <w:webHidden/>
+              </w:rPr>
+              <w:fldChar w:fldCharType="begin"/>
+            </w:r>
+            <w:r>
+              <w:rPr>
+                <w:noProof/>
+                <w:webHidden/>
+              </w:rPr>
+              <w:instrText xml:space="preserve"> PAGEREF _Toc224758582 \h </w:instrText>
+            </w:r>
+            <w:r>
+              <w:rPr>
+                <w:noProof/>
+                <w:webHidden/>
+              </w:rPr>
+            </w:r>
+            <w:r>
+              <w:rPr>
+                <w:noProof/>
+                <w:webHidden/>
+              </w:rPr>
+              <w:fldChar w:fldCharType="separate"/>
+            </w:r>
+            <w:r>
+              <w:rPr>
+                <w:noProof/>
+                <w:webHidden/>
+              </w:rPr>
+              <w:t>17</w:t>
+            </w:r>
+            <w:r>
+              <w:rPr>
+                <w:noProof/>
+                <w:webHidden/>
+              </w:rPr>
+              <w:fldChar w:fldCharType="end"/>
+            </w:r>
+          </w:hyperlink>
+        </w:p>
+        <w:p>
+          <w:pPr>
+            <w:pStyle w:val="TOC2"/>
+            <w:rPr>
+              <w:rFonts w:asciiTheme="minorHAnsi" w:eastAsiaTheme="minorEastAsia" w:hAnsiTheme="minorHAnsi" w:cstheme="minorBidi"/>
+              <w:noProof/>
+              <w:color w:val="auto"/>
+              <w:sz w:val="24"/>
+            </w:rPr>
+          </w:pPr>
+          <w:hyperlink w:anchor="_Toc224758583" w:history="1">
+            <w:r>
+              <w:rPr>
+                <w:rStyle w:val="Hyperlink"/>
+                <w:b/>
+                <w:bCs/>
+                <w:noProof/>
+                <w:lang w:val="en-US"/>
+              </w:rPr>
+              <w:t>6. Exploratory Data Analysis</w:t>
+            </w:r>
+            <w:r>
+              <w:rPr>
+                <w:noProof/>
+                <w:webHidden/>
+              </w:rPr>
+              <w:tab/>
+            </w:r>
+            <w:r>
+              <w:rPr>
+                <w:noProof/>
+                <w:webHidden/>
+              </w:rPr>
+              <w:fldChar w:fldCharType="begin"/>
+            </w:r>
+            <w:r>
+              <w:rPr>
+                <w:noProof/>
+                <w:webHidden/>
+              </w:rPr>
+              <w:instrText xml:space="preserve"> PAGEREF _Toc224758583 \h </w:instrText>
+            </w:r>
+            <w:r>
+              <w:rPr>
+                <w:noProof/>
+                <w:webHidden/>
+              </w:rPr>
+            </w:r>
+            <w:r>
+              <w:rPr>
+                <w:noProof/>
+                <w:webHidden/>
+              </w:rPr>
+              <w:fldChar w:fldCharType="separate"/>
+            </w:r>
+            <w:r>
+              <w:rPr>
+                <w:noProof/>
+                <w:webHidden/>
+              </w:rPr>
+              <w:t>18</w:t>
+            </w:r>
+            <w:r>
+              <w:rPr>
+                <w:noProof/>
+                <w:webHidden/>
+              </w:rPr>
+              <w:fldChar w:fldCharType="end"/>
+            </w:r>
+          </w:hyperlink>
+        </w:p>
+        <w:p>
+          <w:pPr>
+            <w:pStyle w:val="TOC3"/>
+            <w:tabs>
+              <w:tab w:val="right" w:leader="dot" w:pos="9020"/>
+            </w:tabs>
+            <w:rPr>
+              <w:rFonts w:asciiTheme="minorHAnsi" w:eastAsiaTheme="minorEastAsia" w:hAnsiTheme="minorHAnsi" w:cstheme="minorBidi"/>
+              <w:noProof/>
+              <w:color w:val="auto"/>
+              <w:sz w:val="24"/>
+            </w:rPr>
+          </w:pPr>
+          <w:hyperlink w:anchor="_Toc224758584" w:history="1">
+            <w:r>
+              <w:rPr>
+                <w:rStyle w:val="Hyperlink"/>
+                <w:b/>
+                <w:bCs/>
+                <w:noProof/>
+                <w:lang w:val="en-US"/>
+              </w:rPr>
+              <w:t>6.1 Which segments suffer the most delays?</w:t>
+            </w:r>
+            <w:r>
+              <w:rPr>
+                <w:noProof/>
+                <w:webHidden/>
+              </w:rPr>
+              <w:tab/>
+            </w:r>
+            <w:r>
+              <w:rPr>
+                <w:noProof/>
+                <w:webHidden/>
+              </w:rPr>
+              <w:fldChar w:fldCharType="begin"/>
+            </w:r>
+            <w:r>
+              <w:rPr>
+                <w:noProof/>
+                <w:webHidden/>
+              </w:rPr>
+              <w:instrText xml:space="preserve"> PAGEREF _Toc224758584 \h </w:instrText>
+            </w:r>
+            <w:r>
+              <w:rPr>
+                <w:noProof/>
+                <w:webHidden/>
+              </w:rPr>
+            </w:r>
+            <w:r>
+              <w:rPr>
+                <w:noProof/>
+                <w:webHidden/>
+              </w:rPr>
+              <w:fldChar w:fldCharType="separate"/>
+            </w:r>
+            <w:r>
+              <w:rPr>
+                <w:noProof/>
+                <w:webHidden/>
+              </w:rPr>
+              <w:t>18</w:t>
             </w:r>
             <w:r>
               <w:rPr>
@@ -2657,7 +2947,7 @@
               <w:sz w:val="24"/>
             </w:rPr>
           </w:pPr>
-          <w:hyperlink w:anchor="_Toc224748103" w:history="1">
+          <w:hyperlink w:anchor="_Toc224758585" w:history="1">
             <w:r>
               <w:rPr>
                 <w:rStyle w:val="Hyperlink"/>
@@ -2686,7 +2976,7 @@
                 <w:noProof/>
                 <w:webHidden/>
               </w:rPr>
-              <w:instrText xml:space="preserve"> PAGEREF _Toc224748103 \h </w:instrText>
+              <w:instrText xml:space="preserve"> PAGEREF _Toc224758585 \h </w:instrText>
             </w:r>
             <w:r>
               <w:rPr>
@@ -2706,7 +2996,7 @@
                 <w:noProof/>
                 <w:webHidden/>
               </w:rPr>
-              <w:t>16</w:t>
+              <w:t>20</w:t>
             </w:r>
             <w:r>
               <w:rPr>
@@ -2792,7 +3082,7 @@
           <w:lang w:val="en-US"/>
         </w:rPr>
       </w:pPr>
-      <w:bookmarkStart w:id="0" w:name="_Toc224748083"/>
+      <w:bookmarkStart w:id="0" w:name="_Toc224758561"/>
       <w:r>
         <w:rPr>
           <w:rFonts w:ascii="Calibri" w:eastAsia="Calibri" w:hAnsi="Calibri" w:cs="Calibri"/>
@@ -2858,7 +3148,7 @@
           <w:lang w:val="en-US"/>
         </w:rPr>
       </w:pPr>
-      <w:bookmarkStart w:id="1" w:name="_Toc224748084"/>
+      <w:bookmarkStart w:id="1" w:name="_Toc224758562"/>
       <w:r>
         <w:rPr>
           <w:rFonts w:ascii="Calibri" w:eastAsia="Calibri" w:hAnsi="Calibri" w:cs="Calibri"/>
@@ -3285,7 +3575,7 @@
           <w:lang w:val="en-US"/>
         </w:rPr>
       </w:pPr>
-      <w:bookmarkStart w:id="2" w:name="_Toc224748085"/>
+      <w:bookmarkStart w:id="2" w:name="_Toc224758563"/>
       <w:r>
         <w:rPr>
           <w:rFonts w:ascii="Calibri" w:eastAsia="Calibri" w:hAnsi="Calibri" w:cs="Calibri"/>
@@ -3416,7 +3706,7 @@
           <w:lang w:val="en-US"/>
         </w:rPr>
       </w:pPr>
-      <w:bookmarkStart w:id="3" w:name="_Toc224748086"/>
+      <w:bookmarkStart w:id="3" w:name="_Toc224758564"/>
       <w:r>
         <w:rPr>
           <w:rFonts w:ascii="Calibri" w:eastAsia="Calibri" w:hAnsi="Calibri" w:cs="Calibri"/>
@@ -3501,7 +3791,7 @@
           <w:color w:val="FF0000"/>
         </w:rPr>
       </w:pPr>
-      <w:bookmarkStart w:id="4" w:name="_Toc224748087"/>
+      <w:bookmarkStart w:id="4" w:name="_Toc224758565"/>
       <w:r>
         <w:rPr>
           <w:rFonts w:ascii="Calibri" w:eastAsia="Calibri" w:hAnsi="Calibri" w:cs="Calibri"/>
@@ -3543,7 +3833,7 @@
           <w:lang w:val="en-US"/>
         </w:rPr>
       </w:pPr>
-      <w:bookmarkStart w:id="5" w:name="_Toc224748088"/>
+      <w:bookmarkStart w:id="5" w:name="_Toc224758566"/>
       <w:r>
         <w:rPr>
           <w:rFonts w:ascii="Calibri" w:eastAsia="Calibri" w:hAnsi="Calibri" w:cs="Calibri"/>
@@ -3794,7 +4084,7 @@
           <w:szCs w:val="32"/>
         </w:rPr>
       </w:pPr>
-      <w:bookmarkStart w:id="6" w:name="_Toc224748089"/>
+      <w:bookmarkStart w:id="6" w:name="_Toc224758567"/>
       <w:r>
         <w:rPr>
           <w:rFonts w:ascii="Calibri" w:eastAsia="Calibri" w:hAnsi="Calibri" w:cs="Calibri"/>
@@ -3817,232 +4107,10 @@
           <w:szCs w:val="32"/>
           <w:lang w:val="en-US"/>
         </w:rPr>
-        <w:t>.1 LNER Interview Questions</w:t>
+        <w:t>.1 LNER Interview Q</w:t>
       </w:r>
       <w:bookmarkEnd w:id="6"/>
-    </w:p>
-    <w:p>
-      <w:pPr>
-        <w:jc w:val="right"/>
-        <w:rPr>
-          <w:color w:val="FF0000"/>
-          <w:lang w:val="en-US"/>
-        </w:rPr>
-      </w:pPr>
-      <w:r>
-        <w:rPr>
-          <w:color w:val="FF0000"/>
-          <w:lang w:val="en-US"/>
-        </w:rPr>
-        <w:t>(AA, AI, CN, DJ)</w:t>
-      </w:r>
-    </w:p>
-    <w:p>
-      <w:pPr>
-        <w:rPr>
-          <w:color w:val="FF0000"/>
-          <w:lang w:val="en-US"/>
-        </w:rPr>
-      </w:pPr>
-    </w:p>
-    <w:p>
-      <w:pPr>
-        <w:pStyle w:val="ListParagraph"/>
-        <w:numPr>
-          <w:ilvl w:val="0"/>
-          <w:numId w:val="89"/>
-        </w:numPr>
-        <w:rPr>
-          <w:rFonts w:ascii="Calibri" w:hAnsi="Calibri" w:cs="Calibri"/>
-          <w:sz w:val="22"/>
-          <w:szCs w:val="22"/>
-          <w:lang w:val="en-US"/>
-        </w:rPr>
-      </w:pPr>
-      <w:r>
-        <w:rPr>
-          <w:rFonts w:ascii="Calibri" w:hAnsi="Calibri" w:cs="Calibri"/>
-          <w:sz w:val="22"/>
-          <w:szCs w:val="22"/>
-          <w:lang w:val="en-US"/>
-        </w:rPr>
-        <w:t>Integration with other systems used by LNER?</w:t>
-      </w:r>
-    </w:p>
-    <w:p>
-      <w:pPr>
-        <w:pStyle w:val="ListParagraph"/>
-        <w:numPr>
-          <w:ilvl w:val="0"/>
-          <w:numId w:val="89"/>
-        </w:numPr>
-        <w:rPr>
-          <w:rFonts w:ascii="Calibri" w:hAnsi="Calibri" w:cs="Calibri"/>
-          <w:sz w:val="22"/>
-          <w:szCs w:val="22"/>
-          <w:lang w:val="en-US"/>
-        </w:rPr>
-      </w:pPr>
-      <w:r>
-        <w:rPr>
-          <w:rFonts w:ascii="Calibri" w:hAnsi="Calibri" w:cs="Calibri"/>
-          <w:sz w:val="22"/>
-          <w:szCs w:val="22"/>
-          <w:lang w:val="en-US"/>
-        </w:rPr>
-        <w:t>Do certain disruption types lead to worse estimates (signaling, weather, etc.)?</w:t>
-      </w:r>
-    </w:p>
-    <w:p>
-      <w:pPr>
-        <w:pStyle w:val="ListParagraph"/>
-        <w:numPr>
-          <w:ilvl w:val="0"/>
-          <w:numId w:val="89"/>
-        </w:numPr>
-        <w:rPr>
-          <w:rFonts w:ascii="Calibri" w:hAnsi="Calibri" w:cs="Calibri"/>
-          <w:sz w:val="22"/>
-          <w:szCs w:val="22"/>
-          <w:lang w:val="en-US"/>
-        </w:rPr>
-      </w:pPr>
-      <w:r>
-        <w:rPr>
-          <w:rFonts w:ascii="Calibri" w:hAnsi="Calibri" w:cs="Calibri"/>
-          <w:sz w:val="22"/>
-          <w:szCs w:val="22"/>
-          <w:lang w:val="en-US"/>
-        </w:rPr>
-        <w:t>Any known data quality issues or in general when it comes to disruption data?</w:t>
-      </w:r>
-    </w:p>
-    <w:p>
-      <w:pPr>
-        <w:pStyle w:val="ListParagraph"/>
-        <w:numPr>
-          <w:ilvl w:val="0"/>
-          <w:numId w:val="89"/>
-        </w:numPr>
-        <w:rPr>
-          <w:rFonts w:ascii="Calibri" w:hAnsi="Calibri" w:cs="Calibri"/>
-          <w:sz w:val="22"/>
-          <w:szCs w:val="22"/>
-          <w:lang w:val="en-US"/>
-        </w:rPr>
-      </w:pPr>
-      <w:r>
-        <w:rPr>
-          <w:rFonts w:ascii="Calibri" w:hAnsi="Calibri" w:cs="Calibri"/>
-          <w:sz w:val="22"/>
-          <w:szCs w:val="22"/>
-          <w:lang w:val="en-US"/>
-        </w:rPr>
-        <w:t>How does LNER quantify cost/effect of poor communications when it comes to disruption?</w:t>
-      </w:r>
-    </w:p>
-    <w:p>
-      <w:pPr>
-        <w:pStyle w:val="ListParagraph"/>
-        <w:numPr>
-          <w:ilvl w:val="0"/>
-          <w:numId w:val="89"/>
-        </w:numPr>
-        <w:rPr>
-          <w:rFonts w:ascii="Calibri" w:hAnsi="Calibri" w:cs="Calibri"/>
-          <w:sz w:val="22"/>
-          <w:szCs w:val="22"/>
-          <w:lang w:val="en-US"/>
-        </w:rPr>
-      </w:pPr>
-      <w:r>
-        <w:rPr>
-          <w:rFonts w:ascii="Calibri" w:hAnsi="Calibri" w:cs="Calibri"/>
-          <w:sz w:val="22"/>
-          <w:szCs w:val="22"/>
-        </w:rPr>
-        <w:t xml:space="preserve">Does the </w:t>
-      </w:r>
-      <w:proofErr w:type="gramStart"/>
-      <w:r>
-        <w:rPr>
-          <w:rFonts w:ascii="Calibri" w:hAnsi="Calibri" w:cs="Calibri"/>
-          <w:sz w:val="22"/>
-          <w:szCs w:val="22"/>
-        </w:rPr>
-        <w:t>amount</w:t>
-      </w:r>
-      <w:proofErr w:type="gramEnd"/>
-      <w:r>
-        <w:rPr>
-          <w:rFonts w:ascii="Calibri" w:hAnsi="Calibri" w:cs="Calibri"/>
-          <w:sz w:val="22"/>
-          <w:szCs w:val="22"/>
-        </w:rPr>
-        <w:t xml:space="preserve"> of resources being used to provide real time information depend on type of travel time such as a peak travel</w:t>
-      </w:r>
-    </w:p>
-    <w:p>
-      <w:pPr>
-        <w:pStyle w:val="ListParagraph"/>
-        <w:numPr>
-          <w:ilvl w:val="0"/>
-          <w:numId w:val="89"/>
-        </w:numPr>
-        <w:rPr>
-          <w:rFonts w:ascii="Calibri" w:hAnsi="Calibri" w:cs="Calibri"/>
-          <w:sz w:val="22"/>
-          <w:szCs w:val="22"/>
-          <w:lang w:val="en-US"/>
-        </w:rPr>
-      </w:pPr>
-      <w:r>
-        <w:rPr>
-          <w:rFonts w:ascii="Calibri" w:hAnsi="Calibri" w:cs="Calibri"/>
-          <w:sz w:val="22"/>
-          <w:szCs w:val="22"/>
-        </w:rPr>
-        <w:t xml:space="preserve">How accurate do the predictions need to be? </w:t>
-      </w:r>
-    </w:p>
-    <w:p>
-      <w:pPr>
-        <w:pStyle w:val="ListParagraph"/>
-        <w:numPr>
-          <w:ilvl w:val="0"/>
-          <w:numId w:val="89"/>
-        </w:numPr>
-        <w:rPr>
-          <w:rFonts w:ascii="Calibri" w:hAnsi="Calibri" w:cs="Calibri"/>
-          <w:sz w:val="22"/>
-          <w:szCs w:val="22"/>
-          <w:lang w:val="en-US"/>
-        </w:rPr>
-      </w:pPr>
-      <w:r>
-        <w:rPr>
-          <w:rFonts w:ascii="Calibri" w:hAnsi="Calibri" w:cs="Calibri"/>
-          <w:sz w:val="22"/>
-          <w:szCs w:val="22"/>
-        </w:rPr>
-        <w:t>Do you also want to consider how stable and how easy to interpret they (predictions) are? E.g. predictions changing every few minutes might confuse staff</w:t>
-      </w:r>
-    </w:p>
-    <w:p>
-      <w:pPr>
-        <w:spacing w:before="180" w:after="180"/>
-        <w:rPr>
-          <w:rFonts w:ascii="Cambria" w:eastAsia="Cambria" w:hAnsi="Cambria" w:cs="Cambria"/>
-          <w:color w:val="000000" w:themeColor="text1"/>
-          <w:sz w:val="24"/>
-        </w:rPr>
-      </w:pPr>
-    </w:p>
-    <w:p>
-      <w:pPr>
-        <w:pStyle w:val="Heading3"/>
-        <w:spacing w:before="200"/>
-        <w:jc w:val="center"/>
+      <w:r>
         <w:rPr>
           <w:rFonts w:ascii="Calibri" w:eastAsia="Calibri" w:hAnsi="Calibri" w:cs="Calibri"/>
           <w:b/>
@@ -4052,9 +4120,759 @@
           <w:szCs w:val="32"/>
           <w:lang w:val="en-US"/>
         </w:rPr>
-      </w:pPr>
-      <w:bookmarkStart w:id="7" w:name="_Toc224748090"/>
-      <w:r>
+        <w:t>&amp;A</w:t>
+      </w:r>
+    </w:p>
+    <w:p>
+      <w:pPr>
+        <w:jc w:val="right"/>
+        <w:rPr>
+          <w:color w:val="FF0000"/>
+          <w:lang w:val="en-US"/>
+        </w:rPr>
+      </w:pPr>
+      <w:r>
+        <w:rPr>
+          <w:color w:val="FF0000"/>
+          <w:lang w:val="en-US"/>
+        </w:rPr>
+        <w:t>(AA, AI, CN, DJ)</w:t>
+      </w:r>
+    </w:p>
+    <w:p>
+      <w:pPr>
+        <w:rPr>
+          <w:color w:val="FF0000"/>
+          <w:lang w:val="en-US"/>
+        </w:rPr>
+      </w:pPr>
+    </w:p>
+    <w:tbl>
+      <w:tblPr>
+        <w:tblStyle w:val="TableGrid"/>
+        <w:tblW w:w="10201" w:type="dxa"/>
+        <w:tblLook w:val="04A0" w:firstRow="1" w:lastRow="0" w:firstColumn="1" w:lastColumn="0" w:noHBand="0" w:noVBand="1"/>
+      </w:tblPr>
+      <w:tblGrid>
+        <w:gridCol w:w="2263"/>
+        <w:gridCol w:w="7938"/>
+      </w:tblGrid>
+      <w:tr>
+        <w:tc>
+          <w:tcPr>
+            <w:tcW w:w="2263" w:type="dxa"/>
+            <w:shd w:val="clear" w:color="auto" w:fill="EE0000"/>
+          </w:tcPr>
+          <w:p>
+            <w:pPr>
+              <w:jc w:val="center"/>
+              <w:rPr>
+                <w:b/>
+                <w:bCs/>
+                <w:color w:val="FFFFFF" w:themeColor="background1"/>
+                <w:lang w:val="en-US"/>
+              </w:rPr>
+            </w:pPr>
+            <w:r>
+              <w:rPr>
+                <w:b/>
+                <w:bCs/>
+                <w:color w:val="FFFFFF" w:themeColor="background1"/>
+                <w:lang w:val="en-US"/>
+              </w:rPr>
+              <w:t>Question</w:t>
+            </w:r>
+          </w:p>
+        </w:tc>
+        <w:tc>
+          <w:tcPr>
+            <w:tcW w:w="7938" w:type="dxa"/>
+            <w:shd w:val="clear" w:color="auto" w:fill="EE0000"/>
+          </w:tcPr>
+          <w:p>
+            <w:pPr>
+              <w:jc w:val="center"/>
+              <w:rPr>
+                <w:b/>
+                <w:bCs/>
+                <w:color w:val="FFFFFF" w:themeColor="background1"/>
+                <w:lang w:val="en-US"/>
+              </w:rPr>
+            </w:pPr>
+            <w:r>
+              <w:rPr>
+                <w:b/>
+                <w:bCs/>
+                <w:color w:val="FFFFFF" w:themeColor="background1"/>
+                <w:lang w:val="en-US"/>
+              </w:rPr>
+              <w:t>Answer</w:t>
+            </w:r>
+          </w:p>
+        </w:tc>
+      </w:tr>
+      <w:tr>
+        <w:tc>
+          <w:tcPr>
+            <w:tcW w:w="2263" w:type="dxa"/>
+            <w:vAlign w:val="center"/>
+          </w:tcPr>
+          <w:p>
+            <w:pPr>
+              <w:jc w:val="center"/>
+              <w:rPr>
+                <w:szCs w:val="22"/>
+                <w:lang w:val="en-US"/>
+              </w:rPr>
+            </w:pPr>
+            <w:r>
+              <w:rPr>
+                <w:szCs w:val="22"/>
+                <w:lang w:val="en-US"/>
+              </w:rPr>
+              <w:t>Do certain disruption types lead to worse estimates (signaling, weather, etc.)?</w:t>
+            </w:r>
+          </w:p>
+          <w:p>
+            <w:pPr>
+              <w:jc w:val="center"/>
+              <w:rPr>
+                <w:color w:val="FF0000"/>
+                <w:lang w:val="en-US"/>
+              </w:rPr>
+            </w:pPr>
+          </w:p>
+        </w:tc>
+        <w:tc>
+          <w:tcPr>
+            <w:tcW w:w="7938" w:type="dxa"/>
+          </w:tcPr>
+          <w:p>
+            <w:pPr>
+              <w:pStyle w:val="ListParagraph"/>
+              <w:numPr>
+                <w:ilvl w:val="0"/>
+                <w:numId w:val="92"/>
+              </w:numPr>
+              <w:spacing w:before="180" w:after="180"/>
+              <w:rPr>
+                <w:rFonts w:eastAsia="Cambria"/>
+                <w:color w:val="000000" w:themeColor="text1"/>
+                <w:sz w:val="22"/>
+                <w:szCs w:val="20"/>
+              </w:rPr>
+            </w:pPr>
+            <w:r>
+              <w:rPr>
+                <w:rFonts w:eastAsia="Cambria"/>
+                <w:color w:val="000000" w:themeColor="text1"/>
+                <w:sz w:val="22"/>
+                <w:szCs w:val="20"/>
+              </w:rPr>
+              <w:t xml:space="preserve">Investigations into disruption issues can cost up to £3 million. </w:t>
+            </w:r>
+          </w:p>
+          <w:p>
+            <w:pPr>
+              <w:pStyle w:val="ListParagraph"/>
+              <w:numPr>
+                <w:ilvl w:val="0"/>
+                <w:numId w:val="90"/>
+              </w:numPr>
+              <w:spacing w:before="180" w:after="180"/>
+              <w:rPr>
+                <w:rFonts w:ascii="Calibri" w:eastAsia="Cambria" w:hAnsi="Calibri" w:cs="Calibri"/>
+                <w:color w:val="000000" w:themeColor="text1"/>
+                <w:sz w:val="22"/>
+                <w:szCs w:val="22"/>
+              </w:rPr>
+            </w:pPr>
+            <w:r>
+              <w:rPr>
+                <w:rFonts w:ascii="Calibri" w:eastAsia="Cambria" w:hAnsi="Calibri" w:cs="Calibri"/>
+                <w:color w:val="000000" w:themeColor="text1"/>
+                <w:sz w:val="22"/>
+                <w:szCs w:val="22"/>
+              </w:rPr>
+              <w:t xml:space="preserve">Tracks break e.g. planks breaking causing the tracks to be out of service for 18-24 hours. </w:t>
+            </w:r>
+          </w:p>
+          <w:p>
+            <w:pPr>
+              <w:pStyle w:val="ListParagraph"/>
+              <w:numPr>
+                <w:ilvl w:val="0"/>
+                <w:numId w:val="90"/>
+              </w:numPr>
+              <w:spacing w:before="180" w:after="180"/>
+              <w:rPr>
+                <w:rFonts w:ascii="Calibri" w:eastAsia="Cambria" w:hAnsi="Calibri" w:cs="Calibri"/>
+                <w:color w:val="000000" w:themeColor="text1"/>
+                <w:sz w:val="22"/>
+                <w:szCs w:val="22"/>
+              </w:rPr>
+            </w:pPr>
+            <w:r>
+              <w:rPr>
+                <w:rFonts w:ascii="Calibri" w:eastAsia="Cambria" w:hAnsi="Calibri" w:cs="Calibri"/>
+                <w:color w:val="000000" w:themeColor="text1"/>
+                <w:sz w:val="22"/>
+                <w:szCs w:val="22"/>
+              </w:rPr>
+              <w:t>Track conditions can damage train wheels.</w:t>
+            </w:r>
+          </w:p>
+          <w:p>
+            <w:pPr>
+              <w:pStyle w:val="ListParagraph"/>
+              <w:numPr>
+                <w:ilvl w:val="0"/>
+                <w:numId w:val="90"/>
+              </w:numPr>
+              <w:spacing w:before="180" w:after="180"/>
+              <w:rPr>
+                <w:rFonts w:ascii="Calibri" w:eastAsia="Cambria" w:hAnsi="Calibri" w:cs="Calibri"/>
+                <w:color w:val="000000" w:themeColor="text1"/>
+                <w:sz w:val="22"/>
+                <w:szCs w:val="22"/>
+              </w:rPr>
+            </w:pPr>
+            <w:r>
+              <w:rPr>
+                <w:rFonts w:ascii="Calibri" w:eastAsia="Cambria" w:hAnsi="Calibri" w:cs="Calibri"/>
+                <w:color w:val="000000" w:themeColor="text1"/>
+                <w:sz w:val="22"/>
+                <w:szCs w:val="22"/>
+              </w:rPr>
+              <w:t xml:space="preserve">Weather e.g. snow over larger distances can stop trains. </w:t>
+            </w:r>
+          </w:p>
+          <w:p>
+            <w:pPr>
+              <w:pStyle w:val="ListParagraph"/>
+              <w:numPr>
+                <w:ilvl w:val="0"/>
+                <w:numId w:val="90"/>
+              </w:numPr>
+              <w:spacing w:before="180" w:after="180"/>
+              <w:rPr>
+                <w:rFonts w:ascii="Calibri" w:eastAsia="Cambria" w:hAnsi="Calibri" w:cs="Calibri"/>
+                <w:color w:val="000000" w:themeColor="text1"/>
+                <w:sz w:val="22"/>
+                <w:szCs w:val="22"/>
+              </w:rPr>
+            </w:pPr>
+            <w:r>
+              <w:rPr>
+                <w:rFonts w:ascii="Calibri" w:eastAsia="Cambria" w:hAnsi="Calibri" w:cs="Calibri"/>
+                <w:color w:val="000000" w:themeColor="text1"/>
+                <w:sz w:val="22"/>
+                <w:szCs w:val="22"/>
+              </w:rPr>
+              <w:t xml:space="preserve">Longer train carriages - more passengers - more delays. </w:t>
+            </w:r>
+          </w:p>
+          <w:p>
+            <w:pPr>
+              <w:pStyle w:val="ListParagraph"/>
+              <w:numPr>
+                <w:ilvl w:val="0"/>
+                <w:numId w:val="90"/>
+              </w:numPr>
+              <w:spacing w:before="180" w:after="180"/>
+              <w:rPr>
+                <w:rFonts w:ascii="Calibri" w:eastAsia="Cambria" w:hAnsi="Calibri" w:cs="Calibri"/>
+                <w:color w:val="000000" w:themeColor="text1"/>
+                <w:sz w:val="22"/>
+                <w:szCs w:val="22"/>
+              </w:rPr>
+            </w:pPr>
+            <w:r>
+              <w:rPr>
+                <w:rFonts w:ascii="Calibri" w:eastAsia="Cambria" w:hAnsi="Calibri" w:cs="Calibri"/>
+                <w:color w:val="000000" w:themeColor="text1"/>
+                <w:sz w:val="22"/>
+                <w:szCs w:val="22"/>
+              </w:rPr>
+              <w:t xml:space="preserve">Bike loading causes delays. </w:t>
+            </w:r>
+          </w:p>
+          <w:p>
+            <w:pPr>
+              <w:pStyle w:val="ListParagraph"/>
+              <w:numPr>
+                <w:ilvl w:val="0"/>
+                <w:numId w:val="90"/>
+              </w:numPr>
+              <w:spacing w:before="180" w:after="180"/>
+              <w:rPr>
+                <w:rFonts w:ascii="Calibri" w:eastAsia="Cambria" w:hAnsi="Calibri" w:cs="Calibri"/>
+                <w:color w:val="000000" w:themeColor="text1"/>
+                <w:sz w:val="22"/>
+                <w:szCs w:val="22"/>
+              </w:rPr>
+            </w:pPr>
+            <w:r>
+              <w:rPr>
+                <w:rFonts w:ascii="Calibri" w:eastAsia="Cambria" w:hAnsi="Calibri" w:cs="Calibri"/>
+                <w:color w:val="000000" w:themeColor="text1"/>
+                <w:sz w:val="22"/>
+                <w:szCs w:val="22"/>
+              </w:rPr>
+              <w:t xml:space="preserve">Reactionary delays 5-10 minutes from earlier disruptions. </w:t>
+            </w:r>
+          </w:p>
+          <w:p>
+            <w:pPr>
+              <w:pStyle w:val="ListParagraph"/>
+              <w:numPr>
+                <w:ilvl w:val="0"/>
+                <w:numId w:val="90"/>
+              </w:numPr>
+              <w:spacing w:before="180" w:after="180"/>
+              <w:rPr>
+                <w:rFonts w:ascii="Calibri" w:eastAsia="Cambria" w:hAnsi="Calibri" w:cs="Calibri"/>
+                <w:color w:val="000000" w:themeColor="text1"/>
+                <w:sz w:val="22"/>
+                <w:szCs w:val="22"/>
+              </w:rPr>
+            </w:pPr>
+            <w:r>
+              <w:rPr>
+                <w:rFonts w:ascii="Calibri" w:eastAsia="Cambria" w:hAnsi="Calibri" w:cs="Calibri"/>
+                <w:color w:val="000000" w:themeColor="text1"/>
+                <w:sz w:val="22"/>
+                <w:szCs w:val="22"/>
+              </w:rPr>
+              <w:t xml:space="preserve">Major stations e.g. Kings Cross and Finsbury Park can cause knock on effects when there is a disruption/delay. </w:t>
+            </w:r>
+          </w:p>
+        </w:tc>
+      </w:tr>
+      <w:tr>
+        <w:tc>
+          <w:tcPr>
+            <w:tcW w:w="2263" w:type="dxa"/>
+            <w:vAlign w:val="center"/>
+          </w:tcPr>
+          <w:p>
+            <w:pPr>
+              <w:jc w:val="center"/>
+              <w:rPr>
+                <w:szCs w:val="22"/>
+                <w:lang w:val="en-US"/>
+              </w:rPr>
+            </w:pPr>
+            <w:r>
+              <w:rPr>
+                <w:szCs w:val="22"/>
+                <w:lang w:val="en-US"/>
+              </w:rPr>
+              <w:t>Any known data quality issues or in general when it comes to disruption data?</w:t>
+            </w:r>
+          </w:p>
+          <w:p>
+            <w:pPr>
+              <w:jc w:val="center"/>
+              <w:rPr>
+                <w:color w:val="FF0000"/>
+                <w:lang w:val="en-US"/>
+              </w:rPr>
+            </w:pPr>
+          </w:p>
+        </w:tc>
+        <w:tc>
+          <w:tcPr>
+            <w:tcW w:w="7938" w:type="dxa"/>
+          </w:tcPr>
+          <w:p>
+            <w:pPr>
+              <w:pStyle w:val="ListParagraph"/>
+              <w:numPr>
+                <w:ilvl w:val="0"/>
+                <w:numId w:val="94"/>
+              </w:numPr>
+              <w:spacing w:before="180" w:after="180"/>
+              <w:rPr>
+                <w:rFonts w:eastAsia="Cambria"/>
+                <w:color w:val="000000" w:themeColor="text1"/>
+                <w:sz w:val="22"/>
+                <w:szCs w:val="20"/>
+              </w:rPr>
+            </w:pPr>
+            <w:r>
+              <w:rPr>
+                <w:rFonts w:eastAsia="Cambria"/>
+                <w:color w:val="000000" w:themeColor="text1"/>
+                <w:sz w:val="22"/>
+                <w:szCs w:val="20"/>
+              </w:rPr>
+              <w:t>Datasets can take 6-8 weeks to obtain.</w:t>
+            </w:r>
+          </w:p>
+          <w:p>
+            <w:pPr>
+              <w:pStyle w:val="ListParagraph"/>
+              <w:numPr>
+                <w:ilvl w:val="0"/>
+                <w:numId w:val="90"/>
+              </w:numPr>
+              <w:spacing w:before="180" w:after="180"/>
+              <w:rPr>
+                <w:rFonts w:ascii="Calibri" w:eastAsia="Cambria" w:hAnsi="Calibri" w:cs="Calibri"/>
+                <w:color w:val="000000" w:themeColor="text1"/>
+                <w:sz w:val="22"/>
+                <w:szCs w:val="22"/>
+              </w:rPr>
+            </w:pPr>
+            <w:r>
+              <w:rPr>
+                <w:rFonts w:ascii="Calibri" w:eastAsia="Cambria" w:hAnsi="Calibri" w:cs="Calibri"/>
+                <w:color w:val="000000" w:themeColor="text1"/>
+                <w:sz w:val="22"/>
+                <w:szCs w:val="22"/>
+              </w:rPr>
+              <w:t xml:space="preserve">Data cataloguing and understanding data distribution is key. </w:t>
+            </w:r>
+          </w:p>
+          <w:p>
+            <w:pPr>
+              <w:pStyle w:val="ListParagraph"/>
+              <w:numPr>
+                <w:ilvl w:val="0"/>
+                <w:numId w:val="90"/>
+              </w:numPr>
+              <w:spacing w:before="180" w:after="180"/>
+              <w:rPr>
+                <w:rFonts w:ascii="Calibri" w:eastAsia="Cambria" w:hAnsi="Calibri" w:cs="Calibri"/>
+                <w:color w:val="000000" w:themeColor="text1"/>
+                <w:sz w:val="22"/>
+                <w:szCs w:val="22"/>
+              </w:rPr>
+            </w:pPr>
+            <w:r>
+              <w:rPr>
+                <w:rFonts w:ascii="Calibri" w:eastAsia="Cambria" w:hAnsi="Calibri" w:cs="Calibri"/>
+                <w:color w:val="000000" w:themeColor="text1"/>
+                <w:sz w:val="22"/>
+                <w:szCs w:val="22"/>
+              </w:rPr>
+              <w:t xml:space="preserve">90% effort in data cleaning and fixing, 10% in modelling. </w:t>
+            </w:r>
+          </w:p>
+        </w:tc>
+      </w:tr>
+      <w:tr>
+        <w:tc>
+          <w:tcPr>
+            <w:tcW w:w="2263" w:type="dxa"/>
+            <w:vAlign w:val="center"/>
+          </w:tcPr>
+          <w:p>
+            <w:pPr>
+              <w:jc w:val="center"/>
+              <w:rPr>
+                <w:szCs w:val="22"/>
+                <w:lang w:val="en-US"/>
+              </w:rPr>
+            </w:pPr>
+            <w:r>
+              <w:rPr>
+                <w:szCs w:val="22"/>
+                <w:lang w:val="en-US"/>
+              </w:rPr>
+              <w:t>How does LNER quantify cost/effect of poor communications when it comes to disruption?</w:t>
+            </w:r>
+          </w:p>
+          <w:p>
+            <w:pPr>
+              <w:jc w:val="center"/>
+              <w:rPr>
+                <w:szCs w:val="22"/>
+                <w:lang w:val="en-US"/>
+              </w:rPr>
+            </w:pPr>
+          </w:p>
+        </w:tc>
+        <w:tc>
+          <w:tcPr>
+            <w:tcW w:w="7938" w:type="dxa"/>
+          </w:tcPr>
+          <w:p>
+            <w:pPr>
+              <w:pStyle w:val="ListParagraph"/>
+              <w:numPr>
+                <w:ilvl w:val="0"/>
+                <w:numId w:val="93"/>
+              </w:numPr>
+              <w:spacing w:before="180" w:after="180"/>
+              <w:rPr>
+                <w:rFonts w:eastAsia="Cambria"/>
+                <w:color w:val="000000" w:themeColor="text1"/>
+                <w:sz w:val="22"/>
+                <w:szCs w:val="20"/>
+              </w:rPr>
+            </w:pPr>
+            <w:r>
+              <w:rPr>
+                <w:rFonts w:eastAsia="Cambria"/>
+                <w:color w:val="000000" w:themeColor="text1"/>
+                <w:sz w:val="22"/>
+                <w:szCs w:val="20"/>
+              </w:rPr>
+              <w:t xml:space="preserve">Cancelling a train results in a £10-15k fine for LNER. </w:t>
+            </w:r>
+          </w:p>
+          <w:p>
+            <w:pPr>
+              <w:pStyle w:val="ListParagraph"/>
+              <w:numPr>
+                <w:ilvl w:val="0"/>
+                <w:numId w:val="90"/>
+              </w:numPr>
+              <w:spacing w:before="180" w:after="180"/>
+              <w:rPr>
+                <w:rFonts w:ascii="Calibri" w:eastAsia="Cambria" w:hAnsi="Calibri" w:cs="Calibri"/>
+                <w:color w:val="000000" w:themeColor="text1"/>
+                <w:sz w:val="22"/>
+                <w:szCs w:val="22"/>
+              </w:rPr>
+            </w:pPr>
+            <w:r>
+              <w:rPr>
+                <w:rFonts w:ascii="Calibri" w:eastAsia="Cambria" w:hAnsi="Calibri" w:cs="Calibri"/>
+                <w:color w:val="000000" w:themeColor="text1"/>
+                <w:sz w:val="22"/>
+                <w:szCs w:val="22"/>
+              </w:rPr>
+              <w:t xml:space="preserve">Inaccurate ETA’s reduce trust and increase complaints, LNER focus on Reputation </w:t>
+            </w:r>
+          </w:p>
+          <w:p>
+            <w:pPr>
+              <w:pStyle w:val="ListParagraph"/>
+              <w:numPr>
+                <w:ilvl w:val="0"/>
+                <w:numId w:val="90"/>
+              </w:numPr>
+              <w:spacing w:before="180" w:after="180"/>
+              <w:rPr>
+                <w:rFonts w:ascii="Calibri" w:eastAsia="Cambria" w:hAnsi="Calibri" w:cs="Calibri"/>
+                <w:color w:val="000000" w:themeColor="text1"/>
+                <w:sz w:val="22"/>
+                <w:szCs w:val="22"/>
+              </w:rPr>
+            </w:pPr>
+            <w:r>
+              <w:rPr>
+                <w:rFonts w:ascii="Calibri" w:eastAsia="Cambria" w:hAnsi="Calibri" w:cs="Calibri"/>
+                <w:color w:val="000000" w:themeColor="text1"/>
+                <w:sz w:val="22"/>
+                <w:szCs w:val="22"/>
+              </w:rPr>
+              <w:t xml:space="preserve">Customer satisfaction and dissatisfaction surveys monitored </w:t>
+            </w:r>
+          </w:p>
+        </w:tc>
+      </w:tr>
+      <w:tr>
+        <w:tc>
+          <w:tcPr>
+            <w:tcW w:w="2263" w:type="dxa"/>
+            <w:vAlign w:val="center"/>
+          </w:tcPr>
+          <w:p>
+            <w:pPr>
+              <w:jc w:val="center"/>
+              <w:rPr>
+                <w:szCs w:val="22"/>
+                <w:lang w:val="en-US"/>
+              </w:rPr>
+            </w:pPr>
+            <w:r>
+              <w:rPr>
+                <w:szCs w:val="22"/>
+              </w:rPr>
+              <w:t>How accurate do the predictions need to be?</w:t>
+            </w:r>
+          </w:p>
+          <w:p>
+            <w:pPr>
+              <w:pStyle w:val="ListParagraph"/>
+              <w:jc w:val="center"/>
+              <w:rPr>
+                <w:rFonts w:ascii="Calibri" w:hAnsi="Calibri" w:cs="Calibri"/>
+                <w:sz w:val="22"/>
+                <w:szCs w:val="22"/>
+              </w:rPr>
+            </w:pPr>
+          </w:p>
+        </w:tc>
+        <w:tc>
+          <w:tcPr>
+            <w:tcW w:w="7938" w:type="dxa"/>
+          </w:tcPr>
+          <w:p>
+            <w:pPr>
+              <w:pStyle w:val="ListParagraph"/>
+              <w:spacing w:before="180" w:after="180"/>
+              <w:rPr>
+                <w:rFonts w:ascii="Calibri" w:eastAsia="Cambria" w:hAnsi="Calibri" w:cs="Calibri"/>
+                <w:color w:val="000000" w:themeColor="text1"/>
+                <w:sz w:val="22"/>
+                <w:szCs w:val="22"/>
+              </w:rPr>
+            </w:pPr>
+          </w:p>
+          <w:p>
+            <w:pPr>
+              <w:pStyle w:val="ListParagraph"/>
+              <w:numPr>
+                <w:ilvl w:val="0"/>
+                <w:numId w:val="90"/>
+              </w:numPr>
+              <w:spacing w:before="180" w:after="180"/>
+              <w:rPr>
+                <w:rFonts w:ascii="Calibri" w:eastAsia="Cambria" w:hAnsi="Calibri" w:cs="Calibri"/>
+                <w:color w:val="000000" w:themeColor="text1"/>
+                <w:sz w:val="22"/>
+                <w:szCs w:val="22"/>
+              </w:rPr>
+            </w:pPr>
+            <w:r>
+              <w:rPr>
+                <w:rFonts w:ascii="Calibri" w:eastAsia="Cambria" w:hAnsi="Calibri" w:cs="Calibri"/>
+                <w:color w:val="000000" w:themeColor="text1"/>
+                <w:sz w:val="22"/>
+                <w:szCs w:val="22"/>
+              </w:rPr>
+              <w:t xml:space="preserve">LNER follows “bad information is </w:t>
+            </w:r>
+            <w:r>
+              <w:rPr>
+                <w:rFonts w:ascii="Calibri" w:eastAsia="Cambria" w:hAnsi="Calibri" w:cs="Calibri"/>
+                <w:color w:val="000000" w:themeColor="text1"/>
+                <w:sz w:val="22"/>
+                <w:szCs w:val="22"/>
+              </w:rPr>
+              <w:t xml:space="preserve">only slightly </w:t>
+            </w:r>
+            <w:r>
+              <w:rPr>
+                <w:rFonts w:ascii="Calibri" w:eastAsia="Cambria" w:hAnsi="Calibri" w:cs="Calibri"/>
+                <w:color w:val="000000" w:themeColor="text1"/>
+                <w:sz w:val="22"/>
+                <w:szCs w:val="22"/>
+              </w:rPr>
+              <w:t xml:space="preserve">better than no information” when giving updates on delays and disruptions.  </w:t>
+            </w:r>
+          </w:p>
+        </w:tc>
+      </w:tr>
+      <w:tr>
+        <w:tc>
+          <w:tcPr>
+            <w:tcW w:w="2263" w:type="dxa"/>
+            <w:vAlign w:val="center"/>
+          </w:tcPr>
+          <w:p>
+            <w:pPr>
+              <w:jc w:val="center"/>
+              <w:rPr>
+                <w:szCs w:val="22"/>
+                <w:lang w:val="en-US"/>
+              </w:rPr>
+            </w:pPr>
+            <w:r>
+              <w:rPr>
+                <w:szCs w:val="22"/>
+              </w:rPr>
+              <w:t xml:space="preserve">Do you also want to consider how stable and how easy to interpret they (predictions) are? E.g. changing </w:t>
+            </w:r>
+            <w:r>
+              <w:rPr>
+                <w:szCs w:val="22"/>
+              </w:rPr>
+              <w:t xml:space="preserve">every </w:t>
+            </w:r>
+            <w:r>
+              <w:rPr>
+                <w:szCs w:val="22"/>
+              </w:rPr>
+              <w:t>minute might confuse staff</w:t>
+            </w:r>
+          </w:p>
+          <w:p>
+            <w:pPr>
+              <w:pStyle w:val="ListParagraph"/>
+              <w:jc w:val="center"/>
+              <w:rPr>
+                <w:rFonts w:ascii="Calibri" w:hAnsi="Calibri" w:cs="Calibri"/>
+                <w:sz w:val="22"/>
+                <w:szCs w:val="22"/>
+              </w:rPr>
+            </w:pPr>
+          </w:p>
+        </w:tc>
+        <w:tc>
+          <w:tcPr>
+            <w:tcW w:w="7938" w:type="dxa"/>
+          </w:tcPr>
+          <w:p>
+            <w:pPr>
+              <w:pStyle w:val="ListParagraph"/>
+              <w:spacing w:before="180" w:after="180"/>
+              <w:rPr>
+                <w:rFonts w:ascii="Calibri" w:eastAsia="Cambria" w:hAnsi="Calibri" w:cs="Calibri"/>
+                <w:color w:val="000000" w:themeColor="text1"/>
+                <w:sz w:val="22"/>
+                <w:szCs w:val="22"/>
+              </w:rPr>
+            </w:pPr>
+          </w:p>
+          <w:p>
+            <w:pPr>
+              <w:pStyle w:val="ListParagraph"/>
+              <w:numPr>
+                <w:ilvl w:val="0"/>
+                <w:numId w:val="90"/>
+              </w:numPr>
+              <w:spacing w:before="180" w:after="180"/>
+              <w:rPr>
+                <w:rFonts w:ascii="Calibri" w:eastAsia="Cambria" w:hAnsi="Calibri" w:cs="Calibri"/>
+                <w:color w:val="000000" w:themeColor="text1"/>
+                <w:sz w:val="22"/>
+                <w:szCs w:val="22"/>
+              </w:rPr>
+            </w:pPr>
+            <w:r>
+              <w:rPr>
+                <w:rFonts w:ascii="Calibri" w:eastAsia="Cambria" w:hAnsi="Calibri" w:cs="Calibri"/>
+                <w:color w:val="000000" w:themeColor="text1"/>
+                <w:sz w:val="22"/>
+                <w:szCs w:val="22"/>
+              </w:rPr>
+              <w:t xml:space="preserve">Small delays e.g. 15 minutes can be bucketed differently (customers can adapt e.g. go to the cafe, not a serious delay) </w:t>
+            </w:r>
+          </w:p>
+        </w:tc>
+      </w:tr>
+    </w:tbl>
+    <w:p>
+      <w:pPr>
+        <w:spacing w:line="278" w:lineRule="auto"/>
+        <w:rPr>
+          <w:rFonts w:ascii="Cambria" w:eastAsia="Cambria" w:hAnsi="Cambria" w:cs="Cambria"/>
+          <w:color w:val="000000" w:themeColor="text1"/>
+          <w:sz w:val="24"/>
+        </w:rPr>
+      </w:pPr>
+    </w:p>
+    <w:p>
+      <w:pPr>
+        <w:pStyle w:val="Heading3"/>
+        <w:spacing w:before="200"/>
+        <w:jc w:val="center"/>
         <w:rPr>
           <w:rFonts w:ascii="Calibri" w:eastAsia="Calibri" w:hAnsi="Calibri" w:cs="Calibri"/>
           <w:b/>
@@ -4064,8 +4882,8 @@
           <w:szCs w:val="32"/>
           <w:lang w:val="en-US"/>
         </w:rPr>
-        <w:t>2</w:t>
-      </w:r>
+      </w:pPr>
+      <w:bookmarkStart w:id="7" w:name="_Toc224758568"/>
       <w:r>
         <w:rPr>
           <w:rFonts w:ascii="Calibri" w:eastAsia="Calibri" w:hAnsi="Calibri" w:cs="Calibri"/>
@@ -4076,7 +4894,7 @@
           <w:szCs w:val="32"/>
           <w:lang w:val="en-US"/>
         </w:rPr>
-        <w:t xml:space="preserve">.2 LNER Interview </w:t>
+        <w:t>2</w:t>
       </w:r>
       <w:r>
         <w:rPr>
@@ -4088,6 +4906,42 @@
           <w:szCs w:val="32"/>
           <w:lang w:val="en-US"/>
         </w:rPr>
+        <w:t xml:space="preserve">.2 </w:t>
+      </w:r>
+      <w:r>
+        <w:rPr>
+          <w:rFonts w:ascii="Calibri" w:eastAsia="Calibri" w:hAnsi="Calibri" w:cs="Calibri"/>
+          <w:b/>
+          <w:bCs/>
+          <w:color w:val="FF0000"/>
+          <w:sz w:val="32"/>
+          <w:szCs w:val="32"/>
+          <w:lang w:val="en-US"/>
+        </w:rPr>
+        <w:t xml:space="preserve">Full </w:t>
+      </w:r>
+      <w:r>
+        <w:rPr>
+          <w:rFonts w:ascii="Calibri" w:eastAsia="Calibri" w:hAnsi="Calibri" w:cs="Calibri"/>
+          <w:b/>
+          <w:bCs/>
+          <w:color w:val="FF0000"/>
+          <w:sz w:val="32"/>
+          <w:szCs w:val="32"/>
+          <w:lang w:val="en-US"/>
+        </w:rPr>
+        <w:t xml:space="preserve">LNER Interview </w:t>
+      </w:r>
+      <w:r>
+        <w:rPr>
+          <w:rFonts w:ascii="Calibri" w:eastAsia="Calibri" w:hAnsi="Calibri" w:cs="Calibri"/>
+          <w:b/>
+          <w:bCs/>
+          <w:color w:val="FF0000"/>
+          <w:sz w:val="32"/>
+          <w:szCs w:val="32"/>
+          <w:lang w:val="en-US"/>
+        </w:rPr>
         <w:t>Notes</w:t>
       </w:r>
       <w:bookmarkEnd w:id="7"/>
@@ -4571,7 +5425,6 @@
           <w:sz w:val="22"/>
           <w:szCs w:val="22"/>
         </w:rPr>
-        <w:lastRenderedPageBreak/>
         <w:t xml:space="preserve">Reactionary delays 5-10 minutes from earlier disruptions. </w:t>
       </w:r>
     </w:p>
@@ -4956,7 +5809,7 @@
           <w:lang w:val="en-US"/>
         </w:rPr>
       </w:pPr>
-      <w:bookmarkStart w:id="8" w:name="_Toc224748091"/>
+      <w:bookmarkStart w:id="8" w:name="_Toc224758569"/>
       <w:r>
         <w:rPr>
           <w:rFonts w:ascii="Calibri" w:eastAsia="Calibri" w:hAnsi="Calibri" w:cs="Calibri"/>
@@ -5274,6 +6127,23 @@
     </w:p>
     <w:p>
       <w:pPr>
+        <w:spacing w:line="278" w:lineRule="auto"/>
+        <w:rPr>
+          <w:rFonts w:ascii="Cambria" w:eastAsia="Cambria" w:hAnsi="Cambria" w:cs="Cambria"/>
+          <w:color w:val="000000" w:themeColor="text1"/>
+          <w:sz w:val="24"/>
+        </w:rPr>
+      </w:pPr>
+      <w:r>
+        <w:rPr>
+          <w:rFonts w:ascii="Cambria" w:eastAsia="Cambria" w:hAnsi="Cambria" w:cs="Cambria"/>
+          <w:color w:val="000000" w:themeColor="text1"/>
+        </w:rPr>
+        <w:br w:type="page"/>
+      </w:r>
+    </w:p>
+    <w:p>
+      <w:pPr>
         <w:pStyle w:val="Compact"/>
         <w:rPr>
           <w:rFonts w:ascii="Cambria" w:eastAsia="Cambria" w:hAnsi="Cambria" w:cs="Cambria"/>
@@ -5305,7 +6175,7 @@
           <w:lang w:val="en-US"/>
         </w:rPr>
       </w:pPr>
-      <w:bookmarkStart w:id="9" w:name="_Toc224748092"/>
+      <w:bookmarkStart w:id="9" w:name="_Toc224758570"/>
       <w:r>
         <w:rPr>
           <w:rFonts w:ascii="Calibri" w:eastAsia="Calibri" w:hAnsi="Calibri" w:cs="Calibri"/>
@@ -6138,7 +7008,7 @@
           <w:lang w:val="en-US"/>
         </w:rPr>
       </w:pPr>
-      <w:bookmarkStart w:id="10" w:name="_Toc224748093"/>
+      <w:bookmarkStart w:id="10" w:name="_Toc224758571"/>
       <w:r>
         <w:rPr>
           <w:rFonts w:ascii="Calibri" w:eastAsia="Calibri" w:hAnsi="Calibri" w:cs="Calibri"/>
@@ -6499,7 +7369,7 @@
           <w:lang w:val="en-US"/>
         </w:rPr>
       </w:pPr>
-      <w:bookmarkStart w:id="11" w:name="_Toc224748094"/>
+      <w:bookmarkStart w:id="11" w:name="_Toc224758572"/>
       <w:r>
         <w:rPr>
           <w:rFonts w:ascii="Calibri" w:eastAsia="Calibri" w:hAnsi="Calibri" w:cs="Calibri"/>
@@ -6550,7 +7420,7 @@
           <w:lang w:val="en-US"/>
         </w:rPr>
       </w:pPr>
-      <w:bookmarkStart w:id="12" w:name="_Toc224748095"/>
+      <w:bookmarkStart w:id="12" w:name="_Toc224758573"/>
       <w:r>
         <w:rPr>
           <w:rFonts w:ascii="Calibri" w:eastAsia="Calibri" w:hAnsi="Calibri" w:cs="Calibri"/>
@@ -6763,7 +7633,7 @@
           <w:lang w:val="en-US"/>
         </w:rPr>
       </w:pPr>
-      <w:bookmarkStart w:id="13" w:name="_Toc224748096"/>
+      <w:bookmarkStart w:id="13" w:name="_Toc224758574"/>
       <w:r>
         <w:rPr>
           <w:rFonts w:ascii="Calibri" w:eastAsia="Calibri" w:hAnsi="Calibri" w:cs="Calibri"/>
@@ -7116,7 +7986,7 @@
           <w:lang w:val="en-US"/>
         </w:rPr>
       </w:pPr>
-      <w:bookmarkStart w:id="14" w:name="_Toc224748097"/>
+      <w:bookmarkStart w:id="14" w:name="_Toc224758575"/>
       <w:r>
         <w:rPr>
           <w:rFonts w:ascii="Calibri" w:eastAsia="Calibri" w:hAnsi="Calibri" w:cs="Calibri"/>
@@ -7325,6 +8195,7 @@
         <w:rPr>
           <w:b/>
           <w:bCs/>
+          <w:noProof/>
           <w:color w:val="FF0000"/>
           <w:sz w:val="36"/>
           <w:szCs w:val="36"/>
@@ -7411,7 +8282,6 @@
           <w:lang w:val="en-US"/>
         </w:rPr>
       </w:pPr>
-      <w:bookmarkStart w:id="15" w:name="_Toc224748098"/>
       <w:r>
         <w:rPr>
           <w:b/>
@@ -7438,6 +8308,7 @@
           <w:lang w:val="en-US"/>
         </w:rPr>
       </w:pPr>
+      <w:bookmarkStart w:id="15" w:name="_Toc224758576"/>
       <w:r>
         <w:rPr>
           <w:rFonts w:ascii="Calibri" w:eastAsia="Calibri" w:hAnsi="Calibri" w:cs="Calibri"/>
@@ -7500,7 +8371,7 @@
           <w:lang w:val="en-US"/>
         </w:rPr>
       </w:pPr>
-      <w:bookmarkStart w:id="16" w:name="_Toc224748099"/>
+      <w:bookmarkStart w:id="16" w:name="_Toc224758577"/>
       <w:r>
         <w:rPr>
           <w:rFonts w:ascii="Calibri" w:eastAsia="Calibri" w:hAnsi="Calibri" w:cs="Calibri"/>
@@ -8550,7 +9421,7 @@
           <w:lang w:val="en-US"/>
         </w:rPr>
       </w:pPr>
-      <w:bookmarkStart w:id="17" w:name="_Toc224748100"/>
+      <w:bookmarkStart w:id="17" w:name="_Toc224758578"/>
       <w:r>
         <w:rPr>
           <w:rFonts w:ascii="Calibri" w:eastAsia="Calibri" w:hAnsi="Calibri" w:cs="Calibri"/>
@@ -13010,7 +13881,7 @@
           <w:lang w:val="en-US"/>
         </w:rPr>
       </w:pPr>
-      <w:bookmarkStart w:id="18" w:name="_Toc224748101"/>
+      <w:bookmarkStart w:id="18" w:name="_Toc224758579"/>
       <w:r>
         <w:rPr>
           <w:rFonts w:ascii="Calibri" w:eastAsia="Calibri" w:hAnsi="Calibri" w:cs="Calibri"/>
@@ -13128,6 +13999,26 @@
     </w:p>
     <w:p>
       <w:pPr>
+        <w:spacing w:line="278" w:lineRule="auto"/>
+        <w:rPr>
+          <w:b/>
+          <w:bCs/>
+          <w:color w:val="4F81BD"/>
+          <w:sz w:val="24"/>
+        </w:rPr>
+      </w:pPr>
+      <w:r>
+        <w:rPr>
+          <w:b/>
+          <w:bCs/>
+          <w:color w:val="4F81BD"/>
+          <w:sz w:val="24"/>
+        </w:rPr>
+        <w:br w:type="page"/>
+      </w:r>
+    </w:p>
+    <w:p>
+      <w:pPr>
         <w:keepNext/>
         <w:keepLines/>
         <w:spacing w:before="200" w:after="0"/>
@@ -13154,7 +14045,7 @@
           <w:lang w:val="en-US"/>
         </w:rPr>
       </w:pPr>
-      <w:bookmarkStart w:id="19" w:name="_Toc224748102"/>
+      <w:bookmarkStart w:id="19" w:name="_Toc224758580"/>
       <w:r>
         <w:rPr>
           <w:rFonts w:ascii="Calibri" w:eastAsia="Calibri" w:hAnsi="Calibri" w:cs="Calibri"/>
@@ -13226,10 +14117,33 @@
     </w:p>
     <w:p>
       <w:pPr>
-        <w:rPr>
-          <w:lang w:val="en-US"/>
-        </w:rPr>
-      </w:pPr>
+        <w:jc w:val="right"/>
+        <w:rPr>
+          <w:color w:val="FF0000"/>
+          <w:lang w:val="en-US"/>
+        </w:rPr>
+      </w:pPr>
+      <w:r>
+        <w:rPr>
+          <w:color w:val="FF0000"/>
+          <w:lang w:val="en-US"/>
+        </w:rPr>
+        <w:t>(</w:t>
+      </w:r>
+      <w:r>
+        <w:rPr>
+          <w:color w:val="FF0000"/>
+          <w:lang w:val="en-US"/>
+        </w:rPr>
+        <w:t>AI</w:t>
+      </w:r>
+      <w:r>
+        <w:rPr>
+          <w:color w:val="FF0000"/>
+          <w:lang w:val="en-US"/>
+        </w:rPr>
+        <w:t>, DJ)</w:t>
+      </w:r>
     </w:p>
     <w:p>
       <w:pPr>
@@ -13307,28 +14221,414 @@
       </w:r>
     </w:p>
     <w:p/>
-    <w:p>
-      <w:pPr>
-        <w:rPr>
-          <w:b/>
-          <w:bCs/>
-          <w:color w:val="4C94D8" w:themeColor="text2" w:themeTint="80"/>
-          <w:sz w:val="36"/>
-          <w:szCs w:val="36"/>
-        </w:rPr>
-      </w:pPr>
-      <w:r>
-        <w:rPr>
-          <w:b/>
-          <w:bCs/>
-          <w:color w:val="4C94D8" w:themeColor="text2" w:themeTint="80"/>
-          <w:sz w:val="36"/>
-          <w:szCs w:val="36"/>
-        </w:rPr>
-        <w:t>(RISK MITIGATION LOG)</w:t>
-      </w:r>
-    </w:p>
-    <w:p/>
+    <w:tbl>
+      <w:tblPr>
+        <w:tblStyle w:val="TableGrid"/>
+        <w:tblW w:w="9634" w:type="dxa"/>
+        <w:tblLook w:val="04A0" w:firstRow="1" w:lastRow="0" w:firstColumn="1" w:lastColumn="0" w:noHBand="0" w:noVBand="1"/>
+      </w:tblPr>
+      <w:tblGrid>
+        <w:gridCol w:w="704"/>
+        <w:gridCol w:w="2835"/>
+        <w:gridCol w:w="2977"/>
+        <w:gridCol w:w="3118"/>
+      </w:tblGrid>
+      <w:tr>
+        <w:tc>
+          <w:tcPr>
+            <w:tcW w:w="704" w:type="dxa"/>
+            <w:shd w:val="clear" w:color="auto" w:fill="EE0000"/>
+          </w:tcPr>
+          <w:p>
+            <w:pPr>
+              <w:jc w:val="center"/>
+              <w:rPr>
+                <w:b/>
+                <w:bCs/>
+                <w:color w:val="FFFFFF" w:themeColor="background1"/>
+              </w:rPr>
+            </w:pPr>
+            <w:r>
+              <w:rPr>
+                <w:b/>
+                <w:bCs/>
+                <w:color w:val="FFFFFF" w:themeColor="background1"/>
+              </w:rPr>
+              <w:t>ID</w:t>
+            </w:r>
+          </w:p>
+        </w:tc>
+        <w:tc>
+          <w:tcPr>
+            <w:tcW w:w="2835" w:type="dxa"/>
+            <w:shd w:val="clear" w:color="auto" w:fill="EE0000"/>
+          </w:tcPr>
+          <w:p>
+            <w:pPr>
+              <w:jc w:val="center"/>
+              <w:rPr>
+                <w:b/>
+                <w:bCs/>
+                <w:color w:val="FFFFFF" w:themeColor="background1"/>
+              </w:rPr>
+            </w:pPr>
+            <w:r>
+              <w:rPr>
+                <w:b/>
+                <w:bCs/>
+                <w:color w:val="FFFFFF" w:themeColor="background1"/>
+              </w:rPr>
+              <w:t>Risk</w:t>
+            </w:r>
+          </w:p>
+        </w:tc>
+        <w:tc>
+          <w:tcPr>
+            <w:tcW w:w="2977" w:type="dxa"/>
+            <w:shd w:val="clear" w:color="auto" w:fill="EE0000"/>
+          </w:tcPr>
+          <w:p>
+            <w:pPr>
+              <w:jc w:val="center"/>
+              <w:rPr>
+                <w:b/>
+                <w:bCs/>
+                <w:color w:val="FFFFFF" w:themeColor="background1"/>
+              </w:rPr>
+            </w:pPr>
+            <w:r>
+              <w:rPr>
+                <w:b/>
+                <w:bCs/>
+                <w:color w:val="FFFFFF" w:themeColor="background1"/>
+              </w:rPr>
+              <w:t>Mitigation</w:t>
+            </w:r>
+          </w:p>
+        </w:tc>
+        <w:tc>
+          <w:tcPr>
+            <w:tcW w:w="3118" w:type="dxa"/>
+            <w:shd w:val="clear" w:color="auto" w:fill="EE0000"/>
+          </w:tcPr>
+          <w:p>
+            <w:pPr>
+              <w:jc w:val="center"/>
+              <w:rPr>
+                <w:b/>
+                <w:bCs/>
+                <w:color w:val="FFFFFF" w:themeColor="background1"/>
+              </w:rPr>
+            </w:pPr>
+            <w:r>
+              <w:rPr>
+                <w:b/>
+                <w:bCs/>
+                <w:color w:val="FFFFFF" w:themeColor="background1"/>
+              </w:rPr>
+              <w:t>Elimination</w:t>
+            </w:r>
+          </w:p>
+        </w:tc>
+      </w:tr>
+      <w:tr>
+        <w:tc>
+          <w:tcPr>
+            <w:tcW w:w="704" w:type="dxa"/>
+          </w:tcPr>
+          <w:p>
+            <w:r>
+              <w:t>1.1</w:t>
+            </w:r>
+          </w:p>
+        </w:tc>
+        <w:tc>
+          <w:tcPr>
+            <w:tcW w:w="2835" w:type="dxa"/>
+          </w:tcPr>
+          <w:p>
+            <w:r>
+              <w:t>Poor data quality</w:t>
+            </w:r>
+          </w:p>
+          <w:p/>
+        </w:tc>
+        <w:tc>
+          <w:tcPr>
+            <w:tcW w:w="2977" w:type="dxa"/>
+          </w:tcPr>
+          <w:p>
+            <w:r>
+              <w:t>Request data directly from LNER.</w:t>
+            </w:r>
+          </w:p>
+          <w:p/>
+          <w:p>
+            <w:r>
+              <w:t>Apply data cleaning techniques (imputation etc.)</w:t>
+            </w:r>
+          </w:p>
+        </w:tc>
+        <w:tc>
+          <w:tcPr>
+            <w:tcW w:w="3118" w:type="dxa"/>
+          </w:tcPr>
+          <w:p/>
+        </w:tc>
+      </w:tr>
+      <w:tr>
+        <w:tc>
+          <w:tcPr>
+            <w:tcW w:w="704" w:type="dxa"/>
+          </w:tcPr>
+          <w:p>
+            <w:r>
+              <w:t>1.1</w:t>
+            </w:r>
+          </w:p>
+        </w:tc>
+        <w:tc>
+          <w:tcPr>
+            <w:tcW w:w="2835" w:type="dxa"/>
+          </w:tcPr>
+          <w:p>
+            <w:r>
+              <w:t>Data collection takes too long</w:t>
+            </w:r>
+          </w:p>
+        </w:tc>
+        <w:tc>
+          <w:tcPr>
+            <w:tcW w:w="2977" w:type="dxa"/>
+          </w:tcPr>
+          <w:p/>
+        </w:tc>
+        <w:tc>
+          <w:tcPr>
+            <w:tcW w:w="3118" w:type="dxa"/>
+          </w:tcPr>
+          <w:p>
+            <w:r>
+              <w:t>Reduce scope and leave open for future scalability</w:t>
+            </w:r>
+          </w:p>
+        </w:tc>
+      </w:tr>
+      <w:tr>
+        <w:tc>
+          <w:tcPr>
+            <w:tcW w:w="704" w:type="dxa"/>
+          </w:tcPr>
+          <w:p>
+            <w:r>
+              <w:t>1.2</w:t>
+            </w:r>
+          </w:p>
+        </w:tc>
+        <w:tc>
+          <w:tcPr>
+            <w:tcW w:w="2835" w:type="dxa"/>
+          </w:tcPr>
+          <w:p>
+            <w:r>
+              <w:t>Lack of meaningful insights</w:t>
+            </w:r>
+          </w:p>
+        </w:tc>
+        <w:tc>
+          <w:tcPr>
+            <w:tcW w:w="2977" w:type="dxa"/>
+          </w:tcPr>
+          <w:p>
+            <w:r>
+              <w:t>Consult domain experts</w:t>
+            </w:r>
+          </w:p>
+          <w:p/>
+          <w:p>
+            <w:r>
+              <w:t>Add new features</w:t>
+            </w:r>
+          </w:p>
+        </w:tc>
+        <w:tc>
+          <w:tcPr>
+            <w:tcW w:w="3118" w:type="dxa"/>
+          </w:tcPr>
+          <w:p/>
+        </w:tc>
+      </w:tr>
+      <w:tr>
+        <w:tc>
+          <w:tcPr>
+            <w:tcW w:w="704" w:type="dxa"/>
+          </w:tcPr>
+          <w:p>
+            <w:r>
+              <w:t>1.3</w:t>
+            </w:r>
+          </w:p>
+        </w:tc>
+        <w:tc>
+          <w:tcPr>
+            <w:tcW w:w="2835" w:type="dxa"/>
+          </w:tcPr>
+          <w:p>
+            <w:r>
+              <w:t>Bad model performance</w:t>
+            </w:r>
+          </w:p>
+          <w:p/>
+        </w:tc>
+        <w:tc>
+          <w:tcPr>
+            <w:tcW w:w="2977" w:type="dxa"/>
+          </w:tcPr>
+          <w:p>
+            <w:r>
+              <w:t>Compare multiple models.</w:t>
+            </w:r>
+          </w:p>
+          <w:p/>
+          <w:p>
+            <w:r>
+              <w:t xml:space="preserve">Use </w:t>
+            </w:r>
+            <w:proofErr w:type="spellStart"/>
+            <w:r>
+              <w:t>GridSearch</w:t>
+            </w:r>
+            <w:proofErr w:type="spellEnd"/>
+            <w:r>
+              <w:t xml:space="preserve"> to tune hyperparameters or make use of ensemble learning.</w:t>
+            </w:r>
+          </w:p>
+        </w:tc>
+        <w:tc>
+          <w:tcPr>
+            <w:tcW w:w="3118" w:type="dxa"/>
+          </w:tcPr>
+          <w:p/>
+        </w:tc>
+      </w:tr>
+      <w:tr>
+        <w:tc>
+          <w:tcPr>
+            <w:tcW w:w="704" w:type="dxa"/>
+          </w:tcPr>
+          <w:p>
+            <w:r>
+              <w:t>1.3</w:t>
+            </w:r>
+          </w:p>
+        </w:tc>
+        <w:tc>
+          <w:tcPr>
+            <w:tcW w:w="2835" w:type="dxa"/>
+          </w:tcPr>
+          <w:p>
+            <w:r>
+              <w:t>Bad/No disruption labels</w:t>
+            </w:r>
+          </w:p>
+        </w:tc>
+        <w:tc>
+          <w:tcPr>
+            <w:tcW w:w="2977" w:type="dxa"/>
+          </w:tcPr>
+          <w:p/>
+        </w:tc>
+        <w:tc>
+          <w:tcPr>
+            <w:tcW w:w="3118" w:type="dxa"/>
+          </w:tcPr>
+          <w:p>
+            <w:r>
+              <w:t>Create pseudo disruption flags based on available features using domain knowledge.</w:t>
+            </w:r>
+          </w:p>
+        </w:tc>
+      </w:tr>
+      <w:tr>
+        <w:tc>
+          <w:tcPr>
+            <w:tcW w:w="704" w:type="dxa"/>
+          </w:tcPr>
+          <w:p>
+            <w:r>
+              <w:t>1.4</w:t>
+            </w:r>
+          </w:p>
+        </w:tc>
+        <w:tc>
+          <w:tcPr>
+            <w:tcW w:w="2835" w:type="dxa"/>
+          </w:tcPr>
+          <w:p>
+            <w:r>
+              <w:t>Complete model metrics unavailable</w:t>
+            </w:r>
+          </w:p>
+        </w:tc>
+        <w:tc>
+          <w:tcPr>
+            <w:tcW w:w="2977" w:type="dxa"/>
+          </w:tcPr>
+          <w:p/>
+        </w:tc>
+        <w:tc>
+          <w:tcPr>
+            <w:tcW w:w="3118" w:type="dxa"/>
+          </w:tcPr>
+          <w:p>
+            <w:r>
+              <w:t>Use techniques to train quicker models and use as a base/expected minimum performance and improve on metrics for final report.</w:t>
+            </w:r>
+          </w:p>
+        </w:tc>
+      </w:tr>
+      <w:tr>
+        <w:trPr>
+          <w:trHeight w:val="43"/>
+        </w:trPr>
+        <w:tc>
+          <w:tcPr>
+            <w:tcW w:w="704" w:type="dxa"/>
+          </w:tcPr>
+          <w:p>
+            <w:r>
+              <w:t>1.5</w:t>
+            </w:r>
+          </w:p>
+        </w:tc>
+        <w:tc>
+          <w:tcPr>
+            <w:tcW w:w="2835" w:type="dxa"/>
+          </w:tcPr>
+          <w:p>
+            <w:r>
+              <w:t>Models take too long to train</w:t>
+            </w:r>
+          </w:p>
+        </w:tc>
+        <w:tc>
+          <w:tcPr>
+            <w:tcW w:w="2977" w:type="dxa"/>
+          </w:tcPr>
+          <w:p/>
+        </w:tc>
+        <w:tc>
+          <w:tcPr>
+            <w:tcW w:w="3118" w:type="dxa"/>
+          </w:tcPr>
+          <w:p>
+            <w:r>
+              <w:t>Reduce scope and leave open for future scalability.</w:t>
+            </w:r>
+          </w:p>
+        </w:tc>
+      </w:tr>
+    </w:tbl>
     <w:p/>
     <w:p>
       <w:pPr>
@@ -13342,6 +14642,1252 @@
           <w:lang w:val="en-US"/>
         </w:rPr>
       </w:pPr>
+    </w:p>
+    <w:p>
+      <w:pPr>
+        <w:spacing w:line="278" w:lineRule="auto"/>
+        <w:rPr>
+          <w:b/>
+          <w:bCs/>
+          <w:color w:val="FF0000"/>
+          <w:sz w:val="36"/>
+          <w:szCs w:val="36"/>
+          <w:lang w:val="en-US"/>
+        </w:rPr>
+      </w:pPr>
+    </w:p>
+    <w:p>
+      <w:pPr>
+        <w:spacing w:line="278" w:lineRule="auto"/>
+        <w:rPr>
+          <w:b/>
+          <w:bCs/>
+          <w:color w:val="FF0000"/>
+          <w:sz w:val="36"/>
+          <w:szCs w:val="36"/>
+          <w:lang w:val="en-US"/>
+        </w:rPr>
+      </w:pPr>
+    </w:p>
+    <w:p>
+      <w:pPr>
+        <w:pStyle w:val="Heading3"/>
+        <w:spacing w:before="200"/>
+        <w:jc w:val="center"/>
+        <w:rPr>
+          <w:rFonts w:ascii="Calibri" w:eastAsia="Calibri" w:hAnsi="Calibri" w:cs="Calibri"/>
+          <w:b/>
+          <w:bCs/>
+          <w:color w:val="FF0000"/>
+          <w:sz w:val="32"/>
+          <w:szCs w:val="32"/>
+          <w:lang w:val="en-US"/>
+        </w:rPr>
+      </w:pPr>
+      <w:bookmarkStart w:id="20" w:name="_Toc224758581"/>
+      <w:r>
+        <w:rPr>
+          <w:rFonts w:ascii="Calibri" w:eastAsia="Calibri" w:hAnsi="Calibri" w:cs="Calibri"/>
+          <w:b/>
+          <w:bCs/>
+          <w:color w:val="FF0000"/>
+          <w:sz w:val="32"/>
+          <w:szCs w:val="32"/>
+          <w:lang w:val="en-US"/>
+        </w:rPr>
+        <w:t>4</w:t>
+      </w:r>
+      <w:r>
+        <w:rPr>
+          <w:rFonts w:ascii="Calibri" w:eastAsia="Calibri" w:hAnsi="Calibri" w:cs="Calibri"/>
+          <w:b/>
+          <w:bCs/>
+          <w:color w:val="FF0000"/>
+          <w:sz w:val="32"/>
+          <w:szCs w:val="32"/>
+          <w:lang w:val="en-US"/>
+        </w:rPr>
+        <w:t>.</w:t>
+      </w:r>
+      <w:r>
+        <w:rPr>
+          <w:rFonts w:ascii="Calibri" w:eastAsia="Calibri" w:hAnsi="Calibri" w:cs="Calibri"/>
+          <w:b/>
+          <w:bCs/>
+          <w:color w:val="FF0000"/>
+          <w:sz w:val="32"/>
+          <w:szCs w:val="32"/>
+          <w:lang w:val="en-US"/>
+        </w:rPr>
+        <w:t>5</w:t>
+      </w:r>
+      <w:r>
+        <w:rPr>
+          <w:rFonts w:ascii="Calibri" w:eastAsia="Calibri" w:hAnsi="Calibri" w:cs="Calibri"/>
+          <w:b/>
+          <w:bCs/>
+          <w:color w:val="FF0000"/>
+          <w:sz w:val="32"/>
+          <w:szCs w:val="32"/>
+          <w:lang w:val="en-US"/>
+        </w:rPr>
+        <w:t xml:space="preserve"> </w:t>
+      </w:r>
+      <w:bookmarkEnd w:id="20"/>
+      <w:r>
+        <w:rPr>
+          <w:rFonts w:ascii="Calibri" w:eastAsia="Calibri" w:hAnsi="Calibri" w:cs="Calibri"/>
+          <w:b/>
+          <w:bCs/>
+          <w:color w:val="FF0000"/>
+          <w:sz w:val="32"/>
+          <w:szCs w:val="32"/>
+          <w:lang w:val="en-US"/>
+        </w:rPr>
+        <w:t>Meetings</w:t>
+      </w:r>
+    </w:p>
+    <w:p>
+      <w:pPr>
+        <w:rPr>
+          <w:lang w:val="en-US"/>
+        </w:rPr>
+      </w:pPr>
+    </w:p>
+    <w:p>
+      <w:pPr>
+        <w:jc w:val="right"/>
+        <w:rPr>
+          <w:color w:val="FF0000"/>
+          <w:lang w:val="en-US"/>
+        </w:rPr>
+      </w:pPr>
+      <w:r>
+        <w:rPr>
+          <w:color w:val="FF0000"/>
+          <w:lang w:val="en-US"/>
+        </w:rPr>
+        <w:t xml:space="preserve"> </w:t>
+      </w:r>
+      <w:r>
+        <w:rPr>
+          <w:color w:val="FF0000"/>
+          <w:lang w:val="en-US"/>
+        </w:rPr>
+        <w:t>(</w:t>
+      </w:r>
+      <w:r>
+        <w:rPr>
+          <w:color w:val="FF0000"/>
+          <w:lang w:val="en-US"/>
+        </w:rPr>
+        <w:t>DJ)</w:t>
+      </w:r>
+    </w:p>
+    <w:p>
+      <w:pPr>
+        <w:jc w:val="right"/>
+        <w:rPr>
+          <w:color w:val="FF0000"/>
+          <w:lang w:val="en-US"/>
+        </w:rPr>
+      </w:pPr>
+    </w:p>
+    <w:p>
+      <w:pPr>
+        <w:rPr>
+          <w:lang w:val="en-US"/>
+        </w:rPr>
+      </w:pPr>
+      <w:r>
+        <w:rPr>
+          <w:lang w:val="en-US"/>
+        </w:rPr>
+        <w:t>The aim is to meet at least once a week on Friday 1pm to 2pm</w:t>
+      </w:r>
+      <w:r>
+        <w:rPr>
+          <w:lang w:val="en-US"/>
+        </w:rPr>
+        <w:t xml:space="preserve"> to share progress on tasks and </w:t>
+      </w:r>
+      <w:proofErr w:type="spellStart"/>
+      <w:r>
+        <w:rPr>
+          <w:lang w:val="en-US"/>
+        </w:rPr>
+        <w:t>prioritise</w:t>
+      </w:r>
+      <w:proofErr w:type="spellEnd"/>
+      <w:r>
+        <w:rPr>
+          <w:lang w:val="en-US"/>
+        </w:rPr>
+        <w:t xml:space="preserve"> </w:t>
+      </w:r>
+      <w:proofErr w:type="gramStart"/>
+      <w:r>
+        <w:rPr>
+          <w:lang w:val="en-US"/>
+        </w:rPr>
+        <w:t>next</w:t>
+      </w:r>
+      <w:proofErr w:type="gramEnd"/>
+      <w:r>
+        <w:rPr>
+          <w:lang w:val="en-US"/>
+        </w:rPr>
+        <w:t xml:space="preserve"> steps. A</w:t>
+      </w:r>
+      <w:r>
+        <w:rPr>
+          <w:lang w:val="en-US"/>
+        </w:rPr>
+        <w:t xml:space="preserve"> second meeting slot </w:t>
+      </w:r>
+      <w:r>
+        <w:rPr>
+          <w:lang w:val="en-US"/>
+        </w:rPr>
+        <w:t xml:space="preserve">is </w:t>
+      </w:r>
+      <w:r>
+        <w:rPr>
+          <w:lang w:val="en-US"/>
+        </w:rPr>
+        <w:t>always reserved for support or emergencies on Tuesday 1pm to 2pm.</w:t>
+      </w:r>
+      <w:r>
+        <w:rPr>
+          <w:lang w:val="en-US"/>
+        </w:rPr>
+        <w:t xml:space="preserve"> The table will be updated </w:t>
+      </w:r>
+      <w:r>
+        <w:rPr>
+          <w:lang w:val="en-US"/>
+        </w:rPr>
+        <w:t>after every meeting</w:t>
+      </w:r>
+      <w:r>
+        <w:rPr>
+          <w:lang w:val="en-US"/>
+        </w:rPr>
+        <w:t xml:space="preserve"> until completion.</w:t>
+      </w:r>
+    </w:p>
+    <w:p>
+      <w:pPr>
+        <w:rPr>
+          <w:lang w:val="en-US"/>
+        </w:rPr>
+      </w:pPr>
+    </w:p>
+    <w:tbl>
+      <w:tblPr>
+        <w:tblStyle w:val="TableGrid"/>
+        <w:tblW w:w="9634" w:type="dxa"/>
+        <w:tblLayout w:type="fixed"/>
+        <w:tblLook w:val="04A0" w:firstRow="1" w:lastRow="0" w:firstColumn="1" w:lastColumn="0" w:noHBand="0" w:noVBand="1"/>
+      </w:tblPr>
+      <w:tblGrid>
+        <w:gridCol w:w="980"/>
+        <w:gridCol w:w="1567"/>
+        <w:gridCol w:w="1276"/>
+        <w:gridCol w:w="1500"/>
+        <w:gridCol w:w="4311"/>
+      </w:tblGrid>
+      <w:tr>
+        <w:tc>
+          <w:tcPr>
+            <w:tcW w:w="980" w:type="dxa"/>
+            <w:shd w:val="clear" w:color="auto" w:fill="EE0000"/>
+          </w:tcPr>
+          <w:p>
+            <w:pPr>
+              <w:jc w:val="center"/>
+              <w:rPr>
+                <w:b/>
+                <w:bCs/>
+                <w:color w:val="FFFFFF" w:themeColor="background1"/>
+                <w:lang w:val="en-US"/>
+              </w:rPr>
+            </w:pPr>
+            <w:r>
+              <w:rPr>
+                <w:b/>
+                <w:bCs/>
+                <w:color w:val="FFFFFF" w:themeColor="background1"/>
+                <w:lang w:val="en-US"/>
+              </w:rPr>
+              <w:t>Date</w:t>
+            </w:r>
+          </w:p>
+        </w:tc>
+        <w:tc>
+          <w:tcPr>
+            <w:tcW w:w="1567" w:type="dxa"/>
+            <w:shd w:val="clear" w:color="auto" w:fill="EE0000"/>
+          </w:tcPr>
+          <w:p>
+            <w:pPr>
+              <w:jc w:val="center"/>
+              <w:rPr>
+                <w:b/>
+                <w:bCs/>
+                <w:color w:val="FFFFFF" w:themeColor="background1"/>
+                <w:lang w:val="en-US"/>
+              </w:rPr>
+            </w:pPr>
+            <w:r>
+              <w:rPr>
+                <w:b/>
+                <w:bCs/>
+                <w:color w:val="FFFFFF" w:themeColor="background1"/>
+                <w:lang w:val="en-US"/>
+              </w:rPr>
+              <w:t>Time</w:t>
+            </w:r>
+          </w:p>
+        </w:tc>
+        <w:tc>
+          <w:tcPr>
+            <w:tcW w:w="1276" w:type="dxa"/>
+            <w:shd w:val="clear" w:color="auto" w:fill="EE0000"/>
+          </w:tcPr>
+          <w:p>
+            <w:pPr>
+              <w:jc w:val="center"/>
+              <w:rPr>
+                <w:b/>
+                <w:bCs/>
+                <w:color w:val="FFFFFF" w:themeColor="background1"/>
+                <w:lang w:val="en-US"/>
+              </w:rPr>
+            </w:pPr>
+            <w:r>
+              <w:rPr>
+                <w:b/>
+                <w:bCs/>
+                <w:color w:val="FFFFFF" w:themeColor="background1"/>
+                <w:lang w:val="en-US"/>
+              </w:rPr>
+              <w:t>Location</w:t>
+            </w:r>
+          </w:p>
+        </w:tc>
+        <w:tc>
+          <w:tcPr>
+            <w:tcW w:w="1500" w:type="dxa"/>
+            <w:shd w:val="clear" w:color="auto" w:fill="EE0000"/>
+          </w:tcPr>
+          <w:p>
+            <w:pPr>
+              <w:jc w:val="center"/>
+              <w:rPr>
+                <w:b/>
+                <w:bCs/>
+                <w:color w:val="FFFFFF" w:themeColor="background1"/>
+                <w:lang w:val="en-US"/>
+              </w:rPr>
+            </w:pPr>
+            <w:r>
+              <w:rPr>
+                <w:b/>
+                <w:bCs/>
+                <w:color w:val="FFFFFF" w:themeColor="background1"/>
+                <w:lang w:val="en-US"/>
+              </w:rPr>
+              <w:t>Attendance</w:t>
+            </w:r>
+          </w:p>
+        </w:tc>
+        <w:tc>
+          <w:tcPr>
+            <w:tcW w:w="4311" w:type="dxa"/>
+            <w:shd w:val="clear" w:color="auto" w:fill="EE0000"/>
+          </w:tcPr>
+          <w:p>
+            <w:pPr>
+              <w:jc w:val="center"/>
+              <w:rPr>
+                <w:b/>
+                <w:bCs/>
+                <w:color w:val="FFFFFF" w:themeColor="background1"/>
+                <w:lang w:val="en-US"/>
+              </w:rPr>
+            </w:pPr>
+            <w:r>
+              <w:rPr>
+                <w:b/>
+                <w:bCs/>
+                <w:color w:val="FFFFFF" w:themeColor="background1"/>
+                <w:lang w:val="en-US"/>
+              </w:rPr>
+              <w:t>Notes</w:t>
+            </w:r>
+          </w:p>
+        </w:tc>
+      </w:tr>
+      <w:tr>
+        <w:tc>
+          <w:tcPr>
+            <w:tcW w:w="980" w:type="dxa"/>
+          </w:tcPr>
+          <w:p>
+            <w:pPr>
+              <w:rPr>
+                <w:lang w:val="en-US"/>
+              </w:rPr>
+            </w:pPr>
+            <w:r>
+              <w:rPr>
+                <w:lang w:val="en-US"/>
+              </w:rPr>
+              <w:t>FRI 13/02</w:t>
+            </w:r>
+          </w:p>
+        </w:tc>
+        <w:tc>
+          <w:tcPr>
+            <w:tcW w:w="1567" w:type="dxa"/>
+          </w:tcPr>
+          <w:p>
+            <w:pPr>
+              <w:rPr>
+                <w:lang w:val="en-US"/>
+              </w:rPr>
+            </w:pPr>
+            <w:r>
+              <w:rPr>
+                <w:lang w:val="en-US"/>
+              </w:rPr>
+              <w:t>1pm - 2pm</w:t>
+            </w:r>
+          </w:p>
+        </w:tc>
+        <w:tc>
+          <w:tcPr>
+            <w:tcW w:w="1276" w:type="dxa"/>
+          </w:tcPr>
+          <w:p>
+            <w:pPr>
+              <w:rPr>
+                <w:lang w:val="en-US"/>
+              </w:rPr>
+            </w:pPr>
+            <w:r>
+              <w:rPr>
+                <w:lang w:val="en-US"/>
+              </w:rPr>
+              <w:t>Copland</w:t>
+            </w:r>
+          </w:p>
+        </w:tc>
+        <w:tc>
+          <w:tcPr>
+            <w:tcW w:w="1500" w:type="dxa"/>
+          </w:tcPr>
+          <w:p>
+            <w:pPr>
+              <w:rPr>
+                <w:lang w:val="en-US"/>
+              </w:rPr>
+            </w:pPr>
+            <w:r>
+              <w:rPr>
+                <w:lang w:val="en-US"/>
+              </w:rPr>
+              <w:t>AA, AI, CN, DJ</w:t>
+            </w:r>
+          </w:p>
+        </w:tc>
+        <w:tc>
+          <w:tcPr>
+            <w:tcW w:w="4311" w:type="dxa"/>
+          </w:tcPr>
+          <w:p>
+            <w:pPr>
+              <w:rPr>
+                <w:lang w:val="en-US"/>
+              </w:rPr>
+            </w:pPr>
+            <w:r>
+              <w:rPr>
+                <w:lang w:val="en-US"/>
+              </w:rPr>
+              <w:t>Discussing coursework</w:t>
+            </w:r>
+            <w:r>
+              <w:rPr>
+                <w:lang w:val="en-US"/>
+              </w:rPr>
+              <w:t>, availability, and shared/</w:t>
+            </w:r>
+            <w:proofErr w:type="spellStart"/>
+            <w:r>
+              <w:rPr>
+                <w:lang w:val="en-US"/>
+              </w:rPr>
+              <w:t>finalised</w:t>
+            </w:r>
+            <w:proofErr w:type="spellEnd"/>
+            <w:r>
+              <w:rPr>
+                <w:lang w:val="en-US"/>
+              </w:rPr>
+              <w:t xml:space="preserve"> set of interview questions</w:t>
+            </w:r>
+          </w:p>
+        </w:tc>
+      </w:tr>
+      <w:tr>
+        <w:tc>
+          <w:tcPr>
+            <w:tcW w:w="980" w:type="dxa"/>
+          </w:tcPr>
+          <w:p>
+            <w:pPr>
+              <w:rPr>
+                <w:lang w:val="en-US"/>
+              </w:rPr>
+            </w:pPr>
+            <w:r>
+              <w:rPr>
+                <w:lang w:val="en-US"/>
+              </w:rPr>
+              <w:t>FRI 20/02</w:t>
+            </w:r>
+          </w:p>
+        </w:tc>
+        <w:tc>
+          <w:tcPr>
+            <w:tcW w:w="1567" w:type="dxa"/>
+          </w:tcPr>
+          <w:p>
+            <w:pPr>
+              <w:rPr>
+                <w:lang w:val="en-US"/>
+              </w:rPr>
+            </w:pPr>
+            <w:r>
+              <w:rPr>
+                <w:lang w:val="en-US"/>
+              </w:rPr>
+              <w:t>1pm - 2pm</w:t>
+            </w:r>
+          </w:p>
+        </w:tc>
+        <w:tc>
+          <w:tcPr>
+            <w:tcW w:w="1276" w:type="dxa"/>
+          </w:tcPr>
+          <w:p>
+            <w:pPr>
+              <w:rPr>
+                <w:lang w:val="en-US"/>
+              </w:rPr>
+            </w:pPr>
+            <w:r>
+              <w:rPr>
+                <w:lang w:val="en-US"/>
+              </w:rPr>
+              <w:t>Copland</w:t>
+            </w:r>
+          </w:p>
+        </w:tc>
+        <w:tc>
+          <w:tcPr>
+            <w:tcW w:w="1500" w:type="dxa"/>
+          </w:tcPr>
+          <w:p>
+            <w:pPr>
+              <w:rPr>
+                <w:lang w:val="en-US"/>
+              </w:rPr>
+            </w:pPr>
+            <w:r>
+              <w:rPr>
+                <w:lang w:val="en-US"/>
+              </w:rPr>
+              <w:t>AA, AI, CN, DJ</w:t>
+            </w:r>
+          </w:p>
+        </w:tc>
+        <w:tc>
+          <w:tcPr>
+            <w:tcW w:w="4311" w:type="dxa"/>
+          </w:tcPr>
+          <w:p>
+            <w:pPr>
+              <w:rPr>
+                <w:lang w:val="en-US"/>
+              </w:rPr>
+            </w:pPr>
+            <w:r>
+              <w:rPr>
+                <w:lang w:val="en-US"/>
+              </w:rPr>
+              <w:t>Discussing potential datasets and approach</w:t>
+            </w:r>
+          </w:p>
+        </w:tc>
+      </w:tr>
+      <w:tr>
+        <w:tc>
+          <w:tcPr>
+            <w:tcW w:w="980" w:type="dxa"/>
+          </w:tcPr>
+          <w:p>
+            <w:pPr>
+              <w:rPr>
+                <w:lang w:val="en-US"/>
+              </w:rPr>
+            </w:pPr>
+            <w:r>
+              <w:rPr>
+                <w:lang w:val="en-US"/>
+              </w:rPr>
+              <w:t>FRI 27/02</w:t>
+            </w:r>
+          </w:p>
+        </w:tc>
+        <w:tc>
+          <w:tcPr>
+            <w:tcW w:w="1567" w:type="dxa"/>
+          </w:tcPr>
+          <w:p>
+            <w:pPr>
+              <w:rPr>
+                <w:lang w:val="en-US"/>
+              </w:rPr>
+            </w:pPr>
+            <w:r>
+              <w:rPr>
+                <w:lang w:val="en-US"/>
+              </w:rPr>
+              <w:t>1</w:t>
+            </w:r>
+            <w:r>
+              <w:rPr>
+                <w:lang w:val="en-US"/>
+              </w:rPr>
+              <w:t>2</w:t>
+            </w:r>
+            <w:r>
+              <w:rPr>
+                <w:lang w:val="en-US"/>
+              </w:rPr>
+              <w:t xml:space="preserve">pm - </w:t>
+            </w:r>
+            <w:r>
+              <w:rPr>
+                <w:lang w:val="en-US"/>
+              </w:rPr>
+              <w:t>3</w:t>
+            </w:r>
+            <w:r>
+              <w:rPr>
+                <w:lang w:val="en-US"/>
+              </w:rPr>
+              <w:t>pm</w:t>
+            </w:r>
+          </w:p>
+        </w:tc>
+        <w:tc>
+          <w:tcPr>
+            <w:tcW w:w="1276" w:type="dxa"/>
+          </w:tcPr>
+          <w:p>
+            <w:pPr>
+              <w:rPr>
+                <w:lang w:val="en-US"/>
+              </w:rPr>
+            </w:pPr>
+            <w:r>
+              <w:rPr>
+                <w:lang w:val="en-US"/>
+              </w:rPr>
+              <w:t>Online</w:t>
+            </w:r>
+          </w:p>
+        </w:tc>
+        <w:tc>
+          <w:tcPr>
+            <w:tcW w:w="1500" w:type="dxa"/>
+          </w:tcPr>
+          <w:p>
+            <w:pPr>
+              <w:rPr>
+                <w:lang w:val="en-US"/>
+              </w:rPr>
+            </w:pPr>
+            <w:r>
+              <w:rPr>
+                <w:lang w:val="en-US"/>
+              </w:rPr>
+              <w:t>AA, AI, CN, DJ</w:t>
+            </w:r>
+          </w:p>
+        </w:tc>
+        <w:tc>
+          <w:tcPr>
+            <w:tcW w:w="4311" w:type="dxa"/>
+          </w:tcPr>
+          <w:p>
+            <w:pPr>
+              <w:rPr>
+                <w:lang w:val="en-US"/>
+              </w:rPr>
+            </w:pPr>
+            <w:r>
+              <w:rPr>
+                <w:lang w:val="en-US"/>
+              </w:rPr>
+              <w:t xml:space="preserve">Finalizing </w:t>
+            </w:r>
+            <w:proofErr w:type="gramStart"/>
+            <w:r>
+              <w:rPr>
+                <w:lang w:val="en-US"/>
+              </w:rPr>
+              <w:t>expected</w:t>
+            </w:r>
+            <w:proofErr w:type="gramEnd"/>
+            <w:r>
+              <w:rPr>
+                <w:lang w:val="en-US"/>
+              </w:rPr>
+              <w:t xml:space="preserve"> approach, finalizing roles and sharing all findings so far</w:t>
+            </w:r>
+          </w:p>
+        </w:tc>
+      </w:tr>
+      <w:tr>
+        <w:tc>
+          <w:tcPr>
+            <w:tcW w:w="980" w:type="dxa"/>
+          </w:tcPr>
+          <w:p>
+            <w:pPr>
+              <w:rPr>
+                <w:lang w:val="en-US"/>
+              </w:rPr>
+            </w:pPr>
+            <w:r>
+              <w:rPr>
+                <w:lang w:val="en-US"/>
+              </w:rPr>
+              <w:t>FRI 06/03</w:t>
+            </w:r>
+          </w:p>
+        </w:tc>
+        <w:tc>
+          <w:tcPr>
+            <w:tcW w:w="1567" w:type="dxa"/>
+          </w:tcPr>
+          <w:p>
+            <w:pPr>
+              <w:rPr>
+                <w:lang w:val="en-US"/>
+              </w:rPr>
+            </w:pPr>
+            <w:r>
+              <w:rPr>
+                <w:lang w:val="en-US"/>
+              </w:rPr>
+              <w:t>1pm - 2pm</w:t>
+            </w:r>
+          </w:p>
+        </w:tc>
+        <w:tc>
+          <w:tcPr>
+            <w:tcW w:w="1276" w:type="dxa"/>
+          </w:tcPr>
+          <w:p>
+            <w:pPr>
+              <w:rPr>
+                <w:lang w:val="en-US"/>
+              </w:rPr>
+            </w:pPr>
+            <w:r>
+              <w:rPr>
+                <w:lang w:val="en-US"/>
+              </w:rPr>
+              <w:t>Cavendish</w:t>
+            </w:r>
+          </w:p>
+        </w:tc>
+        <w:tc>
+          <w:tcPr>
+            <w:tcW w:w="1500" w:type="dxa"/>
+          </w:tcPr>
+          <w:p>
+            <w:pPr>
+              <w:rPr>
+                <w:lang w:val="en-US"/>
+              </w:rPr>
+            </w:pPr>
+            <w:r>
+              <w:rPr>
+                <w:lang w:val="en-US"/>
+              </w:rPr>
+              <w:t>AA, AI, DJ</w:t>
+            </w:r>
+          </w:p>
+        </w:tc>
+        <w:tc>
+          <w:tcPr>
+            <w:tcW w:w="4311" w:type="dxa"/>
+          </w:tcPr>
+          <w:p>
+            <w:pPr>
+              <w:rPr>
+                <w:lang w:val="en-US"/>
+              </w:rPr>
+            </w:pPr>
+            <w:r>
+              <w:rPr>
+                <w:lang w:val="en-US"/>
+              </w:rPr>
+              <w:t>Progress on current tasks and issues</w:t>
+            </w:r>
+          </w:p>
+        </w:tc>
+      </w:tr>
+      <w:tr>
+        <w:tc>
+          <w:tcPr>
+            <w:tcW w:w="980" w:type="dxa"/>
+          </w:tcPr>
+          <w:p>
+            <w:pPr>
+              <w:rPr>
+                <w:lang w:val="en-US"/>
+              </w:rPr>
+            </w:pPr>
+            <w:r>
+              <w:rPr>
+                <w:lang w:val="en-US"/>
+              </w:rPr>
+              <w:t>TUE</w:t>
+            </w:r>
+          </w:p>
+          <w:p>
+            <w:pPr>
+              <w:rPr>
+                <w:lang w:val="en-US"/>
+              </w:rPr>
+            </w:pPr>
+            <w:r>
+              <w:rPr>
+                <w:lang w:val="en-US"/>
+              </w:rPr>
+              <w:t>10/03</w:t>
+            </w:r>
+          </w:p>
+        </w:tc>
+        <w:tc>
+          <w:tcPr>
+            <w:tcW w:w="1567" w:type="dxa"/>
+          </w:tcPr>
+          <w:p>
+            <w:pPr>
+              <w:rPr>
+                <w:lang w:val="en-US"/>
+              </w:rPr>
+            </w:pPr>
+            <w:r>
+              <w:rPr>
+                <w:lang w:val="en-US"/>
+              </w:rPr>
+              <w:t>1pm - 2pm</w:t>
+            </w:r>
+          </w:p>
+        </w:tc>
+        <w:tc>
+          <w:tcPr>
+            <w:tcW w:w="1276" w:type="dxa"/>
+          </w:tcPr>
+          <w:p>
+            <w:pPr>
+              <w:rPr>
+                <w:lang w:val="en-US"/>
+              </w:rPr>
+            </w:pPr>
+            <w:r>
+              <w:rPr>
+                <w:lang w:val="en-US"/>
+              </w:rPr>
+              <w:t>Copland</w:t>
+            </w:r>
+          </w:p>
+        </w:tc>
+        <w:tc>
+          <w:tcPr>
+            <w:tcW w:w="1500" w:type="dxa"/>
+          </w:tcPr>
+          <w:p>
+            <w:pPr>
+              <w:rPr>
+                <w:lang w:val="en-US"/>
+              </w:rPr>
+            </w:pPr>
+            <w:r>
+              <w:rPr>
+                <w:lang w:val="en-US"/>
+              </w:rPr>
+              <w:t>AA, AI, DJ</w:t>
+            </w:r>
+          </w:p>
+        </w:tc>
+        <w:tc>
+          <w:tcPr>
+            <w:tcW w:w="4311" w:type="dxa"/>
+          </w:tcPr>
+          <w:p>
+            <w:pPr>
+              <w:rPr>
+                <w:lang w:val="en-US"/>
+              </w:rPr>
+            </w:pPr>
+            <w:r>
+              <w:rPr>
+                <w:lang w:val="en-US"/>
+              </w:rPr>
+              <w:t>Progress on current tasks and issues</w:t>
+            </w:r>
+          </w:p>
+        </w:tc>
+      </w:tr>
+      <w:tr>
+        <w:tc>
+          <w:tcPr>
+            <w:tcW w:w="980" w:type="dxa"/>
+          </w:tcPr>
+          <w:p>
+            <w:pPr>
+              <w:rPr>
+                <w:lang w:val="en-US"/>
+              </w:rPr>
+            </w:pPr>
+            <w:r>
+              <w:rPr>
+                <w:lang w:val="en-US"/>
+              </w:rPr>
+              <w:t>FRI 13/03</w:t>
+            </w:r>
+          </w:p>
+        </w:tc>
+        <w:tc>
+          <w:tcPr>
+            <w:tcW w:w="1567" w:type="dxa"/>
+          </w:tcPr>
+          <w:p>
+            <w:pPr>
+              <w:rPr>
+                <w:lang w:val="en-US"/>
+              </w:rPr>
+            </w:pPr>
+            <w:r>
+              <w:rPr>
+                <w:lang w:val="en-US"/>
+              </w:rPr>
+              <w:t>1pm - 2pm</w:t>
+            </w:r>
+          </w:p>
+        </w:tc>
+        <w:tc>
+          <w:tcPr>
+            <w:tcW w:w="1276" w:type="dxa"/>
+          </w:tcPr>
+          <w:p>
+            <w:pPr>
+              <w:rPr>
+                <w:lang w:val="en-US"/>
+              </w:rPr>
+            </w:pPr>
+            <w:r>
+              <w:rPr>
+                <w:lang w:val="en-US"/>
+              </w:rPr>
+              <w:t>Copland</w:t>
+            </w:r>
+          </w:p>
+        </w:tc>
+        <w:tc>
+          <w:tcPr>
+            <w:tcW w:w="1500" w:type="dxa"/>
+          </w:tcPr>
+          <w:p>
+            <w:pPr>
+              <w:rPr>
+                <w:lang w:val="en-US"/>
+              </w:rPr>
+            </w:pPr>
+            <w:r>
+              <w:rPr>
+                <w:lang w:val="en-US"/>
+              </w:rPr>
+              <w:t>AA, AI, DJ</w:t>
+            </w:r>
+          </w:p>
+        </w:tc>
+        <w:tc>
+          <w:tcPr>
+            <w:tcW w:w="4311" w:type="dxa"/>
+          </w:tcPr>
+          <w:p>
+            <w:pPr>
+              <w:rPr>
+                <w:lang w:val="en-US"/>
+              </w:rPr>
+            </w:pPr>
+            <w:r>
+              <w:rPr>
+                <w:lang w:val="en-US"/>
+              </w:rPr>
+              <w:t>Progress on current tasks and issues</w:t>
+            </w:r>
+          </w:p>
+        </w:tc>
+      </w:tr>
+      <w:tr>
+        <w:tc>
+          <w:tcPr>
+            <w:tcW w:w="980" w:type="dxa"/>
+          </w:tcPr>
+          <w:p>
+            <w:pPr>
+              <w:rPr>
+                <w:lang w:val="en-US"/>
+              </w:rPr>
+            </w:pPr>
+            <w:r>
+              <w:rPr>
+                <w:lang w:val="en-US"/>
+              </w:rPr>
+              <w:t>WED 18/03</w:t>
+            </w:r>
+          </w:p>
+        </w:tc>
+        <w:tc>
+          <w:tcPr>
+            <w:tcW w:w="1567" w:type="dxa"/>
+          </w:tcPr>
+          <w:p>
+            <w:pPr>
+              <w:rPr>
+                <w:lang w:val="en-US"/>
+              </w:rPr>
+            </w:pPr>
+            <w:r>
+              <w:rPr>
+                <w:lang w:val="en-US"/>
+              </w:rPr>
+              <w:t>11pm - 12pm</w:t>
+            </w:r>
+          </w:p>
+        </w:tc>
+        <w:tc>
+          <w:tcPr>
+            <w:tcW w:w="1276" w:type="dxa"/>
+          </w:tcPr>
+          <w:p>
+            <w:pPr>
+              <w:rPr>
+                <w:lang w:val="en-US"/>
+              </w:rPr>
+            </w:pPr>
+            <w:r>
+              <w:rPr>
+                <w:lang w:val="en-US"/>
+              </w:rPr>
+              <w:t>Online</w:t>
+            </w:r>
+          </w:p>
+        </w:tc>
+        <w:tc>
+          <w:tcPr>
+            <w:tcW w:w="1500" w:type="dxa"/>
+          </w:tcPr>
+          <w:p>
+            <w:pPr>
+              <w:rPr>
+                <w:lang w:val="en-US"/>
+              </w:rPr>
+            </w:pPr>
+            <w:r>
+              <w:rPr>
+                <w:lang w:val="en-US"/>
+              </w:rPr>
+              <w:t>CN, DJ</w:t>
+            </w:r>
+          </w:p>
+        </w:tc>
+        <w:tc>
+          <w:tcPr>
+            <w:tcW w:w="4311" w:type="dxa"/>
+          </w:tcPr>
+          <w:p>
+            <w:pPr>
+              <w:rPr>
+                <w:lang w:val="en-US"/>
+              </w:rPr>
+            </w:pPr>
+            <w:r>
+              <w:rPr>
+                <w:lang w:val="en-US"/>
+              </w:rPr>
+              <w:t xml:space="preserve">Update on tasks and emergency meeting on HSP </w:t>
+            </w:r>
+            <w:r>
+              <w:rPr>
+                <w:lang w:val="en-US"/>
+              </w:rPr>
+              <w:t>API</w:t>
+            </w:r>
+            <w:r>
+              <w:rPr>
+                <w:lang w:val="en-US"/>
+              </w:rPr>
+              <w:t xml:space="preserve"> no longer </w:t>
+            </w:r>
+            <w:r>
+              <w:rPr>
+                <w:lang w:val="en-US"/>
+              </w:rPr>
+              <w:t xml:space="preserve">returning </w:t>
+            </w:r>
+            <w:r>
+              <w:rPr>
+                <w:lang w:val="en-US"/>
+              </w:rPr>
+              <w:t>data</w:t>
+            </w:r>
+            <w:r>
+              <w:rPr>
+                <w:lang w:val="en-US"/>
+              </w:rPr>
+              <w:t xml:space="preserve"> prior to 2026</w:t>
+            </w:r>
+            <w:r>
+              <w:rPr>
+                <w:lang w:val="en-US"/>
+              </w:rPr>
+              <w:t xml:space="preserve">. </w:t>
+            </w:r>
+            <w:r>
+              <w:rPr>
+                <w:lang w:val="en-US"/>
+              </w:rPr>
+              <w:t>Therefore,</w:t>
+            </w:r>
+            <w:r>
+              <w:rPr>
+                <w:lang w:val="en-US"/>
+              </w:rPr>
+              <w:t xml:space="preserve"> no further data collection possible.</w:t>
+            </w:r>
+          </w:p>
+        </w:tc>
+      </w:tr>
+      <w:tr>
+        <w:tc>
+          <w:tcPr>
+            <w:tcW w:w="980" w:type="dxa"/>
+          </w:tcPr>
+          <w:p>
+            <w:pPr>
+              <w:rPr>
+                <w:lang w:val="en-US"/>
+              </w:rPr>
+            </w:pPr>
+          </w:p>
+        </w:tc>
+        <w:tc>
+          <w:tcPr>
+            <w:tcW w:w="1567" w:type="dxa"/>
+          </w:tcPr>
+          <w:p>
+            <w:pPr>
+              <w:rPr>
+                <w:lang w:val="en-US"/>
+              </w:rPr>
+            </w:pPr>
+          </w:p>
+        </w:tc>
+        <w:tc>
+          <w:tcPr>
+            <w:tcW w:w="1276" w:type="dxa"/>
+          </w:tcPr>
+          <w:p>
+            <w:pPr>
+              <w:rPr>
+                <w:lang w:val="en-US"/>
+              </w:rPr>
+            </w:pPr>
+          </w:p>
+        </w:tc>
+        <w:tc>
+          <w:tcPr>
+            <w:tcW w:w="1500" w:type="dxa"/>
+          </w:tcPr>
+          <w:p>
+            <w:pPr>
+              <w:rPr>
+                <w:lang w:val="en-US"/>
+              </w:rPr>
+            </w:pPr>
+          </w:p>
+        </w:tc>
+        <w:tc>
+          <w:tcPr>
+            <w:tcW w:w="4311" w:type="dxa"/>
+          </w:tcPr>
+          <w:p>
+            <w:pPr>
+              <w:rPr>
+                <w:lang w:val="en-US"/>
+              </w:rPr>
+            </w:pPr>
+          </w:p>
+        </w:tc>
+      </w:tr>
+    </w:tbl>
+    <w:p>
+      <w:pPr>
+        <w:rPr>
+          <w:lang w:val="en-US"/>
+        </w:rPr>
+      </w:pPr>
+    </w:p>
+    <w:p>
+      <w:pPr>
+        <w:spacing w:line="278" w:lineRule="auto"/>
+        <w:rPr>
+          <w:b/>
+          <w:bCs/>
+          <w:color w:val="FF0000"/>
+          <w:sz w:val="36"/>
+          <w:szCs w:val="36"/>
+          <w:lang w:val="en-US"/>
+        </w:rPr>
+      </w:pPr>
+    </w:p>
+    <w:p>
+      <w:pPr>
+        <w:spacing w:line="278" w:lineRule="auto"/>
+        <w:rPr>
+          <w:b/>
+          <w:bCs/>
+          <w:color w:val="FF0000"/>
+          <w:sz w:val="36"/>
+          <w:szCs w:val="36"/>
+          <w:lang w:val="en-US"/>
+        </w:rPr>
+      </w:pPr>
+      <w:bookmarkStart w:id="21" w:name="_Toc224758582"/>
       <w:r>
         <w:rPr>
           <w:b/>
@@ -13405,6 +15951,7 @@
         </w:rPr>
         <w:t>Data Acquisition</w:t>
       </w:r>
+      <w:bookmarkEnd w:id="21"/>
     </w:p>
     <w:p>
       <w:pPr>
@@ -13458,6 +16005,7 @@
           <w:lang w:val="en-US"/>
         </w:rPr>
       </w:pPr>
+      <w:bookmarkStart w:id="22" w:name="_Toc224758583"/>
       <w:r>
         <w:rPr>
           <w:rFonts w:ascii="Calibri" w:eastAsia="Calibri" w:hAnsi="Calibri" w:cs="Calibri"/>
@@ -13495,6 +16043,7 @@
         </w:rPr>
         <w:t>Exploratory Data Analysis</w:t>
       </w:r>
+      <w:bookmarkEnd w:id="22"/>
     </w:p>
     <w:p>
       <w:pPr>
@@ -13525,6 +16074,7 @@
           <w:lang w:val="en-US"/>
         </w:rPr>
       </w:pPr>
+      <w:bookmarkStart w:id="23" w:name="_Toc224758584"/>
       <w:r>
         <w:rPr>
           <w:rFonts w:ascii="Calibri" w:eastAsia="Calibri" w:hAnsi="Calibri" w:cs="Calibri"/>
@@ -13585,6 +16135,7 @@
         </w:rPr>
         <w:t>Which segments suffer the most delays?</w:t>
       </w:r>
+      <w:bookmarkEnd w:id="23"/>
     </w:p>
     <w:p>
       <w:pPr>
@@ -13721,6 +16272,7 @@
       </w:pPr>
       <w:r>
         <w:rPr>
+          <w:noProof/>
           <w:lang w:val="en-US"/>
         </w:rPr>
         <w:drawing>
@@ -15233,6 +17785,7 @@
     <w:p>
       <w:pPr>
         <w:sectPr>
+          <w:footerReference w:type="default" r:id="rId16"/>
           <w:pgSz w:w="11910" w:h="16845" w:code="9"/>
           <w:pgMar w:top="1440" w:right="1440" w:bottom="1440" w:left="1440" w:header="720" w:footer="720" w:gutter="0"/>
           <w:cols w:space="720"/>
@@ -15251,7 +17804,7 @@
           <w:szCs w:val="36"/>
         </w:rPr>
       </w:pPr>
-      <w:bookmarkStart w:id="20" w:name="_Toc224748103"/>
+      <w:bookmarkStart w:id="24" w:name="_Toc224758585"/>
       <w:r>
         <w:rPr>
           <w:b/>
@@ -15263,7 +17816,7 @@
         <w:lastRenderedPageBreak/>
         <w:t>References</w:t>
       </w:r>
-      <w:bookmarkEnd w:id="20"/>
+      <w:bookmarkEnd w:id="24"/>
     </w:p>
     <w:p/>
     <w:p>
@@ -15282,10 +17835,7 @@
         <w:t xml:space="preserve"> (20</w:t>
       </w:r>
       <w:r>
-        <w:t>2</w:t>
-      </w:r>
-      <w:r>
-        <w:t>4</w:t>
+        <w:t>24</w:t>
       </w:r>
       <w:r>
         <w:t>) ‘</w:t>
@@ -15301,7 +17851,7 @@
       </w:r>
     </w:p>
     <w:p>
-      <w:hyperlink r:id="rId16" w:history="1">
+      <w:hyperlink r:id="rId17" w:history="1">
         <w:r>
           <w:rPr>
             <w:rStyle w:val="Hyperlink"/>
@@ -15318,10 +17868,7 @@
         <w:t xml:space="preserve">(Accessed: </w:t>
       </w:r>
       <w:r>
-        <w:t>1</w:t>
-      </w:r>
-      <w:r>
-        <w:t>8</w:t>
+        <w:t>18</w:t>
       </w:r>
       <w:r>
         <w:t xml:space="preserve"> </w:t>
@@ -15362,7 +17909,7 @@
       <w:r>
         <w:t xml:space="preserve">. Available at: </w:t>
       </w:r>
-      <w:hyperlink r:id="rId17" w:anchor="RSPS2xxx" w:history="1">
+      <w:hyperlink r:id="rId18" w:anchor="RSPS2xxx" w:history="1">
         <w:r>
           <w:rPr>
             <w:rStyle w:val="Hyperlink"/>
@@ -15417,7 +17964,7 @@
       <w:r>
         <w:t xml:space="preserve">. Available at: </w:t>
       </w:r>
-      <w:hyperlink r:id="rId18" w:history="1">
+      <w:hyperlink r:id="rId19" w:history="1">
         <w:r>
           <w:rPr>
             <w:rStyle w:val="Hyperlink"/>
@@ -15478,7 +18025,7 @@
       <w:r>
         <w:t xml:space="preserve">. Available at: </w:t>
       </w:r>
-      <w:hyperlink r:id="rId19" w:history="1">
+      <w:hyperlink r:id="rId20" w:history="1">
         <w:r>
           <w:rPr>
             <w:rStyle w:val="Hyperlink"/>
@@ -15541,7 +18088,7 @@
       <w:r>
         <w:t xml:space="preserve"> </w:t>
       </w:r>
-      <w:hyperlink r:id="rId20" w:history="1">
+      <w:hyperlink r:id="rId21" w:history="1">
         <w:r>
           <w:rPr>
             <w:rStyle w:val="Hyperlink"/>
@@ -15606,7 +18153,7 @@
       <w:r>
         <w:t xml:space="preserve"> Available at: </w:t>
       </w:r>
-      <w:hyperlink r:id="rId21" w:history="1">
+      <w:hyperlink r:id="rId22" w:history="1">
         <w:r>
           <w:rPr>
             <w:rStyle w:val="Hyperlink"/>
@@ -15671,7 +18218,7 @@
       <w:r>
         <w:t xml:space="preserve"> Available at: </w:t>
       </w:r>
-      <w:hyperlink r:id="rId22" w:history="1">
+      <w:hyperlink r:id="rId23" w:history="1">
         <w:r>
           <w:rPr>
             <w:rStyle w:val="Hyperlink"/>
@@ -15729,7 +18276,7 @@
       <w:r>
         <w:t xml:space="preserve"> Available at: </w:t>
       </w:r>
-      <w:hyperlink r:id="rId23" w:history="1">
+      <w:hyperlink r:id="rId24" w:history="1">
         <w:r>
           <w:rPr>
             <w:rStyle w:val="Hyperlink"/>
@@ -15791,7 +18338,7 @@
       <w:r>
         <w:t xml:space="preserve"> Available at: </w:t>
       </w:r>
-      <w:hyperlink r:id="rId24" w:history="1">
+      <w:hyperlink r:id="rId25" w:history="1">
         <w:r>
           <w:rPr>
             <w:rStyle w:val="Hyperlink"/>
@@ -15854,7 +18401,7 @@
       <w:r>
         <w:t xml:space="preserve"> Available at: </w:t>
       </w:r>
-      <w:hyperlink r:id="rId25" w:history="1">
+      <w:hyperlink r:id="rId26" w:history="1">
         <w:r>
           <w:rPr>
             <w:rStyle w:val="Hyperlink"/>
@@ -15912,7 +18459,7 @@
       </w:pPr>
     </w:p>
     <w:sectPr>
-      <w:footerReference w:type="default" r:id="rId26"/>
+      <w:footerReference w:type="default" r:id="rId27"/>
       <w:pgSz w:w="11910" w:h="16845" w:code="9"/>
       <w:pgMar w:top="1440" w:right="1440" w:bottom="1440" w:left="1440" w:header="720" w:footer="720" w:gutter="0"/>
       <w:cols w:space="720"/>
@@ -16024,6 +18571,20 @@
         <w:color w:val="EE0000"/>
       </w:rPr>
     </w:pPr>
+  </w:p>
+</w:ftr>
+</file>
+
+<file path=word/footer3.xml><?xml version="1.0" encoding="utf-8"?>
+<w:ftr xmlns:wpc="http://schemas.microsoft.com/office/word/2010/wordprocessingCanvas" xmlns:cx="http://schemas.microsoft.com/office/drawing/2014/chartex" xmlns:cx1="http://schemas.microsoft.com/office/drawing/2015/9/8/chartex" xmlns:cx2="http://schemas.microsoft.com/office/drawing/2015/10/21/chartex" xmlns:cx3="http://schemas.microsoft.com/office/drawing/2016/5/9/chartex" xmlns:cx4="http://schemas.microsoft.com/office/drawing/2016/5/10/chartex" xmlns:cx5="http://schemas.microsoft.com/office/drawing/2016/5/11/chartex" xmlns:cx6="http://schemas.microsoft.com/office/drawing/2016/5/12/chartex" xmlns:cx7="http://schemas.microsoft.com/office/drawing/2016/5/13/chartex" xmlns:cx8="http://schemas.microsoft.com/office/drawing/2016/5/14/chartex" xmlns:mc="http://schemas.openxmlformats.org/markup-compatibility/2006" xmlns:aink="http://schemas.microsoft.com/office/drawing/2016/ink" xmlns:am3d="http://schemas.microsoft.com/office/drawing/2017/model3d" xmlns:o="urn:schemas-microsoft-com:office:office" xmlns:oel="http://schemas.microsoft.com/office/2019/extlst" xmlns:r="http://schemas.openxmlformats.org/officeDocument/2006/relationships" xmlns:m="http://schemas.openxmlformats.org/officeDocument/2006/math" xmlns:v="urn:schemas-microsoft-com:vml" xmlns:wp14="http://schemas.microsoft.com/office/word/2010/wordprocessingDrawing" xmlns:wp="http://schemas.openxmlformats.org/drawingml/2006/wordprocessingDrawing" xmlns:w10="urn:schemas-microsoft-com:office:word" xmlns:w="http://schemas.openxmlformats.org/wordprocessingml/2006/main" xmlns:w14="http://schemas.microsoft.com/office/word/2010/wordml" xmlns:w15="http://schemas.microsoft.com/office/word/2012/wordml" xmlns:w16cex="http://schemas.microsoft.com/office/word/2018/wordml/cex" xmlns:w16cid="http://schemas.microsoft.com/office/word/2016/wordml/cid" xmlns:w16="http://schemas.microsoft.com/office/word/2018/wordml" xmlns:w16du="http://schemas.microsoft.com/office/word/2023/wordml/word16du" xmlns:w16sdtdh="http://schemas.microsoft.com/office/word/2020/wordml/sdtdatahash" xmlns:w16sdtfl="http://schemas.microsoft.com/office/word/2024/wordml/sdtformatlock" xmlns:w16se="http://schemas.microsoft.com/office/word/2015/wordml/symex" xmlns:wpg="http://schemas.microsoft.com/office/word/2010/wordprocessingGroup" xmlns:wpi="http://schemas.microsoft.com/office/word/2010/wordprocessingInk" xmlns:wne="http://schemas.microsoft.com/office/word/2006/wordml" xmlns:wps="http://schemas.microsoft.com/office/word/2010/wordprocessingShape" mc:Ignorable="w14 w15 w16se w16cid w16 w16cex w16sdtdh w16sdtfl w16du wp14">
+  <w:p>
+    <w:pPr>
+      <w:pStyle w:val="Footer"/>
+      <w:jc w:val="center"/>
+      <w:rPr>
+        <w:color w:val="EE0000"/>
+      </w:rPr>
+    </w:pPr>
     <w:r>
       <w:rPr>
         <w:color w:val="EE0000"/>
@@ -16047,7 +18608,7 @@
         <w:noProof/>
         <w:color w:val="EE0000"/>
       </w:rPr>
-      <w:t>4. Project Planning</w:t>
+      <w:t>6. Exploratory Data Analysis</w:t>
     </w:r>
     <w:r>
       <w:rPr>
@@ -16059,7 +18620,7 @@
 </w:ftr>
 </file>
 
-<file path=word/footer3.xml><?xml version="1.0" encoding="utf-8"?>
+<file path=word/footer4.xml><?xml version="1.0" encoding="utf-8"?>
 <w:ftr xmlns:wpc="http://schemas.microsoft.com/office/word/2010/wordprocessingCanvas" xmlns:cx="http://schemas.microsoft.com/office/drawing/2014/chartex" xmlns:cx1="http://schemas.microsoft.com/office/drawing/2015/9/8/chartex" xmlns:cx2="http://schemas.microsoft.com/office/drawing/2015/10/21/chartex" xmlns:cx3="http://schemas.microsoft.com/office/drawing/2016/5/9/chartex" xmlns:cx4="http://schemas.microsoft.com/office/drawing/2016/5/10/chartex" xmlns:cx5="http://schemas.microsoft.com/office/drawing/2016/5/11/chartex" xmlns:cx6="http://schemas.microsoft.com/office/drawing/2016/5/12/chartex" xmlns:cx7="http://schemas.microsoft.com/office/drawing/2016/5/13/chartex" xmlns:cx8="http://schemas.microsoft.com/office/drawing/2016/5/14/chartex" xmlns:mc="http://schemas.openxmlformats.org/markup-compatibility/2006" xmlns:aink="http://schemas.microsoft.com/office/drawing/2016/ink" xmlns:am3d="http://schemas.microsoft.com/office/drawing/2017/model3d" xmlns:o="urn:schemas-microsoft-com:office:office" xmlns:oel="http://schemas.microsoft.com/office/2019/extlst" xmlns:r="http://schemas.openxmlformats.org/officeDocument/2006/relationships" xmlns:m="http://schemas.openxmlformats.org/officeDocument/2006/math" xmlns:v="urn:schemas-microsoft-com:vml" xmlns:wp14="http://schemas.microsoft.com/office/word/2010/wordprocessingDrawing" xmlns:wp="http://schemas.openxmlformats.org/drawingml/2006/wordprocessingDrawing" xmlns:w10="urn:schemas-microsoft-com:office:word" xmlns:w="http://schemas.openxmlformats.org/wordprocessingml/2006/main" xmlns:w14="http://schemas.microsoft.com/office/word/2010/wordml" xmlns:w15="http://schemas.microsoft.com/office/word/2012/wordml" xmlns:w16cex="http://schemas.microsoft.com/office/word/2018/wordml/cex" xmlns:w16cid="http://schemas.microsoft.com/office/word/2016/wordml/cid" xmlns:w16="http://schemas.microsoft.com/office/word/2018/wordml" xmlns:w16du="http://schemas.microsoft.com/office/word/2023/wordml/word16du" xmlns:w16sdtdh="http://schemas.microsoft.com/office/word/2020/wordml/sdtdatahash" xmlns:w16sdtfl="http://schemas.microsoft.com/office/word/2024/wordml/sdtformatlock" xmlns:w16se="http://schemas.microsoft.com/office/word/2015/wordml/symex" xmlns:wpg="http://schemas.microsoft.com/office/word/2010/wordprocessingGroup" xmlns:wpi="http://schemas.microsoft.com/office/word/2010/wordprocessingInk" xmlns:wne="http://schemas.microsoft.com/office/word/2006/wordml" xmlns:wps="http://schemas.microsoft.com/office/word/2010/wordprocessingShape" mc:Ignorable="w14 w15 w16se w16cid w16 w16cex w16sdtdh w16sdtfl w16du wp14">
   <w:p>
     <w:pPr>
@@ -26271,6 +28832,119 @@
     </w:lvl>
   </w:abstractNum>
   <w:abstractNum w:abstractNumId="83" w15:restartNumberingAfterBreak="0">
+    <w:nsid w:val="77705265"/>
+    <w:multiLevelType w:val="hybridMultilevel"/>
+    <w:tmpl w:val="5EF2E432"/>
+    <w:lvl w:ilvl="0" w:tplc="08090001">
+      <w:start w:val="1"/>
+      <w:numFmt w:val="bullet"/>
+      <w:lvlText w:val=""/>
+      <w:lvlJc w:val="left"/>
+      <w:pPr>
+        <w:ind w:left="720" w:hanging="360"/>
+      </w:pPr>
+      <w:rPr>
+        <w:rFonts w:ascii="Symbol" w:hAnsi="Symbol" w:hint="default"/>
+      </w:rPr>
+    </w:lvl>
+    <w:lvl w:ilvl="1" w:tplc="08090003" w:tentative="1">
+      <w:start w:val="1"/>
+      <w:numFmt w:val="bullet"/>
+      <w:lvlText w:val="o"/>
+      <w:lvlJc w:val="left"/>
+      <w:pPr>
+        <w:ind w:left="1440" w:hanging="360"/>
+      </w:pPr>
+      <w:rPr>
+        <w:rFonts w:ascii="Courier New" w:hAnsi="Courier New" w:cs="Courier New" w:hint="default"/>
+      </w:rPr>
+    </w:lvl>
+    <w:lvl w:ilvl="2" w:tplc="08090005" w:tentative="1">
+      <w:start w:val="1"/>
+      <w:numFmt w:val="bullet"/>
+      <w:lvlText w:val=""/>
+      <w:lvlJc w:val="left"/>
+      <w:pPr>
+        <w:ind w:left="2160" w:hanging="360"/>
+      </w:pPr>
+      <w:rPr>
+        <w:rFonts w:ascii="Wingdings" w:hAnsi="Wingdings" w:hint="default"/>
+      </w:rPr>
+    </w:lvl>
+    <w:lvl w:ilvl="3" w:tplc="08090001" w:tentative="1">
+      <w:start w:val="1"/>
+      <w:numFmt w:val="bullet"/>
+      <w:lvlText w:val=""/>
+      <w:lvlJc w:val="left"/>
+      <w:pPr>
+        <w:ind w:left="2880" w:hanging="360"/>
+      </w:pPr>
+      <w:rPr>
+        <w:rFonts w:ascii="Symbol" w:hAnsi="Symbol" w:hint="default"/>
+      </w:rPr>
+    </w:lvl>
+    <w:lvl w:ilvl="4" w:tplc="08090003" w:tentative="1">
+      <w:start w:val="1"/>
+      <w:numFmt w:val="bullet"/>
+      <w:lvlText w:val="o"/>
+      <w:lvlJc w:val="left"/>
+      <w:pPr>
+        <w:ind w:left="3600" w:hanging="360"/>
+      </w:pPr>
+      <w:rPr>
+        <w:rFonts w:ascii="Courier New" w:hAnsi="Courier New" w:cs="Courier New" w:hint="default"/>
+      </w:rPr>
+    </w:lvl>
+    <w:lvl w:ilvl="5" w:tplc="08090005" w:tentative="1">
+      <w:start w:val="1"/>
+      <w:numFmt w:val="bullet"/>
+      <w:lvlText w:val=""/>
+      <w:lvlJc w:val="left"/>
+      <w:pPr>
+        <w:ind w:left="4320" w:hanging="360"/>
+      </w:pPr>
+      <w:rPr>
+        <w:rFonts w:ascii="Wingdings" w:hAnsi="Wingdings" w:hint="default"/>
+      </w:rPr>
+    </w:lvl>
+    <w:lvl w:ilvl="6" w:tplc="08090001" w:tentative="1">
+      <w:start w:val="1"/>
+      <w:numFmt w:val="bullet"/>
+      <w:lvlText w:val=""/>
+      <w:lvlJc w:val="left"/>
+      <w:pPr>
+        <w:ind w:left="5040" w:hanging="360"/>
+      </w:pPr>
+      <w:rPr>
+        <w:rFonts w:ascii="Symbol" w:hAnsi="Symbol" w:hint="default"/>
+      </w:rPr>
+    </w:lvl>
+    <w:lvl w:ilvl="7" w:tplc="08090003" w:tentative="1">
+      <w:start w:val="1"/>
+      <w:numFmt w:val="bullet"/>
+      <w:lvlText w:val="o"/>
+      <w:lvlJc w:val="left"/>
+      <w:pPr>
+        <w:ind w:left="5760" w:hanging="360"/>
+      </w:pPr>
+      <w:rPr>
+        <w:rFonts w:ascii="Courier New" w:hAnsi="Courier New" w:cs="Courier New" w:hint="default"/>
+      </w:rPr>
+    </w:lvl>
+    <w:lvl w:ilvl="8" w:tplc="08090005" w:tentative="1">
+      <w:start w:val="1"/>
+      <w:numFmt w:val="bullet"/>
+      <w:lvlText w:val=""/>
+      <w:lvlJc w:val="left"/>
+      <w:pPr>
+        <w:ind w:left="6480" w:hanging="360"/>
+      </w:pPr>
+      <w:rPr>
+        <w:rFonts w:ascii="Wingdings" w:hAnsi="Wingdings" w:hint="default"/>
+      </w:rPr>
+    </w:lvl>
+  </w:abstractNum>
+  <w:abstractNum w:abstractNumId="84" w15:restartNumberingAfterBreak="0">
     <w:nsid w:val="77CBEFDA"/>
     <w:multiLevelType w:val="hybridMultilevel"/>
     <w:tmpl w:val="AE3A67FC"/>
@@ -26383,7 +29057,7 @@
       </w:rPr>
     </w:lvl>
   </w:abstractNum>
-  <w:abstractNum w:abstractNumId="84" w15:restartNumberingAfterBreak="0">
+  <w:abstractNum w:abstractNumId="85" w15:restartNumberingAfterBreak="0">
     <w:nsid w:val="78966063"/>
     <w:multiLevelType w:val="hybridMultilevel"/>
     <w:tmpl w:val="B340121A"/>
@@ -26496,7 +29170,120 @@
       </w:rPr>
     </w:lvl>
   </w:abstractNum>
-  <w:abstractNum w:abstractNumId="85" w15:restartNumberingAfterBreak="0">
+  <w:abstractNum w:abstractNumId="86" w15:restartNumberingAfterBreak="0">
+    <w:nsid w:val="78A81FD6"/>
+    <w:multiLevelType w:val="hybridMultilevel"/>
+    <w:tmpl w:val="2DA0D6F6"/>
+    <w:lvl w:ilvl="0" w:tplc="08090001">
+      <w:start w:val="1"/>
+      <w:numFmt w:val="bullet"/>
+      <w:lvlText w:val=""/>
+      <w:lvlJc w:val="left"/>
+      <w:pPr>
+        <w:ind w:left="720" w:hanging="360"/>
+      </w:pPr>
+      <w:rPr>
+        <w:rFonts w:ascii="Symbol" w:hAnsi="Symbol" w:hint="default"/>
+      </w:rPr>
+    </w:lvl>
+    <w:lvl w:ilvl="1" w:tplc="08090003" w:tentative="1">
+      <w:start w:val="1"/>
+      <w:numFmt w:val="bullet"/>
+      <w:lvlText w:val="o"/>
+      <w:lvlJc w:val="left"/>
+      <w:pPr>
+        <w:ind w:left="1440" w:hanging="360"/>
+      </w:pPr>
+      <w:rPr>
+        <w:rFonts w:ascii="Courier New" w:hAnsi="Courier New" w:cs="Courier New" w:hint="default"/>
+      </w:rPr>
+    </w:lvl>
+    <w:lvl w:ilvl="2" w:tplc="08090005" w:tentative="1">
+      <w:start w:val="1"/>
+      <w:numFmt w:val="bullet"/>
+      <w:lvlText w:val=""/>
+      <w:lvlJc w:val="left"/>
+      <w:pPr>
+        <w:ind w:left="2160" w:hanging="360"/>
+      </w:pPr>
+      <w:rPr>
+        <w:rFonts w:ascii="Wingdings" w:hAnsi="Wingdings" w:hint="default"/>
+      </w:rPr>
+    </w:lvl>
+    <w:lvl w:ilvl="3" w:tplc="08090001" w:tentative="1">
+      <w:start w:val="1"/>
+      <w:numFmt w:val="bullet"/>
+      <w:lvlText w:val=""/>
+      <w:lvlJc w:val="left"/>
+      <w:pPr>
+        <w:ind w:left="2880" w:hanging="360"/>
+      </w:pPr>
+      <w:rPr>
+        <w:rFonts w:ascii="Symbol" w:hAnsi="Symbol" w:hint="default"/>
+      </w:rPr>
+    </w:lvl>
+    <w:lvl w:ilvl="4" w:tplc="08090003" w:tentative="1">
+      <w:start w:val="1"/>
+      <w:numFmt w:val="bullet"/>
+      <w:lvlText w:val="o"/>
+      <w:lvlJc w:val="left"/>
+      <w:pPr>
+        <w:ind w:left="3600" w:hanging="360"/>
+      </w:pPr>
+      <w:rPr>
+        <w:rFonts w:ascii="Courier New" w:hAnsi="Courier New" w:cs="Courier New" w:hint="default"/>
+      </w:rPr>
+    </w:lvl>
+    <w:lvl w:ilvl="5" w:tplc="08090005" w:tentative="1">
+      <w:start w:val="1"/>
+      <w:numFmt w:val="bullet"/>
+      <w:lvlText w:val=""/>
+      <w:lvlJc w:val="left"/>
+      <w:pPr>
+        <w:ind w:left="4320" w:hanging="360"/>
+      </w:pPr>
+      <w:rPr>
+        <w:rFonts w:ascii="Wingdings" w:hAnsi="Wingdings" w:hint="default"/>
+      </w:rPr>
+    </w:lvl>
+    <w:lvl w:ilvl="6" w:tplc="08090001" w:tentative="1">
+      <w:start w:val="1"/>
+      <w:numFmt w:val="bullet"/>
+      <w:lvlText w:val=""/>
+      <w:lvlJc w:val="left"/>
+      <w:pPr>
+        <w:ind w:left="5040" w:hanging="360"/>
+      </w:pPr>
+      <w:rPr>
+        <w:rFonts w:ascii="Symbol" w:hAnsi="Symbol" w:hint="default"/>
+      </w:rPr>
+    </w:lvl>
+    <w:lvl w:ilvl="7" w:tplc="08090003" w:tentative="1">
+      <w:start w:val="1"/>
+      <w:numFmt w:val="bullet"/>
+      <w:lvlText w:val="o"/>
+      <w:lvlJc w:val="left"/>
+      <w:pPr>
+        <w:ind w:left="5760" w:hanging="360"/>
+      </w:pPr>
+      <w:rPr>
+        <w:rFonts w:ascii="Courier New" w:hAnsi="Courier New" w:cs="Courier New" w:hint="default"/>
+      </w:rPr>
+    </w:lvl>
+    <w:lvl w:ilvl="8" w:tplc="08090005" w:tentative="1">
+      <w:start w:val="1"/>
+      <w:numFmt w:val="bullet"/>
+      <w:lvlText w:val=""/>
+      <w:lvlJc w:val="left"/>
+      <w:pPr>
+        <w:ind w:left="6480" w:hanging="360"/>
+      </w:pPr>
+      <w:rPr>
+        <w:rFonts w:ascii="Wingdings" w:hAnsi="Wingdings" w:hint="default"/>
+      </w:rPr>
+    </w:lvl>
+  </w:abstractNum>
+  <w:abstractNum w:abstractNumId="87" w15:restartNumberingAfterBreak="0">
     <w:nsid w:val="78EC5727"/>
     <w:multiLevelType w:val="hybridMultilevel"/>
     <w:tmpl w:val="9636389C"/>
@@ -26609,7 +29396,7 @@
       </w:rPr>
     </w:lvl>
   </w:abstractNum>
-  <w:abstractNum w:abstractNumId="86" w15:restartNumberingAfterBreak="0">
+  <w:abstractNum w:abstractNumId="88" w15:restartNumberingAfterBreak="0">
     <w:nsid w:val="7ABD66B2"/>
     <w:multiLevelType w:val="multilevel"/>
     <w:tmpl w:val="31247EFC"/>
@@ -26758,7 +29545,7 @@
       </w:rPr>
     </w:lvl>
   </w:abstractNum>
-  <w:abstractNum w:abstractNumId="87" w15:restartNumberingAfterBreak="0">
+  <w:abstractNum w:abstractNumId="89" w15:restartNumberingAfterBreak="0">
     <w:nsid w:val="7AF30E87"/>
     <w:multiLevelType w:val="multilevel"/>
     <w:tmpl w:val="ED6625C8"/>
@@ -26871,7 +29658,7 @@
       </w:rPr>
     </w:lvl>
   </w:abstractNum>
-  <w:abstractNum w:abstractNumId="88" w15:restartNumberingAfterBreak="0">
+  <w:abstractNum w:abstractNumId="90" w15:restartNumberingAfterBreak="0">
     <w:nsid w:val="7B390011"/>
     <w:multiLevelType w:val="hybridMultilevel"/>
     <w:tmpl w:val="A740ECC2"/>
@@ -26962,7 +29749,7 @@
       </w:pPr>
     </w:lvl>
   </w:abstractNum>
-  <w:abstractNum w:abstractNumId="89" w15:restartNumberingAfterBreak="0">
+  <w:abstractNum w:abstractNumId="91" w15:restartNumberingAfterBreak="0">
     <w:nsid w:val="7DD80B4E"/>
     <w:multiLevelType w:val="hybridMultilevel"/>
     <w:tmpl w:val="E2B850E8"/>
@@ -27051,7 +29838,120 @@
       </w:pPr>
     </w:lvl>
   </w:abstractNum>
-  <w:abstractNum w:abstractNumId="90" w15:restartNumberingAfterBreak="0">
+  <w:abstractNum w:abstractNumId="92" w15:restartNumberingAfterBreak="0">
+    <w:nsid w:val="7DE76B0E"/>
+    <w:multiLevelType w:val="hybridMultilevel"/>
+    <w:tmpl w:val="AD6A4DB8"/>
+    <w:lvl w:ilvl="0" w:tplc="08090001">
+      <w:start w:val="1"/>
+      <w:numFmt w:val="bullet"/>
+      <w:lvlText w:val=""/>
+      <w:lvlJc w:val="left"/>
+      <w:pPr>
+        <w:ind w:left="720" w:hanging="360"/>
+      </w:pPr>
+      <w:rPr>
+        <w:rFonts w:ascii="Symbol" w:hAnsi="Symbol" w:hint="default"/>
+      </w:rPr>
+    </w:lvl>
+    <w:lvl w:ilvl="1" w:tplc="08090003" w:tentative="1">
+      <w:start w:val="1"/>
+      <w:numFmt w:val="bullet"/>
+      <w:lvlText w:val="o"/>
+      <w:lvlJc w:val="left"/>
+      <w:pPr>
+        <w:ind w:left="1440" w:hanging="360"/>
+      </w:pPr>
+      <w:rPr>
+        <w:rFonts w:ascii="Courier New" w:hAnsi="Courier New" w:cs="Courier New" w:hint="default"/>
+      </w:rPr>
+    </w:lvl>
+    <w:lvl w:ilvl="2" w:tplc="08090005" w:tentative="1">
+      <w:start w:val="1"/>
+      <w:numFmt w:val="bullet"/>
+      <w:lvlText w:val=""/>
+      <w:lvlJc w:val="left"/>
+      <w:pPr>
+        <w:ind w:left="2160" w:hanging="360"/>
+      </w:pPr>
+      <w:rPr>
+        <w:rFonts w:ascii="Wingdings" w:hAnsi="Wingdings" w:hint="default"/>
+      </w:rPr>
+    </w:lvl>
+    <w:lvl w:ilvl="3" w:tplc="08090001" w:tentative="1">
+      <w:start w:val="1"/>
+      <w:numFmt w:val="bullet"/>
+      <w:lvlText w:val=""/>
+      <w:lvlJc w:val="left"/>
+      <w:pPr>
+        <w:ind w:left="2880" w:hanging="360"/>
+      </w:pPr>
+      <w:rPr>
+        <w:rFonts w:ascii="Symbol" w:hAnsi="Symbol" w:hint="default"/>
+      </w:rPr>
+    </w:lvl>
+    <w:lvl w:ilvl="4" w:tplc="08090003" w:tentative="1">
+      <w:start w:val="1"/>
+      <w:numFmt w:val="bullet"/>
+      <w:lvlText w:val="o"/>
+      <w:lvlJc w:val="left"/>
+      <w:pPr>
+        <w:ind w:left="3600" w:hanging="360"/>
+      </w:pPr>
+      <w:rPr>
+        <w:rFonts w:ascii="Courier New" w:hAnsi="Courier New" w:cs="Courier New" w:hint="default"/>
+      </w:rPr>
+    </w:lvl>
+    <w:lvl w:ilvl="5" w:tplc="08090005" w:tentative="1">
+      <w:start w:val="1"/>
+      <w:numFmt w:val="bullet"/>
+      <w:lvlText w:val=""/>
+      <w:lvlJc w:val="left"/>
+      <w:pPr>
+        <w:ind w:left="4320" w:hanging="360"/>
+      </w:pPr>
+      <w:rPr>
+        <w:rFonts w:ascii="Wingdings" w:hAnsi="Wingdings" w:hint="default"/>
+      </w:rPr>
+    </w:lvl>
+    <w:lvl w:ilvl="6" w:tplc="08090001" w:tentative="1">
+      <w:start w:val="1"/>
+      <w:numFmt w:val="bullet"/>
+      <w:lvlText w:val=""/>
+      <w:lvlJc w:val="left"/>
+      <w:pPr>
+        <w:ind w:left="5040" w:hanging="360"/>
+      </w:pPr>
+      <w:rPr>
+        <w:rFonts w:ascii="Symbol" w:hAnsi="Symbol" w:hint="default"/>
+      </w:rPr>
+    </w:lvl>
+    <w:lvl w:ilvl="7" w:tplc="08090003" w:tentative="1">
+      <w:start w:val="1"/>
+      <w:numFmt w:val="bullet"/>
+      <w:lvlText w:val="o"/>
+      <w:lvlJc w:val="left"/>
+      <w:pPr>
+        <w:ind w:left="5760" w:hanging="360"/>
+      </w:pPr>
+      <w:rPr>
+        <w:rFonts w:ascii="Courier New" w:hAnsi="Courier New" w:cs="Courier New" w:hint="default"/>
+      </w:rPr>
+    </w:lvl>
+    <w:lvl w:ilvl="8" w:tplc="08090005" w:tentative="1">
+      <w:start w:val="1"/>
+      <w:numFmt w:val="bullet"/>
+      <w:lvlText w:val=""/>
+      <w:lvlJc w:val="left"/>
+      <w:pPr>
+        <w:ind w:left="6480" w:hanging="360"/>
+      </w:pPr>
+      <w:rPr>
+        <w:rFonts w:ascii="Wingdings" w:hAnsi="Wingdings" w:hint="default"/>
+      </w:rPr>
+    </w:lvl>
+  </w:abstractNum>
+  <w:abstractNum w:abstractNumId="93" w15:restartNumberingAfterBreak="0">
     <w:nsid w:val="7E05583E"/>
     <w:multiLevelType w:val="hybridMultilevel"/>
     <w:tmpl w:val="0AF26BEA"/>
@@ -27153,7 +30053,7 @@
     <w:abstractNumId w:val="60"/>
   </w:num>
   <w:num w:numId="5" w16cid:durableId="1095707733">
-    <w:abstractNumId w:val="83"/>
+    <w:abstractNumId w:val="84"/>
   </w:num>
   <w:num w:numId="6" w16cid:durableId="1317613538">
     <w:abstractNumId w:val="9"/>
@@ -27219,7 +30119,7 @@
     <w:abstractNumId w:val="40"/>
   </w:num>
   <w:num w:numId="27" w16cid:durableId="819419714">
-    <w:abstractNumId w:val="88"/>
+    <w:abstractNumId w:val="90"/>
   </w:num>
   <w:num w:numId="28" w16cid:durableId="1428771071">
     <w:abstractNumId w:val="73"/>
@@ -27231,7 +30131,7 @@
     <w:abstractNumId w:val="67"/>
   </w:num>
   <w:num w:numId="31" w16cid:durableId="416945747">
-    <w:abstractNumId w:val="89"/>
+    <w:abstractNumId w:val="91"/>
   </w:num>
   <w:num w:numId="32" w16cid:durableId="212549494">
     <w:abstractNumId w:val="28"/>
@@ -27261,7 +30161,7 @@
     <w:abstractNumId w:val="46"/>
   </w:num>
   <w:num w:numId="41" w16cid:durableId="2069837660">
-    <w:abstractNumId w:val="85"/>
+    <w:abstractNumId w:val="87"/>
   </w:num>
   <w:num w:numId="42" w16cid:durableId="1741058663">
     <w:abstractNumId w:val="30"/>
@@ -27318,10 +30218,10 @@
     <w:abstractNumId w:val="7"/>
   </w:num>
   <w:num w:numId="60" w16cid:durableId="2012489549">
-    <w:abstractNumId w:val="84"/>
+    <w:abstractNumId w:val="85"/>
   </w:num>
   <w:num w:numId="61" w16cid:durableId="2051613998">
-    <w:abstractNumId w:val="86"/>
+    <w:abstractNumId w:val="88"/>
   </w:num>
   <w:num w:numId="62" w16cid:durableId="1505129018">
     <w:abstractNumId w:val="20"/>
@@ -27405,13 +30305,22 @@
     <w:abstractNumId w:val="54"/>
   </w:num>
   <w:num w:numId="89" w16cid:durableId="378286860">
-    <w:abstractNumId w:val="90"/>
+    <w:abstractNumId w:val="93"/>
   </w:num>
   <w:num w:numId="90" w16cid:durableId="1476527848">
     <w:abstractNumId w:val="36"/>
   </w:num>
   <w:num w:numId="91" w16cid:durableId="1725986862">
-    <w:abstractNumId w:val="87"/>
+    <w:abstractNumId w:val="89"/>
+  </w:num>
+  <w:num w:numId="92" w16cid:durableId="1832981901">
+    <w:abstractNumId w:val="86"/>
+  </w:num>
+  <w:num w:numId="93" w16cid:durableId="1618442824">
+    <w:abstractNumId w:val="92"/>
+  </w:num>
+  <w:num w:numId="94" w16cid:durableId="1825775086">
+    <w:abstractNumId w:val="83"/>
   </w:num>
 </w:numbering>
 </file>
@@ -27816,7 +30725,7 @@
   <w:style w:type="paragraph" w:default="1" w:styleId="Normal">
     <w:name w:val="Normal"/>
     <w:qFormat/>
-    <w:rsid w:val="003E01CB"/>
+    <w:rsid w:val="00CD4F7F"/>
     <w:pPr>
       <w:spacing w:line="259" w:lineRule="auto"/>
     </w:pPr>

</xml_diff>

<commit_message>
w2046713 (AA) added more visualisations
</commit_message>
<xml_diff>
--- a/LNER Disruption Prediction report.docx
+++ b/LNER Disruption Prediction report.docx
@@ -9373,23 +9373,7 @@
           <w:szCs w:val="18"/>
           <w:lang w:val="en-US"/>
         </w:rPr>
-        <w:t xml:space="preserve">Each role has been assigned a </w:t>
-      </w:r>
-      <w:proofErr w:type="spellStart"/>
-      <w:r>
-        <w:rPr>
-          <w:szCs w:val="18"/>
-          <w:lang w:val="en-US"/>
-        </w:rPr>
-        <w:t>colour</w:t>
-      </w:r>
-      <w:proofErr w:type="spellEnd"/>
-      <w:r>
-        <w:rPr>
-          <w:szCs w:val="18"/>
-          <w:lang w:val="en-US"/>
-        </w:rPr>
-        <w:t xml:space="preserve"> and will be used to identify the primary role responsible for a specific task</w:t>
+        <w:t>Each role has been assigned a colour and will be used to identify the primary role responsible for a specific task</w:t>
       </w:r>
     </w:p>
     <w:p>
@@ -14067,6 +14051,7 @@
         <w:rPr>
           <w:b/>
           <w:bCs/>
+          <w:noProof/>
           <w:color w:val="4F81BD"/>
           <w:sz w:val="24"/>
         </w:rPr>
@@ -14676,15 +14661,7 @@
           <w:p/>
           <w:p>
             <w:r>
-              <w:t xml:space="preserve">Use </w:t>
-            </w:r>
-            <w:proofErr w:type="spellStart"/>
-            <w:r>
-              <w:t>GridSearch</w:t>
-            </w:r>
-            <w:proofErr w:type="spellEnd"/>
-            <w:r>
-              <w:t xml:space="preserve"> to tune hyperparameters or make use of ensemble learning.</w:t>
+              <w:t>Use GridSearch to tune hyperparameters or make use of ensemble learning.</w:t>
             </w:r>
           </w:p>
         </w:tc>
@@ -14993,21 +14970,7 @@
         <w:rPr>
           <w:lang w:val="en-US"/>
         </w:rPr>
-        <w:t xml:space="preserve"> to share progress on tasks and </w:t>
-      </w:r>
-      <w:proofErr w:type="spellStart"/>
-      <w:r>
-        <w:rPr>
-          <w:lang w:val="en-US"/>
-        </w:rPr>
-        <w:t>prioritise</w:t>
-      </w:r>
-      <w:proofErr w:type="spellEnd"/>
-      <w:r>
-        <w:rPr>
-          <w:lang w:val="en-US"/>
-        </w:rPr>
-        <w:t xml:space="preserve"> next steps. A</w:t>
+        <w:t xml:space="preserve"> to share progress on tasks and prioritise next steps. A</w:t>
       </w:r>
       <w:r>
         <w:rPr>
@@ -15292,21 +15255,7 @@
               <w:rPr>
                 <w:lang w:val="en-US"/>
               </w:rPr>
-              <w:t>, availability, and shared/</w:t>
-            </w:r>
-            <w:proofErr w:type="spellStart"/>
-            <w:r>
-              <w:rPr>
-                <w:lang w:val="en-US"/>
-              </w:rPr>
-              <w:t>finalised</w:t>
-            </w:r>
-            <w:proofErr w:type="spellEnd"/>
-            <w:r>
-              <w:rPr>
-                <w:lang w:val="en-US"/>
-              </w:rPr>
-              <w:t xml:space="preserve"> set of interview questions</w:t>
+              <w:t>, availability, and shared/finalised set of interview questions</w:t>
             </w:r>
           </w:p>
         </w:tc>
@@ -15436,31 +15385,7 @@
               <w:rPr>
                 <w:lang w:val="en-US"/>
               </w:rPr>
-              <w:t>1</w:t>
-            </w:r>
-            <w:r>
-              <w:rPr>
-                <w:lang w:val="en-US"/>
-              </w:rPr>
-              <w:t>2</w:t>
-            </w:r>
-            <w:r>
-              <w:rPr>
-                <w:lang w:val="en-US"/>
-              </w:rPr>
-              <w:t xml:space="preserve">pm - </w:t>
-            </w:r>
-            <w:r>
-              <w:rPr>
-                <w:lang w:val="en-US"/>
-              </w:rPr>
-              <w:t>3</w:t>
-            </w:r>
-            <w:r>
-              <w:rPr>
-                <w:lang w:val="en-US"/>
-              </w:rPr>
-              <w:t>pm</w:t>
+              <w:t>12pm - 3pm</w:t>
             </w:r>
           </w:p>
         </w:tc>
@@ -16234,76 +16159,26 @@
         <w:rPr>
           <w:lang w:val="en-US"/>
         </w:rPr>
-        <w:t xml:space="preserve">As outlined in 2.4, many different sources for data were considered, however we decided use the Historical Service Performance (HSP) </w:t>
-      </w:r>
-      <w:proofErr w:type="spellStart"/>
-      <w:r>
-        <w:rPr>
-          <w:lang w:val="en-US"/>
-        </w:rPr>
-        <w:t>api</w:t>
-      </w:r>
-      <w:proofErr w:type="spellEnd"/>
-      <w:r>
-        <w:rPr>
-          <w:lang w:val="en-US"/>
-        </w:rPr>
-        <w:t xml:space="preserve"> for train data and Open-</w:t>
-      </w:r>
-      <w:proofErr w:type="spellStart"/>
-      <w:r>
-        <w:rPr>
-          <w:lang w:val="en-US"/>
-        </w:rPr>
-        <w:t>Meteo</w:t>
-      </w:r>
-      <w:proofErr w:type="spellEnd"/>
-      <w:r>
-        <w:rPr>
-          <w:lang w:val="en-US"/>
-        </w:rPr>
-        <w:t xml:space="preserve"> for weather data. At the time of writing this, HSP data prior to 2026 potentially may have been wiped, so the data collected so far will be the only data available to use for now.</w:t>
-      </w:r>
-    </w:p>
-    <w:p>
-      <w:pPr>
-        <w:rPr>
-          <w:lang w:val="en-US"/>
-        </w:rPr>
-      </w:pPr>
-      <w:r>
-        <w:rPr>
-          <w:lang w:val="en-US"/>
-        </w:rPr>
-        <w:t xml:space="preserve">Documentation on the HSP </w:t>
-      </w:r>
-      <w:proofErr w:type="spellStart"/>
-      <w:r>
-        <w:rPr>
-          <w:lang w:val="en-US"/>
-        </w:rPr>
-        <w:t>api</w:t>
-      </w:r>
-      <w:proofErr w:type="spellEnd"/>
-      <w:r>
-        <w:rPr>
-          <w:lang w:val="en-US"/>
-        </w:rPr>
-        <w:t xml:space="preserve"> and Open-</w:t>
-      </w:r>
-      <w:proofErr w:type="spellStart"/>
-      <w:r>
-        <w:rPr>
-          <w:lang w:val="en-US"/>
-        </w:rPr>
-        <w:t>Meteo</w:t>
-      </w:r>
-      <w:proofErr w:type="spellEnd"/>
-      <w:r>
-        <w:rPr>
-          <w:lang w:val="en-US"/>
-        </w:rPr>
-        <w:t xml:space="preserve"> are available in the references which can be used to see the body of requests and responses.</w:t>
+        <w:t>As outlined in 2.4, many different sources for data were considered, however we decided use the Historical Service Performance (HSP) api for train data and Open-Meteo for weather data. At the time of writing this, HSP data prior to 2026 potentially may have been wiped, so the data collected so far will be the only data available to use for now.</w:t>
+      </w:r>
+      <w:r>
+        <w:rPr>
+          <w:lang w:val="en-US"/>
+        </w:rPr>
+        <w:t xml:space="preserve"> The dataset obtained is already cleaned with the only missing values being for the column providing a late or cancellation reason which is classic case of Missing Not at Random (MNAR).</w:t>
+      </w:r>
+    </w:p>
+    <w:p>
+      <w:pPr>
+        <w:rPr>
+          <w:lang w:val="en-US"/>
+        </w:rPr>
+      </w:pPr>
+      <w:r>
+        <w:rPr>
+          <w:lang w:val="en-US"/>
+        </w:rPr>
+        <w:t>Documentation on the HSP api and Open-Meteo are available in the references which can be used to see the body of requests and responses.</w:t>
       </w:r>
     </w:p>
     <w:p>
@@ -16453,21 +16328,7 @@
         <w:rPr>
           <w:lang w:val="en-US"/>
         </w:rPr>
-        <w:t xml:space="preserve">Using the service metrics </w:t>
-      </w:r>
-      <w:proofErr w:type="spellStart"/>
-      <w:r>
-        <w:rPr>
-          <w:lang w:val="en-US"/>
-        </w:rPr>
-        <w:t>api</w:t>
-      </w:r>
-      <w:proofErr w:type="spellEnd"/>
-      <w:r>
-        <w:rPr>
-          <w:lang w:val="en-US"/>
-        </w:rPr>
-        <w:t xml:space="preserve">, we can query trains that have a specific origin and destination between a time and date. The response </w:t>
+        <w:t xml:space="preserve">Using the service metrics api, we can query trains that have a specific origin and destination between a time and date. The response </w:t>
       </w:r>
       <w:r>
         <w:rPr>
@@ -16508,10 +16369,11 @@
       </w:pPr>
       <w:r>
         <w:rPr>
+          <w:noProof/>
           <w:lang w:val="en-US"/>
         </w:rPr>
         <w:drawing>
-          <wp:anchor distT="0" distB="0" distL="114300" distR="114300" simplePos="0" relativeHeight="251776001" behindDoc="0" locked="0" layoutInCell="1" allowOverlap="1" wp14:anchorId="2CAF93DA" wp14:editId="7BE51750">
+          <wp:anchor distT="0" distB="0" distL="114300" distR="114300" simplePos="0" relativeHeight="251776001" behindDoc="0" locked="0" layoutInCell="1" allowOverlap="1" wp14:anchorId="2CAF93DA" wp14:editId="54512E1A">
             <wp:simplePos x="0" y="0"/>
             <wp:positionH relativeFrom="margin">
               <wp:align>center</wp:align>
@@ -16580,66 +16442,53 @@
         <w:rPr>
           <w:lang w:val="en-US"/>
         </w:rPr>
-        <w:t xml:space="preserve">We wrote a function that would make this process easier and automatic and can be explored further by examining the </w:t>
-      </w:r>
-      <w:proofErr w:type="spellStart"/>
-      <w:r>
-        <w:rPr>
-          <w:lang w:val="en-US"/>
-        </w:rPr>
-        <w:t>ipynb</w:t>
-      </w:r>
-      <w:proofErr w:type="spellEnd"/>
-      <w:r>
-        <w:rPr>
-          <w:lang w:val="en-US"/>
-        </w:rPr>
-        <w:t xml:space="preserve"> notebook.</w:t>
-      </w:r>
-    </w:p>
-    <w:p>
-      <w:pPr>
-        <w:rPr>
-          <w:lang w:val="en-US"/>
-        </w:rPr>
-      </w:pPr>
-    </w:p>
-    <w:p>
-      <w:pPr>
-        <w:rPr>
-          <w:lang w:val="en-US"/>
-        </w:rPr>
-      </w:pPr>
-    </w:p>
-    <w:p>
-      <w:pPr>
-        <w:rPr>
-          <w:lang w:val="en-US"/>
-        </w:rPr>
-      </w:pPr>
-    </w:p>
-    <w:p>
-      <w:pPr>
-        <w:rPr>
-          <w:lang w:val="en-US"/>
-        </w:rPr>
-      </w:pPr>
-    </w:p>
-    <w:p>
-      <w:pPr>
-        <w:rPr>
-          <w:lang w:val="en-US"/>
-        </w:rPr>
-      </w:pPr>
-    </w:p>
-    <w:p>
-      <w:pPr>
-        <w:rPr>
-          <w:lang w:val="en-US"/>
-        </w:rPr>
-      </w:pPr>
-      <w:r>
-        <w:rPr>
+        <w:t>We wrote a function that would make this process easier and automatic and can be explored further by examining the ipynb notebook.</w:t>
+      </w:r>
+    </w:p>
+    <w:p>
+      <w:pPr>
+        <w:rPr>
+          <w:lang w:val="en-US"/>
+        </w:rPr>
+      </w:pPr>
+    </w:p>
+    <w:p>
+      <w:pPr>
+        <w:rPr>
+          <w:lang w:val="en-US"/>
+        </w:rPr>
+      </w:pPr>
+    </w:p>
+    <w:p>
+      <w:pPr>
+        <w:rPr>
+          <w:lang w:val="en-US"/>
+        </w:rPr>
+      </w:pPr>
+    </w:p>
+    <w:p>
+      <w:pPr>
+        <w:rPr>
+          <w:lang w:val="en-US"/>
+        </w:rPr>
+      </w:pPr>
+    </w:p>
+    <w:p>
+      <w:pPr>
+        <w:rPr>
+          <w:lang w:val="en-US"/>
+        </w:rPr>
+      </w:pPr>
+    </w:p>
+    <w:p>
+      <w:pPr>
+        <w:rPr>
+          <w:lang w:val="en-US"/>
+        </w:rPr>
+      </w:pPr>
+      <w:r>
+        <w:rPr>
+          <w:noProof/>
           <w:lang w:val="en-US"/>
         </w:rPr>
         <w:drawing>
@@ -16734,6 +16583,7 @@
         <w:rPr>
           <w:lang w:val="en-US"/>
         </w:rPr>
+        <w:lastRenderedPageBreak/>
         <w:br w:type="page"/>
       </w:r>
     </w:p>
@@ -16812,49 +16662,37 @@
           <w:szCs w:val="32"/>
           <w:lang w:val="en-US"/>
         </w:rPr>
-        <w:t xml:space="preserve">HSP Service </w:t>
-      </w:r>
-      <w:r>
-        <w:rPr>
-          <w:rFonts w:ascii="Calibri" w:eastAsia="Calibri" w:hAnsi="Calibri" w:cs="Calibri"/>
-          <w:b/>
-          <w:bCs/>
+        <w:t>HSP Service Details</w:t>
+      </w:r>
+      <w:bookmarkEnd w:id="22"/>
+    </w:p>
+    <w:p>
+      <w:pPr>
+        <w:rPr>
+          <w:lang w:val="en-US"/>
+        </w:rPr>
+      </w:pPr>
+    </w:p>
+    <w:p>
+      <w:pPr>
+        <w:jc w:val="right"/>
+        <w:rPr>
           <w:color w:val="FF0000"/>
-          <w:sz w:val="32"/>
-          <w:szCs w:val="32"/>
-          <w:lang w:val="en-US"/>
-        </w:rPr>
-        <w:t>Details</w:t>
-      </w:r>
-      <w:bookmarkEnd w:id="22"/>
-    </w:p>
-    <w:p>
-      <w:pPr>
-        <w:rPr>
-          <w:lang w:val="en-US"/>
-        </w:rPr>
-      </w:pPr>
-    </w:p>
-    <w:p>
-      <w:pPr>
-        <w:jc w:val="right"/>
+          <w:lang w:val="en-US"/>
+        </w:rPr>
+      </w:pPr>
+      <w:r>
         <w:rPr>
           <w:color w:val="FF0000"/>
           <w:lang w:val="en-US"/>
         </w:rPr>
-      </w:pPr>
+        <w:t>(</w:t>
+      </w:r>
       <w:r>
         <w:rPr>
           <w:color w:val="FF0000"/>
           <w:lang w:val="en-US"/>
         </w:rPr>
-        <w:t>(</w:t>
-      </w:r>
-      <w:r>
-        <w:rPr>
-          <w:color w:val="FF0000"/>
-          <w:lang w:val="en-US"/>
-        </w:rPr>
         <w:t>DJ)</w:t>
       </w:r>
     </w:p>
@@ -16894,21 +16732,7 @@
         <w:rPr>
           <w:lang w:val="en-US"/>
         </w:rPr>
-        <w:t xml:space="preserve"> whereas responses for 2025 are used to create a pandas </w:t>
-      </w:r>
-      <w:proofErr w:type="spellStart"/>
-      <w:r>
-        <w:rPr>
-          <w:lang w:val="en-US"/>
-        </w:rPr>
-        <w:t>dataframe</w:t>
-      </w:r>
-      <w:proofErr w:type="spellEnd"/>
-      <w:r>
-        <w:rPr>
-          <w:lang w:val="en-US"/>
-        </w:rPr>
-        <w:t xml:space="preserve"> where we split every journey into segments (where each row is the information between its departure from the last station and arrival at the next station). </w:t>
+        <w:t xml:space="preserve"> whereas responses for 2025 are used to create a pandas dataframe where we split every journey into segments (where each row is the information between its departure from the last station and arrival at the next station). </w:t>
       </w:r>
     </w:p>
     <w:p>
@@ -16932,6 +16756,7 @@
       </w:pPr>
       <w:r>
         <w:rPr>
+          <w:noProof/>
           <w:lang w:val="en-US"/>
         </w:rPr>
         <w:drawing>
@@ -17043,6 +16868,7 @@
       </w:pPr>
       <w:r>
         <w:rPr>
+          <w:noProof/>
           <w:lang w:val="en-US"/>
         </w:rPr>
         <w:drawing>
@@ -17219,51 +17045,37 @@
           <w:szCs w:val="32"/>
           <w:lang w:val="en-US"/>
         </w:rPr>
-        <w:t>Weather Data – Open-</w:t>
-      </w:r>
-      <w:proofErr w:type="spellStart"/>
-      <w:r>
-        <w:rPr>
-          <w:rFonts w:ascii="Calibri" w:eastAsia="Calibri" w:hAnsi="Calibri" w:cs="Calibri"/>
-          <w:b/>
-          <w:bCs/>
+        <w:t>Weather Data – Open-Meteo</w:t>
+      </w:r>
+      <w:bookmarkEnd w:id="23"/>
+    </w:p>
+    <w:p>
+      <w:pPr>
+        <w:rPr>
+          <w:lang w:val="en-US"/>
+        </w:rPr>
+      </w:pPr>
+    </w:p>
+    <w:p>
+      <w:pPr>
+        <w:jc w:val="right"/>
+        <w:rPr>
           <w:color w:val="FF0000"/>
-          <w:sz w:val="32"/>
-          <w:szCs w:val="32"/>
-          <w:lang w:val="en-US"/>
-        </w:rPr>
-        <w:t>Meteo</w:t>
-      </w:r>
-      <w:bookmarkEnd w:id="23"/>
-      <w:proofErr w:type="spellEnd"/>
-    </w:p>
-    <w:p>
-      <w:pPr>
-        <w:rPr>
-          <w:lang w:val="en-US"/>
-        </w:rPr>
-      </w:pPr>
-    </w:p>
-    <w:p>
-      <w:pPr>
-        <w:jc w:val="right"/>
+          <w:lang w:val="en-US"/>
+        </w:rPr>
+      </w:pPr>
+      <w:r>
         <w:rPr>
           <w:color w:val="FF0000"/>
           <w:lang w:val="en-US"/>
         </w:rPr>
-      </w:pPr>
+        <w:t>(</w:t>
+      </w:r>
       <w:r>
         <w:rPr>
           <w:color w:val="FF0000"/>
           <w:lang w:val="en-US"/>
         </w:rPr>
-        <w:t>(</w:t>
-      </w:r>
-      <w:r>
-        <w:rPr>
-          <w:color w:val="FF0000"/>
-          <w:lang w:val="en-US"/>
-        </w:rPr>
         <w:t>DJ)</w:t>
       </w:r>
     </w:p>
@@ -17288,6 +17100,7 @@
       </w:pPr>
       <w:r>
         <w:rPr>
+          <w:noProof/>
           <w:lang w:val="en-US"/>
         </w:rPr>
         <w:drawing>
@@ -17365,6 +17178,7 @@
       </w:pPr>
       <w:r>
         <w:rPr>
+          <w:noProof/>
           <w:lang w:val="en-US"/>
         </w:rPr>
         <w:drawing>
@@ -17741,21 +17555,7 @@
               <w:rPr>
                 <w:lang w:val="en-US"/>
               </w:rPr>
-              <w:t>Unique Run id used to identify a specific train on a specific day(calculated from The first 8 numbers is the date in format </w:t>
-            </w:r>
-            <w:proofErr w:type="spellStart"/>
-            <w:r>
-              <w:rPr>
-                <w:lang w:val="en-US"/>
-              </w:rPr>
-              <w:t>yyyymmdd</w:t>
-            </w:r>
-            <w:proofErr w:type="spellEnd"/>
-            <w:r>
-              <w:rPr>
-                <w:lang w:val="en-US"/>
-              </w:rPr>
-              <w:t>)</w:t>
+              <w:t>Unique Run id used to identify a specific train on a specific day(calculated from The first 8 numbers is the date in format yyyymmdd)</w:t>
             </w:r>
             <w:r>
               <w:t> </w:t>
@@ -17783,14 +17583,12 @@
             <w:pPr>
               <w:jc w:val="center"/>
             </w:pPr>
-            <w:proofErr w:type="spellStart"/>
             <w:r>
               <w:rPr>
                 <w:lang w:val="en-US"/>
               </w:rPr>
               <w:t>from_station</w:t>
             </w:r>
-            <w:proofErr w:type="spellEnd"/>
           </w:p>
         </w:tc>
         <w:tc>
@@ -17837,14 +17635,12 @@
             <w:pPr>
               <w:jc w:val="center"/>
             </w:pPr>
-            <w:proofErr w:type="spellStart"/>
             <w:r>
               <w:rPr>
                 <w:lang w:val="en-US"/>
               </w:rPr>
               <w:t>to_station</w:t>
             </w:r>
-            <w:proofErr w:type="spellEnd"/>
           </w:p>
         </w:tc>
         <w:tc>
@@ -17891,14 +17687,12 @@
             <w:pPr>
               <w:jc w:val="center"/>
             </w:pPr>
-            <w:proofErr w:type="spellStart"/>
             <w:r>
               <w:rPr>
                 <w:lang w:val="en-US"/>
               </w:rPr>
               <w:t>late_canc_reason</w:t>
             </w:r>
-            <w:proofErr w:type="spellEnd"/>
           </w:p>
         </w:tc>
         <w:tc>
@@ -17939,14 +17733,12 @@
             <w:pPr>
               <w:jc w:val="center"/>
             </w:pPr>
-            <w:proofErr w:type="spellStart"/>
             <w:r>
               <w:rPr>
                 <w:lang w:val="en-US"/>
               </w:rPr>
               <w:t>total_stops_in_run</w:t>
             </w:r>
-            <w:proofErr w:type="spellEnd"/>
           </w:p>
         </w:tc>
         <w:tc>
@@ -17993,14 +17785,12 @@
             <w:pPr>
               <w:jc w:val="center"/>
             </w:pPr>
-            <w:proofErr w:type="spellStart"/>
             <w:r>
               <w:rPr>
                 <w:lang w:val="en-US"/>
               </w:rPr>
               <w:t>remaining_stops_after_this</w:t>
             </w:r>
-            <w:proofErr w:type="spellEnd"/>
           </w:p>
         </w:tc>
         <w:tc>
@@ -18050,14 +17840,12 @@
             <w:pPr>
               <w:jc w:val="center"/>
             </w:pPr>
-            <w:proofErr w:type="spellStart"/>
             <w:r>
               <w:rPr>
                 <w:lang w:val="en-US"/>
               </w:rPr>
               <w:t>date_of_service</w:t>
             </w:r>
-            <w:proofErr w:type="spellEnd"/>
           </w:p>
         </w:tc>
         <w:tc>
@@ -18159,14 +17947,12 @@
             <w:pPr>
               <w:jc w:val="center"/>
             </w:pPr>
-            <w:proofErr w:type="spellStart"/>
             <w:r>
               <w:rPr>
                 <w:lang w:val="en-US"/>
               </w:rPr>
               <w:t>day_of_week</w:t>
             </w:r>
-            <w:proofErr w:type="spellEnd"/>
           </w:p>
         </w:tc>
         <w:tc>
@@ -18213,14 +17999,12 @@
             <w:pPr>
               <w:jc w:val="center"/>
             </w:pPr>
-            <w:proofErr w:type="spellStart"/>
             <w:r>
               <w:rPr>
                 <w:lang w:val="en-US"/>
               </w:rPr>
               <w:t>day_of_month</w:t>
             </w:r>
-            <w:proofErr w:type="spellEnd"/>
           </w:p>
         </w:tc>
         <w:tc>
@@ -18267,14 +18051,12 @@
             <w:pPr>
               <w:jc w:val="center"/>
             </w:pPr>
-            <w:proofErr w:type="spellStart"/>
             <w:r>
               <w:rPr>
                 <w:lang w:val="en-US"/>
               </w:rPr>
               <w:t>from_sched_arrival_min</w:t>
             </w:r>
-            <w:proofErr w:type="spellEnd"/>
           </w:p>
         </w:tc>
         <w:tc>
@@ -18299,13 +18081,7 @@
               <w:rPr>
                 <w:lang w:val="en-US"/>
               </w:rPr>
-              <w:t xml:space="preserve"> at origin station </w:t>
-            </w:r>
-            <w:r>
-              <w:rPr>
-                <w:lang w:val="en-US"/>
-              </w:rPr>
-              <w:t>(from station)</w:t>
+              <w:t xml:space="preserve"> at origin station (from station)</w:t>
             </w:r>
             <w:r>
               <w:rPr>
@@ -18339,14 +18115,12 @@
             <w:pPr>
               <w:jc w:val="center"/>
             </w:pPr>
-            <w:proofErr w:type="spellStart"/>
             <w:r>
               <w:rPr>
                 <w:lang w:val="en-US"/>
               </w:rPr>
               <w:t>from_actual_arrival_min</w:t>
             </w:r>
-            <w:proofErr w:type="spellEnd"/>
           </w:p>
         </w:tc>
         <w:tc>
@@ -18414,14 +18188,12 @@
             <w:pPr>
               <w:jc w:val="center"/>
             </w:pPr>
-            <w:proofErr w:type="spellStart"/>
             <w:r>
               <w:rPr>
                 <w:lang w:val="en-US"/>
               </w:rPr>
               <w:t>from_sched_departure_min</w:t>
             </w:r>
-            <w:proofErr w:type="spellEnd"/>
           </w:p>
         </w:tc>
         <w:tc>
@@ -18458,13 +18230,7 @@
               <w:rPr>
                 <w:lang w:val="en-US"/>
               </w:rPr>
-              <w:t xml:space="preserve"> </w:t>
-            </w:r>
-            <w:r>
-              <w:rPr>
-                <w:lang w:val="en-US"/>
-              </w:rPr>
-              <w:t>(from station)</w:t>
+              <w:t xml:space="preserve"> (from station)</w:t>
             </w:r>
             <w:r>
               <w:rPr>
@@ -18495,14 +18261,12 @@
             <w:pPr>
               <w:jc w:val="center"/>
             </w:pPr>
-            <w:proofErr w:type="spellStart"/>
             <w:r>
               <w:rPr>
                 <w:lang w:val="en-US"/>
               </w:rPr>
               <w:t>from_actual_departure_min</w:t>
             </w:r>
-            <w:proofErr w:type="spellEnd"/>
           </w:p>
         </w:tc>
         <w:tc>
@@ -18539,13 +18303,7 @@
               <w:rPr>
                 <w:lang w:val="en-US"/>
               </w:rPr>
-              <w:t xml:space="preserve"> </w:t>
-            </w:r>
-            <w:r>
-              <w:rPr>
-                <w:lang w:val="en-US"/>
-              </w:rPr>
-              <w:t>(from station)</w:t>
+              <w:t xml:space="preserve"> (from station)</w:t>
             </w:r>
             <w:r>
               <w:rPr>
@@ -18576,14 +18334,12 @@
             <w:pPr>
               <w:jc w:val="center"/>
             </w:pPr>
-            <w:proofErr w:type="spellStart"/>
             <w:r>
               <w:rPr>
                 <w:lang w:val="en-US"/>
               </w:rPr>
               <w:t>to_sched_arrival_min</w:t>
             </w:r>
-            <w:proofErr w:type="spellEnd"/>
           </w:p>
         </w:tc>
         <w:tc>
@@ -18610,7 +18366,6 @@
               </w:rPr>
               <w:t xml:space="preserve">at </w:t>
             </w:r>
-            <w:proofErr w:type="spellStart"/>
             <w:r>
               <w:rPr>
                 <w:lang w:val="en-US"/>
@@ -18627,14 +18382,7 @@
               <w:rPr>
                 <w:lang w:val="en-US"/>
               </w:rPr>
-              <w:t>station</w:t>
-            </w:r>
-            <w:proofErr w:type="spellEnd"/>
-            <w:r>
-              <w:rPr>
-                <w:lang w:val="en-US"/>
-              </w:rPr>
-              <w:t> in minutes</w:t>
+              <w:t>station in minutes</w:t>
             </w:r>
           </w:p>
         </w:tc>
@@ -18659,14 +18407,12 @@
             <w:pPr>
               <w:jc w:val="center"/>
             </w:pPr>
-            <w:proofErr w:type="spellStart"/>
             <w:r>
               <w:rPr>
                 <w:lang w:val="en-US"/>
               </w:rPr>
               <w:t>to_actual_arrival_min</w:t>
             </w:r>
-            <w:proofErr w:type="spellEnd"/>
           </w:p>
         </w:tc>
         <w:tc>
@@ -18687,7 +18433,6 @@
               </w:rPr>
               <w:t xml:space="preserve">A train’s actual arrival time at </w:t>
             </w:r>
-            <w:proofErr w:type="spellStart"/>
             <w:r>
               <w:rPr>
                 <w:lang w:val="en-US"/>
@@ -18698,14 +18443,7 @@
               <w:rPr>
                 <w:lang w:val="en-US"/>
               </w:rPr>
-              <w:t>station</w:t>
-            </w:r>
-            <w:proofErr w:type="spellEnd"/>
-            <w:r>
-              <w:rPr>
-                <w:lang w:val="en-US"/>
-              </w:rPr>
-              <w:t xml:space="preserve"> in minutes</w:t>
+              <w:t>station in minutes</w:t>
             </w:r>
           </w:p>
         </w:tc>
@@ -18730,14 +18468,12 @@
             <w:pPr>
               <w:jc w:val="center"/>
             </w:pPr>
-            <w:proofErr w:type="spellStart"/>
             <w:r>
               <w:rPr>
                 <w:lang w:val="en-US"/>
               </w:rPr>
               <w:t>to_sched_departure_min</w:t>
             </w:r>
-            <w:proofErr w:type="spellEnd"/>
           </w:p>
         </w:tc>
         <w:tc>
@@ -18762,27 +18498,13 @@
               <w:rPr>
                 <w:lang w:val="en-US"/>
               </w:rPr>
-              <w:t xml:space="preserve">at </w:t>
-            </w:r>
-            <w:proofErr w:type="spellStart"/>
-            <w:r>
-              <w:rPr>
-                <w:lang w:val="en-US"/>
-              </w:rPr>
-              <w:t>to_</w:t>
-            </w:r>
-            <w:r>
-              <w:rPr>
-                <w:lang w:val="en-US"/>
-              </w:rPr>
-              <w:t>station</w:t>
-            </w:r>
-            <w:proofErr w:type="spellEnd"/>
-            <w:r>
-              <w:rPr>
-                <w:lang w:val="en-US"/>
-              </w:rPr>
-              <w:t xml:space="preserve"> in minute</w:t>
+              <w:t>at to_</w:t>
+            </w:r>
+            <w:r>
+              <w:rPr>
+                <w:lang w:val="en-US"/>
+              </w:rPr>
+              <w:t>station in minute</w:t>
             </w:r>
             <w:r>
               <w:t> </w:t>
@@ -18813,14 +18535,12 @@
             <w:pPr>
               <w:jc w:val="center"/>
             </w:pPr>
-            <w:proofErr w:type="spellStart"/>
             <w:r>
               <w:rPr>
                 <w:lang w:val="en-US"/>
               </w:rPr>
               <w:t>to_actual_departure_min</w:t>
             </w:r>
-            <w:proofErr w:type="spellEnd"/>
           </w:p>
         </w:tc>
         <w:tc>
@@ -18845,27 +18565,13 @@
               <w:rPr>
                 <w:lang w:val="en-US"/>
               </w:rPr>
-              <w:t xml:space="preserve">at </w:t>
-            </w:r>
-            <w:proofErr w:type="spellStart"/>
-            <w:r>
-              <w:rPr>
-                <w:lang w:val="en-US"/>
-              </w:rPr>
-              <w:t>to_s</w:t>
-            </w:r>
-            <w:r>
-              <w:rPr>
-                <w:lang w:val="en-US"/>
-              </w:rPr>
-              <w:t>tation</w:t>
-            </w:r>
-            <w:proofErr w:type="spellEnd"/>
-            <w:r>
-              <w:rPr>
-                <w:lang w:val="en-US"/>
-              </w:rPr>
-              <w:t xml:space="preserve"> in minutes</w:t>
+              <w:t>at to_s</w:t>
+            </w:r>
+            <w:r>
+              <w:rPr>
+                <w:lang w:val="en-US"/>
+              </w:rPr>
+              <w:t>tation in minutes</w:t>
             </w:r>
           </w:p>
         </w:tc>
@@ -18890,7 +18596,6 @@
             <w:pPr>
               <w:jc w:val="center"/>
             </w:pPr>
-            <w:proofErr w:type="spellStart"/>
             <w:r>
               <w:rPr>
                 <w:lang w:val="en-US"/>
@@ -18898,7 +18603,6 @@
               <w:lastRenderedPageBreak/>
               <w:t>propagated_delay_min</w:t>
             </w:r>
-            <w:proofErr w:type="spellEnd"/>
           </w:p>
         </w:tc>
         <w:tc>
@@ -18935,14 +18639,12 @@
             <w:pPr>
               <w:jc w:val="center"/>
             </w:pPr>
-            <w:proofErr w:type="spellStart"/>
             <w:r>
               <w:rPr>
                 <w:lang w:val="en-US"/>
               </w:rPr>
               <w:t>end_segment_delay_min</w:t>
             </w:r>
-            <w:proofErr w:type="spellEnd"/>
           </w:p>
         </w:tc>
         <w:tc>
@@ -18983,14 +18685,12 @@
             <w:pPr>
               <w:jc w:val="center"/>
             </w:pPr>
-            <w:proofErr w:type="spellStart"/>
             <w:r>
               <w:rPr>
                 <w:lang w:val="en-US"/>
               </w:rPr>
               <w:t>cum_delay_min</w:t>
             </w:r>
-            <w:proofErr w:type="spellEnd"/>
           </w:p>
         </w:tc>
         <w:tc>
@@ -19009,21 +18709,7 @@
               <w:rPr>
                 <w:lang w:val="en-US"/>
               </w:rPr>
-              <w:t>The Total delay accumulated in the train’s journey (calculated from sum of </w:t>
-            </w:r>
-            <w:proofErr w:type="spellStart"/>
-            <w:r>
-              <w:rPr>
-                <w:lang w:val="en-US"/>
-              </w:rPr>
-              <w:t>propagated_delay_min</w:t>
-            </w:r>
-            <w:proofErr w:type="spellEnd"/>
-            <w:r>
-              <w:rPr>
-                <w:lang w:val="en-US"/>
-              </w:rPr>
-              <w:t> grouped by rid)</w:t>
+              <w:t>The Total delay accumulated in the train’s journey (calculated from sum of propagated_delay_min grouped by rid)</w:t>
             </w:r>
             <w:r>
               <w:t> </w:t>
@@ -19051,14 +18737,12 @@
             <w:pPr>
               <w:jc w:val="center"/>
             </w:pPr>
-            <w:proofErr w:type="spellStart"/>
             <w:r>
               <w:rPr>
                 <w:lang w:val="en-US"/>
               </w:rPr>
               <w:t>leg_duration_min</w:t>
             </w:r>
-            <w:proofErr w:type="spellEnd"/>
           </w:p>
         </w:tc>
         <w:tc>
@@ -19105,14 +18789,12 @@
             <w:pPr>
               <w:jc w:val="center"/>
             </w:pPr>
-            <w:proofErr w:type="spellStart"/>
             <w:r>
               <w:rPr>
                 <w:lang w:val="en-US"/>
               </w:rPr>
               <w:t>arrival_delay_min</w:t>
             </w:r>
-            <w:proofErr w:type="spellEnd"/>
           </w:p>
         </w:tc>
         <w:tc>
@@ -19159,14 +18841,12 @@
             <w:pPr>
               <w:jc w:val="center"/>
             </w:pPr>
-            <w:proofErr w:type="spellStart"/>
             <w:r>
               <w:rPr>
                 <w:lang w:val="en-US"/>
               </w:rPr>
               <w:t>prev_train_leg_delay_min</w:t>
             </w:r>
-            <w:proofErr w:type="spellEnd"/>
           </w:p>
         </w:tc>
         <w:tc>
@@ -19213,14 +18893,12 @@
             <w:pPr>
               <w:jc w:val="center"/>
             </w:pPr>
-            <w:proofErr w:type="spellStart"/>
             <w:r>
               <w:rPr>
                 <w:lang w:val="en-US"/>
               </w:rPr>
               <w:t>prev_train_cum_delay_min</w:t>
             </w:r>
-            <w:proofErr w:type="spellEnd"/>
           </w:p>
         </w:tc>
         <w:tc>
@@ -19267,14 +18945,12 @@
             <w:pPr>
               <w:jc w:val="center"/>
             </w:pPr>
-            <w:proofErr w:type="spellStart"/>
             <w:r>
               <w:rPr>
                 <w:lang w:val="en-US"/>
               </w:rPr>
               <w:t>prev_train_segment_duration_min</w:t>
             </w:r>
-            <w:proofErr w:type="spellEnd"/>
           </w:p>
         </w:tc>
         <w:tc>
@@ -19321,14 +18997,12 @@
             <w:pPr>
               <w:jc w:val="center"/>
             </w:pPr>
-            <w:proofErr w:type="spellStart"/>
             <w:r>
               <w:rPr>
                 <w:lang w:val="en-US"/>
               </w:rPr>
               <w:t>prev_train_end_segment_delay_min</w:t>
             </w:r>
-            <w:proofErr w:type="spellEnd"/>
           </w:p>
         </w:tc>
         <w:tc>
@@ -19375,14 +19049,12 @@
             <w:pPr>
               <w:jc w:val="center"/>
             </w:pPr>
-            <w:proofErr w:type="spellStart"/>
             <w:r>
               <w:rPr>
                 <w:lang w:val="en-US"/>
               </w:rPr>
               <w:t>historical_avg_propagated_delay_min</w:t>
             </w:r>
-            <w:proofErr w:type="spellEnd"/>
           </w:p>
         </w:tc>
         <w:tc>
@@ -19429,14 +19101,12 @@
             <w:pPr>
               <w:jc w:val="center"/>
             </w:pPr>
-            <w:proofErr w:type="spellStart"/>
             <w:r>
               <w:rPr>
                 <w:lang w:val="en-US"/>
               </w:rPr>
               <w:t>historical_avg_leg_duration_min</w:t>
             </w:r>
-            <w:proofErr w:type="spellEnd"/>
           </w:p>
         </w:tc>
         <w:tc>
@@ -19495,14 +19165,12 @@
             <w:pPr>
               <w:jc w:val="center"/>
             </w:pPr>
-            <w:proofErr w:type="spellStart"/>
             <w:r>
               <w:rPr>
                 <w:lang w:val="en-US"/>
               </w:rPr>
               <w:t>historical_avg_cum_delay_min</w:t>
             </w:r>
-            <w:proofErr w:type="spellEnd"/>
           </w:p>
         </w:tc>
         <w:tc>
@@ -19549,14 +19217,12 @@
             <w:pPr>
               <w:jc w:val="center"/>
             </w:pPr>
-            <w:proofErr w:type="spellStart"/>
             <w:r>
               <w:rPr>
                 <w:lang w:val="en-US"/>
               </w:rPr>
               <w:t>historical_avg_arrival_delay_min</w:t>
             </w:r>
-            <w:proofErr w:type="spellEnd"/>
           </w:p>
         </w:tc>
         <w:tc>
@@ -19603,14 +19269,12 @@
             <w:pPr>
               <w:jc w:val="center"/>
             </w:pPr>
-            <w:proofErr w:type="spellStart"/>
             <w:r>
               <w:rPr>
                 <w:lang w:val="en-US"/>
               </w:rPr>
               <w:t>delay_historical_difference</w:t>
             </w:r>
-            <w:proofErr w:type="spellEnd"/>
           </w:p>
         </w:tc>
         <w:tc>
@@ -19629,35 +19293,7 @@
               <w:rPr>
                 <w:lang w:val="en-US"/>
               </w:rPr>
-              <w:t>the difference between the current delay time and historical average (calculated from </w:t>
-            </w:r>
-            <w:proofErr w:type="spellStart"/>
-            <w:r>
-              <w:rPr>
-                <w:lang w:val="en-US"/>
-              </w:rPr>
-              <w:t>propagated_delay_min</w:t>
-            </w:r>
-            <w:proofErr w:type="spellEnd"/>
-            <w:r>
-              <w:rPr>
-                <w:lang w:val="en-US"/>
-              </w:rPr>
-              <w:t> − </w:t>
-            </w:r>
-            <w:proofErr w:type="spellStart"/>
-            <w:r>
-              <w:rPr>
-                <w:lang w:val="en-US"/>
-              </w:rPr>
-              <w:t>historical_avg_propagated_delay_min</w:t>
-            </w:r>
-            <w:proofErr w:type="spellEnd"/>
-            <w:r>
-              <w:rPr>
-                <w:lang w:val="en-US"/>
-              </w:rPr>
-              <w:t>)</w:t>
+              <w:t>the difference between the current delay time and historical average (calculated from propagated_delay_min − historical_avg_propagated_delay_min)</w:t>
             </w:r>
             <w:r>
               <w:t> </w:t>
@@ -19685,14 +19321,12 @@
             <w:pPr>
               <w:jc w:val="center"/>
             </w:pPr>
-            <w:proofErr w:type="spellStart"/>
             <w:r>
               <w:rPr>
                 <w:lang w:val="en-US"/>
               </w:rPr>
               <w:t>from_temp</w:t>
             </w:r>
-            <w:proofErr w:type="spellEnd"/>
           </w:p>
         </w:tc>
         <w:tc>
@@ -19739,7 +19373,6 @@
             <w:pPr>
               <w:jc w:val="center"/>
             </w:pPr>
-            <w:proofErr w:type="spellStart"/>
             <w:r>
               <w:rPr>
                 <w:lang w:val="en-US"/>
@@ -19752,7 +19385,6 @@
               </w:rPr>
               <w:t>precip</w:t>
             </w:r>
-            <w:proofErr w:type="spellEnd"/>
           </w:p>
         </w:tc>
         <w:tc>
@@ -19811,14 +19443,12 @@
             <w:pPr>
               <w:jc w:val="center"/>
             </w:pPr>
-            <w:proofErr w:type="spellStart"/>
             <w:r>
               <w:rPr>
                 <w:lang w:val="en-US"/>
               </w:rPr>
               <w:t>from_wind</w:t>
             </w:r>
-            <w:proofErr w:type="spellEnd"/>
           </w:p>
         </w:tc>
         <w:tc>
@@ -19865,14 +19495,12 @@
             <w:pPr>
               <w:jc w:val="center"/>
             </w:pPr>
-            <w:proofErr w:type="spellStart"/>
             <w:r>
               <w:rPr>
                 <w:lang w:val="en-US"/>
               </w:rPr>
               <w:t>to_temp</w:t>
             </w:r>
-            <w:proofErr w:type="spellEnd"/>
           </w:p>
         </w:tc>
         <w:tc>
@@ -19919,7 +19547,6 @@
             <w:pPr>
               <w:jc w:val="center"/>
             </w:pPr>
-            <w:proofErr w:type="spellStart"/>
             <w:r>
               <w:rPr>
                 <w:lang w:val="en-US"/>
@@ -19932,7 +19559,6 @@
               </w:rPr>
               <w:t>precip</w:t>
             </w:r>
-            <w:proofErr w:type="spellEnd"/>
           </w:p>
         </w:tc>
         <w:tc>
@@ -19957,19 +19583,7 @@
               <w:rPr>
                 <w:lang w:val="en-US"/>
               </w:rPr>
-              <w:t>precipitation (</w:t>
-            </w:r>
-            <w:r>
-              <w:rPr>
-                <w:lang w:val="en-US"/>
-              </w:rPr>
-              <w:t>including snow</w:t>
-            </w:r>
-            <w:r>
-              <w:rPr>
-                <w:lang w:val="en-US"/>
-              </w:rPr>
-              <w:t>)</w:t>
+              <w:t>precipitation (including snow)</w:t>
             </w:r>
             <w:r>
               <w:rPr>
@@ -20003,14 +19617,12 @@
             <w:pPr>
               <w:jc w:val="center"/>
             </w:pPr>
-            <w:proofErr w:type="spellStart"/>
             <w:r>
               <w:rPr>
                 <w:lang w:val="en-US"/>
               </w:rPr>
               <w:t>to_wind</w:t>
             </w:r>
-            <w:proofErr w:type="spellEnd"/>
           </w:p>
         </w:tc>
         <w:tc>
@@ -20314,19 +19926,11 @@
         </w:rPr>
         <w:t xml:space="preserve">A darker red </w:t>
       </w:r>
-      <w:proofErr w:type="spellStart"/>
-      <w:r>
-        <w:rPr>
-          <w:lang w:val="en-US"/>
-        </w:rPr>
-        <w:t>colour</w:t>
-      </w:r>
-      <w:proofErr w:type="spellEnd"/>
-      <w:r>
-        <w:rPr>
-          <w:lang w:val="en-US"/>
-        </w:rPr>
-        <w:t>,</w:t>
+      <w:r>
+        <w:rPr>
+          <w:lang w:val="en-US"/>
+        </w:rPr>
+        <w:t>colour,</w:t>
       </w:r>
       <w:r>
         <w:rPr>
@@ -21832,19 +21436,7 @@
         <w:rPr>
           <w:lang w:val="en-US"/>
         </w:rPr>
-        <w:t xml:space="preserve">London King’s Cross - Grantham experience the greatest average delay with other segments such as Retford -  Doncaster and </w:t>
-      </w:r>
-      <w:r>
-        <w:rPr>
-          <w:lang w:val="en-US"/>
-        </w:rPr>
-        <w:t>St Neots</w:t>
-      </w:r>
-      <w:r>
-        <w:rPr>
-          <w:lang w:val="en-US"/>
-        </w:rPr>
-        <w:t xml:space="preserve"> -  Peterborough, having relatively substantial delays.</w:t>
+        <w:t>London King’s Cross - Grantham experience the greatest average delay with other segments such as Retford -  Doncaster and St Neots -  Peterborough, having relatively substantial delays.</w:t>
       </w:r>
     </w:p>
     <w:p>
@@ -21863,16 +21455,8 @@
         <w:rPr>
           <w:lang w:val="en-US"/>
         </w:rPr>
-        <w:t xml:space="preserve"> darker </w:t>
-      </w:r>
-      <w:proofErr w:type="spellStart"/>
-      <w:r>
-        <w:rPr>
-          <w:lang w:val="en-US"/>
-        </w:rPr>
-        <w:t>coloured</w:t>
-      </w:r>
-      <w:proofErr w:type="spellEnd"/>
+        <w:t xml:space="preserve"> darker coloured</w:t>
+      </w:r>
       <w:r>
         <w:rPr>
           <w:lang w:val="en-US"/>
@@ -22203,13 +21787,8 @@
     <w:p/>
     <w:p>
       <w:r>
-        <w:t>Open-</w:t>
-      </w:r>
-      <w:proofErr w:type="spellStart"/>
-      <w:r>
-        <w:t>Meteo</w:t>
-      </w:r>
-      <w:proofErr w:type="spellEnd"/>
+        <w:t>Open-Meteo</w:t>
+      </w:r>
       <w:r>
         <w:t xml:space="preserve"> (20</w:t>
       </w:r>
@@ -22277,13 +21856,8 @@
       <w:r>
         <w:t>) ‘</w:t>
       </w:r>
-      <w:proofErr w:type="spellStart"/>
-      <w:r>
-        <w:t>Darwin:Push</w:t>
-      </w:r>
-      <w:proofErr w:type="spellEnd"/>
-      <w:r>
-        <w:t xml:space="preserve"> Port</w:t>
+      <w:r>
+        <w:t>Darwin:Push Port</w:t>
       </w:r>
       <w:r>
         <w:t>’.</w:t>
@@ -22340,13 +21914,8 @@
       <w:r>
         <w:t>) ‘</w:t>
       </w:r>
-      <w:proofErr w:type="spellStart"/>
-      <w:r>
-        <w:t>Darwin:Schedule</w:t>
-      </w:r>
-      <w:proofErr w:type="spellEnd"/>
-      <w:r>
-        <w:t xml:space="preserve"> Element</w:t>
+      <w:r>
+        <w:t>Darwin:Schedule Element</w:t>
       </w:r>
       <w:r>
         <w:t>’.</w:t>
@@ -22744,7 +22313,7 @@
         <w:noProof/>
         <w:color w:val="EE0000"/>
       </w:rPr>
-      <w:t>4. Project Planning</w:t>
+      <w:t>5. Data Acquisition</w:t>
     </w:r>
     <w:r>
       <w:rPr>
@@ -34958,6 +34527,7 @@
   <w:style w:type="character" w:default="1" w:styleId="DefaultParagraphFont">
     <w:name w:val="Default Paragraph Font"/>
     <w:uiPriority w:val="1"/>
+    <w:semiHidden/>
     <w:unhideWhenUsed/>
   </w:style>
   <w:style w:type="table" w:default="1" w:styleId="TableNormal">

</xml_diff>

<commit_message>
updated regression task in report
</commit_message>
<xml_diff>
--- a/LNER Disruption Prediction report.docx
+++ b/LNER Disruption Prediction report.docx
@@ -4038,7 +4038,23 @@
           <w:color w:val="000000" w:themeColor="text1"/>
           <w:lang w:val="en-US"/>
         </w:rPr>
-        <w:t>Improve disruption prediction quality by ascertaining the effects of delay propagation to support clearer and more reliable customer communication.</w:t>
+        <w:t xml:space="preserve">Improve disruption prediction quality by ascertaining the effects </w:t>
+      </w:r>
+      <w:r>
+        <w:rPr>
+          <w:rFonts w:ascii="Cambria" w:eastAsia="Cambria" w:hAnsi="Cambria" w:cs="Cambria"/>
+          <w:color w:val="000000" w:themeColor="text1"/>
+          <w:lang w:val="en-US"/>
+        </w:rPr>
+        <w:t>causing</w:t>
+      </w:r>
+      <w:r>
+        <w:rPr>
+          <w:rFonts w:ascii="Cambria" w:eastAsia="Cambria" w:hAnsi="Cambria" w:cs="Cambria"/>
+          <w:color w:val="000000" w:themeColor="text1"/>
+          <w:lang w:val="en-US"/>
+        </w:rPr>
+        <w:t xml:space="preserve"> delay propagation to support clearer and more reliable customer communication.</w:t>
       </w:r>
     </w:p>
     <w:p>
@@ -4103,7 +4119,7 @@
           <w:color w:val="000000" w:themeColor="text1"/>
           <w:lang w:val="en-US"/>
         </w:rPr>
-        <w:t>Measure how often Darwin predictions are accurate versus inaccurate during major disruption</w:t>
+        <w:t xml:space="preserve">Decide a suitable modeling technique considering current constraints but also future scalability and extensibility </w:t>
       </w:r>
     </w:p>
     <w:p>
@@ -4124,7 +4140,7 @@
           <w:color w:val="000000" w:themeColor="text1"/>
           <w:lang w:val="en-US"/>
         </w:rPr>
-        <w:t xml:space="preserve">Decide a suitable modeling technique considering current constraints but also future scalability and extensibility </w:t>
+        <w:t>Develop a modelling framework using timetable, historical, and weather data with the ability to add new features</w:t>
       </w:r>
     </w:p>
     <w:p>
@@ -4145,7 +4161,7 @@
           <w:color w:val="000000" w:themeColor="text1"/>
           <w:lang w:val="en-US"/>
         </w:rPr>
-        <w:t>Develop a modelling framework using timetable, historical, and weather data with the ability to add new features</w:t>
+        <w:t>Ensure the approach works in near real-time and integrates with existing LNER systems</w:t>
       </w:r>
     </w:p>
     <w:p>
@@ -4166,7 +4182,7 @@
           <w:color w:val="000000" w:themeColor="text1"/>
           <w:lang w:val="en-US"/>
         </w:rPr>
-        <w:t>Ensure the approach works in near real-time and integrates with existing LNER systems</w:t>
+        <w:t>Identify which customer-facing systems are most affected by poor prediction quality</w:t>
       </w:r>
     </w:p>
     <w:p>
@@ -4187,27 +4203,6 @@
           <w:color w:val="000000" w:themeColor="text1"/>
           <w:lang w:val="en-US"/>
         </w:rPr>
-        <w:t>Identify which customer-facing systems are most affected by poor prediction quality</w:t>
-      </w:r>
-    </w:p>
-    <w:p>
-      <w:pPr>
-        <w:pStyle w:val="Compact"/>
-        <w:numPr>
-          <w:ilvl w:val="0"/>
-          <w:numId w:val="79"/>
-        </w:numPr>
-        <w:rPr>
-          <w:rFonts w:ascii="Cambria" w:eastAsia="Cambria" w:hAnsi="Cambria" w:cs="Cambria"/>
-          <w:color w:val="000000" w:themeColor="text1"/>
-        </w:rPr>
-      </w:pPr>
-      <w:r>
-        <w:rPr>
-          <w:rFonts w:ascii="Cambria" w:eastAsia="Cambria" w:hAnsi="Cambria" w:cs="Cambria"/>
-          <w:color w:val="000000" w:themeColor="text1"/>
-          <w:lang w:val="en-US"/>
-        </w:rPr>
         <w:t>Define how improvement will be evaluated (accuracy, stability and business value)</w:t>
       </w:r>
     </w:p>
@@ -4254,7 +4249,6 @@
           <w:szCs w:val="36"/>
           <w:lang w:val="en-US"/>
         </w:rPr>
-        <w:lastRenderedPageBreak/>
         <w:t>2</w:t>
       </w:r>
       <w:r>
@@ -5113,6 +5107,7 @@
           <w:szCs w:val="32"/>
           <w:lang w:val="en-US"/>
         </w:rPr>
+        <w:lastRenderedPageBreak/>
         <w:t>2</w:t>
       </w:r>
       <w:r>
@@ -6256,7 +6251,25 @@
           <w:color w:val="000000" w:themeColor="text1"/>
           <w:lang w:val="en-US"/>
         </w:rPr>
-        <w:t xml:space="preserve"> such as Kings Cross and Finsbury Park amplify disruption impact due to high passenger volume and limited capacity.</w:t>
+        <w:t xml:space="preserve"> such as Kings Cross and Finsbury </w:t>
+      </w:r>
+      <w:proofErr w:type="gramStart"/>
+      <w:r>
+        <w:rPr>
+          <w:rFonts w:ascii="Cambria" w:eastAsia="Cambria" w:hAnsi="Cambria" w:cs="Cambria"/>
+          <w:color w:val="000000" w:themeColor="text1"/>
+          <w:lang w:val="en-US"/>
+        </w:rPr>
+        <w:t>Park</w:t>
+      </w:r>
+      <w:proofErr w:type="gramEnd"/>
+      <w:r>
+        <w:rPr>
+          <w:rFonts w:ascii="Cambria" w:eastAsia="Cambria" w:hAnsi="Cambria" w:cs="Cambria"/>
+          <w:color w:val="000000" w:themeColor="text1"/>
+          <w:lang w:val="en-US"/>
+        </w:rPr>
+        <w:t xml:space="preserve"> amplify disruption impact due to high passenger volume and limited capacity.</w:t>
       </w:r>
     </w:p>
     <w:p>
@@ -6287,7 +6300,25 @@
           <w:color w:val="000000" w:themeColor="text1"/>
           <w:lang w:val="en-US"/>
         </w:rPr>
-        <w:t>, with only two main tracks, means minor issues can lead to a system-wide disruption.</w:t>
+        <w:t xml:space="preserve">, with only two main tracks, means minor issues can lead to </w:t>
+      </w:r>
+      <w:proofErr w:type="gramStart"/>
+      <w:r>
+        <w:rPr>
+          <w:rFonts w:ascii="Cambria" w:eastAsia="Cambria" w:hAnsi="Cambria" w:cs="Cambria"/>
+          <w:color w:val="000000" w:themeColor="text1"/>
+          <w:lang w:val="en-US"/>
+        </w:rPr>
+        <w:t>a system</w:t>
+      </w:r>
+      <w:proofErr w:type="gramEnd"/>
+      <w:r>
+        <w:rPr>
+          <w:rFonts w:ascii="Cambria" w:eastAsia="Cambria" w:hAnsi="Cambria" w:cs="Cambria"/>
+          <w:color w:val="000000" w:themeColor="text1"/>
+          <w:lang w:val="en-US"/>
+        </w:rPr>
+        <w:t>-wide disruption.</w:t>
       </w:r>
     </w:p>
     <w:p>
@@ -6510,8 +6541,9 @@
                 <w:color w:val="FFFFFF" w:themeColor="background1"/>
                 <w:lang w:val="en-US"/>
               </w:rPr>
-              <w:t xml:space="preserve"> it</w:t>
-            </w:r>
+              <w:t xml:space="preserve"> </w:t>
+            </w:r>
+            <w:proofErr w:type="gramStart"/>
             <w:r>
               <w:rPr>
                 <w:rFonts w:ascii="Cambria" w:eastAsia="Cambria" w:hAnsi="Cambria" w:cs="Cambria"/>
@@ -6520,7 +6552,28 @@
                 <w:color w:val="FFFFFF" w:themeColor="background1"/>
                 <w:lang w:val="en-US"/>
               </w:rPr>
-              <w:t xml:space="preserve"> is/isn’t useful?</w:t>
+              <w:t>it</w:t>
+            </w:r>
+            <w:r>
+              <w:rPr>
+                <w:rFonts w:ascii="Cambria" w:eastAsia="Cambria" w:hAnsi="Cambria" w:cs="Cambria"/>
+                <w:b/>
+                <w:bCs/>
+                <w:color w:val="FFFFFF" w:themeColor="background1"/>
+                <w:lang w:val="en-US"/>
+              </w:rPr>
+              <w:t xml:space="preserve"> is/isn’t</w:t>
+            </w:r>
+            <w:proofErr w:type="gramEnd"/>
+            <w:r>
+              <w:rPr>
+                <w:rFonts w:ascii="Cambria" w:eastAsia="Cambria" w:hAnsi="Cambria" w:cs="Cambria"/>
+                <w:b/>
+                <w:bCs/>
+                <w:color w:val="FFFFFF" w:themeColor="background1"/>
+                <w:lang w:val="en-US"/>
+              </w:rPr>
+              <w:t xml:space="preserve"> useful?</w:t>
             </w:r>
           </w:p>
         </w:tc>
@@ -6604,12 +6657,21 @@
                 <w:rFonts w:ascii="Cambria" w:eastAsia="Cambria" w:hAnsi="Cambria" w:cs="Cambria"/>
               </w:rPr>
             </w:pPr>
+            <w:proofErr w:type="gramStart"/>
             <w:r>
               <w:rPr>
                 <w:rFonts w:ascii="Cambria" w:eastAsia="Cambria" w:hAnsi="Cambria" w:cs="Cambria"/>
                 <w:lang w:val="en-US"/>
               </w:rPr>
-              <w:t>Useful for train movement, predictions, stopping times, and real-time variation patterns, however it is difficult to make use of due to lack of documentation.</w:t>
+              <w:t>Useful</w:t>
+            </w:r>
+            <w:proofErr w:type="gramEnd"/>
+            <w:r>
+              <w:rPr>
+                <w:rFonts w:ascii="Cambria" w:eastAsia="Cambria" w:hAnsi="Cambria" w:cs="Cambria"/>
+                <w:lang w:val="en-US"/>
+              </w:rPr>
+              <w:t xml:space="preserve"> for train movement, predictions, stopping times, and real-time variation patterns, however it is difficult to make use of due to lack of documentation.</w:t>
             </w:r>
           </w:p>
         </w:tc>
@@ -6644,7 +6706,39 @@
                 <w:rFonts w:ascii="Cambria" w:eastAsia="Cambria" w:hAnsi="Cambria" w:cs="Cambria"/>
                 <w:lang w:val="en-US"/>
               </w:rPr>
-              <w:t>, we can engineer sudo- signaling data using the working timetable and actual arrival/departure times which is much simpler to use/understand</w:t>
+              <w:t xml:space="preserve">, we can engineer </w:t>
+            </w:r>
+            <w:proofErr w:type="spellStart"/>
+            <w:r>
+              <w:rPr>
+                <w:rFonts w:ascii="Cambria" w:eastAsia="Cambria" w:hAnsi="Cambria" w:cs="Cambria"/>
+                <w:lang w:val="en-US"/>
+              </w:rPr>
+              <w:t>sudo</w:t>
+            </w:r>
+            <w:proofErr w:type="spellEnd"/>
+            <w:r>
+              <w:rPr>
+                <w:rFonts w:ascii="Cambria" w:eastAsia="Cambria" w:hAnsi="Cambria" w:cs="Cambria"/>
+                <w:lang w:val="en-US"/>
+              </w:rPr>
+              <w:t xml:space="preserve">- signaling data using the working timetable and actual arrival/departure times which </w:t>
+            </w:r>
+            <w:proofErr w:type="gramStart"/>
+            <w:r>
+              <w:rPr>
+                <w:rFonts w:ascii="Cambria" w:eastAsia="Cambria" w:hAnsi="Cambria" w:cs="Cambria"/>
+                <w:lang w:val="en-US"/>
+              </w:rPr>
+              <w:t>is</w:t>
+            </w:r>
+            <w:proofErr w:type="gramEnd"/>
+            <w:r>
+              <w:rPr>
+                <w:rFonts w:ascii="Cambria" w:eastAsia="Cambria" w:hAnsi="Cambria" w:cs="Cambria"/>
+                <w:lang w:val="en-US"/>
+              </w:rPr>
+              <w:t xml:space="preserve"> much simpler to use/understand</w:t>
             </w:r>
           </w:p>
         </w:tc>
@@ -6703,7 +6797,23 @@
                 <w:rFonts w:ascii="Cambria" w:eastAsia="Cambria" w:hAnsi="Cambria" w:cs="Cambria"/>
                 <w:lang w:val="en-US"/>
               </w:rPr>
-              <w:t>Useful for comparing timetables to actual outcomes, pulling individual journey ids, and stop information.</w:t>
+              <w:t xml:space="preserve">Useful for comparing timetables to actual outcomes, pulling individual journey ids, and </w:t>
+            </w:r>
+            <w:proofErr w:type="gramStart"/>
+            <w:r>
+              <w:rPr>
+                <w:rFonts w:ascii="Cambria" w:eastAsia="Cambria" w:hAnsi="Cambria" w:cs="Cambria"/>
+                <w:lang w:val="en-US"/>
+              </w:rPr>
+              <w:t>stop</w:t>
+            </w:r>
+            <w:proofErr w:type="gramEnd"/>
+            <w:r>
+              <w:rPr>
+                <w:rFonts w:ascii="Cambria" w:eastAsia="Cambria" w:hAnsi="Cambria" w:cs="Cambria"/>
+                <w:lang w:val="en-US"/>
+              </w:rPr>
+              <w:t xml:space="preserve"> information.</w:t>
             </w:r>
           </w:p>
         </w:tc>
@@ -6733,12 +6843,53 @@
               </w:rPr>
               <w:t xml:space="preserve">Yes, </w:t>
             </w:r>
+            <w:proofErr w:type="gramStart"/>
             <w:r>
               <w:rPr>
                 <w:rFonts w:ascii="Cambria" w:eastAsia="Cambria" w:hAnsi="Cambria" w:cs="Cambria"/>
                 <w:lang w:val="en-US"/>
               </w:rPr>
-              <w:t>simplifies data collection for machine learning and data exploration. Can be merged with other dataset easily via RID</w:t>
+              <w:t>simplifies</w:t>
+            </w:r>
+            <w:proofErr w:type="gramEnd"/>
+            <w:r>
+              <w:rPr>
+                <w:rFonts w:ascii="Cambria" w:eastAsia="Cambria" w:hAnsi="Cambria" w:cs="Cambria"/>
+                <w:lang w:val="en-US"/>
+              </w:rPr>
+              <w:t xml:space="preserve"> data collection for machine learning and data exploration. Can be merged with </w:t>
+            </w:r>
+            <w:proofErr w:type="gramStart"/>
+            <w:r>
+              <w:rPr>
+                <w:rFonts w:ascii="Cambria" w:eastAsia="Cambria" w:hAnsi="Cambria" w:cs="Cambria"/>
+                <w:lang w:val="en-US"/>
+              </w:rPr>
+              <w:t>other</w:t>
+            </w:r>
+            <w:proofErr w:type="gramEnd"/>
+            <w:r>
+              <w:rPr>
+                <w:rFonts w:ascii="Cambria" w:eastAsia="Cambria" w:hAnsi="Cambria" w:cs="Cambria"/>
+                <w:lang w:val="en-US"/>
+              </w:rPr>
+              <w:t xml:space="preserve"> </w:t>
+            </w:r>
+            <w:proofErr w:type="gramStart"/>
+            <w:r>
+              <w:rPr>
+                <w:rFonts w:ascii="Cambria" w:eastAsia="Cambria" w:hAnsi="Cambria" w:cs="Cambria"/>
+                <w:lang w:val="en-US"/>
+              </w:rPr>
+              <w:t>dataset</w:t>
+            </w:r>
+            <w:proofErr w:type="gramEnd"/>
+            <w:r>
+              <w:rPr>
+                <w:rFonts w:ascii="Cambria" w:eastAsia="Cambria" w:hAnsi="Cambria" w:cs="Cambria"/>
+                <w:lang w:val="en-US"/>
+              </w:rPr>
+              <w:t xml:space="preserve"> easily via RID</w:t>
             </w:r>
           </w:p>
         </w:tc>
@@ -7154,7 +7305,41 @@
           <w:color w:val="000000" w:themeColor="text1"/>
           <w:lang w:val="en-US"/>
         </w:rPr>
-        <w:t>The main aim is to improve disruption prediction quality by ascertaining the effects of delay propagation to support clearer and more reliable customer communication. By proxy this would support times where Darwin’s ETAs become unstable. Instead of attempting to model the full railway network, the initial approach treats each train leg (from a station, to a station) as an instance. This allows the problem to be framed as 2 tasks.</w:t>
+        <w:t>The main aim is to improve disruption prediction quality by ascertaining the effects of delay propagation to support clearer and more reliable customer communication. By proxy this would support times where Darwin’s ETAs become unstable. Instead of attempting to model the full railway network, the initial approach treats each train leg (</w:t>
+      </w:r>
+      <w:proofErr w:type="gramStart"/>
+      <w:r>
+        <w:rPr>
+          <w:rFonts w:ascii="Cambria" w:eastAsia="Cambria" w:hAnsi="Cambria" w:cs="Cambria"/>
+          <w:color w:val="000000" w:themeColor="text1"/>
+          <w:lang w:val="en-US"/>
+        </w:rPr>
+        <w:t>from a station,</w:t>
+      </w:r>
+      <w:proofErr w:type="gramEnd"/>
+      <w:r>
+        <w:rPr>
+          <w:rFonts w:ascii="Cambria" w:eastAsia="Cambria" w:hAnsi="Cambria" w:cs="Cambria"/>
+          <w:color w:val="000000" w:themeColor="text1"/>
+          <w:lang w:val="en-US"/>
+        </w:rPr>
+        <w:t xml:space="preserve"> to a station) as an instance</w:t>
+      </w:r>
+      <w:r>
+        <w:rPr>
+          <w:rFonts w:ascii="Cambria" w:eastAsia="Cambria" w:hAnsi="Cambria" w:cs="Cambria"/>
+          <w:color w:val="000000" w:themeColor="text1"/>
+          <w:lang w:val="en-US"/>
+        </w:rPr>
+        <w:t xml:space="preserve"> where we can instead take the approach of modelling segment level accumulation rather than full network propagation</w:t>
+      </w:r>
+      <w:r>
+        <w:rPr>
+          <w:rFonts w:ascii="Cambria" w:eastAsia="Cambria" w:hAnsi="Cambria" w:cs="Cambria"/>
+          <w:color w:val="000000" w:themeColor="text1"/>
+          <w:lang w:val="en-US"/>
+        </w:rPr>
+        <w:t>. This allows the problem to be framed as 2 tasks.</w:t>
       </w:r>
     </w:p>
     <w:p>
@@ -7185,7 +7370,15 @@
           <w:color w:val="000000" w:themeColor="text1"/>
           <w:lang w:val="en-US"/>
         </w:rPr>
-        <w:t xml:space="preserve">A supervised regression task where the objective is to predict the delay outcome at the end of a segment </w:t>
+        <w:t>A supervised regression task where the objective is to predict the</w:t>
+      </w:r>
+      <w:r>
+        <w:rPr>
+          <w:rFonts w:ascii="Cambria" w:eastAsia="Cambria" w:hAnsi="Cambria" w:cs="Cambria"/>
+          <w:color w:val="000000" w:themeColor="text1"/>
+          <w:lang w:val="en-US"/>
+        </w:rPr>
+        <w:t xml:space="preserve"> delay gained over a segment.</w:t>
       </w:r>
     </w:p>
     <w:p>
@@ -7246,6 +7439,8 @@
           <w:lang w:val="en-US"/>
         </w:rPr>
       </w:pPr>
+      <w:proofErr w:type="spellStart"/>
+      <w:proofErr w:type="gramStart"/>
       <w:r>
         <w:rPr>
           <w:rFonts w:ascii="Cambria" w:eastAsia="Cambria" w:hAnsi="Cambria" w:cs="Cambria"/>
@@ -7253,7 +7448,38 @@
           <w:sz w:val="24"/>
           <w:lang w:val="en-US"/>
         </w:rPr>
-        <w:t xml:space="preserve">Eventhough graph-based approaches may be better at representing the entire systems interactions, they introduce significant complexity and data requirements beyond the scope of the current usable data and time constraints. The idea is to create a robust and extensible baseline model which can later be expanded. </w:t>
+        <w:t>Eventhough</w:t>
+      </w:r>
+      <w:proofErr w:type="spellEnd"/>
+      <w:proofErr w:type="gramEnd"/>
+      <w:r>
+        <w:rPr>
+          <w:rFonts w:ascii="Cambria" w:eastAsia="Cambria" w:hAnsi="Cambria" w:cs="Cambria"/>
+          <w:color w:val="000000" w:themeColor="text1"/>
+          <w:sz w:val="24"/>
+          <w:lang w:val="en-US"/>
+        </w:rPr>
+        <w:t xml:space="preserve"> graph-based approaches may be better at representing the entire </w:t>
+      </w:r>
+      <w:proofErr w:type="gramStart"/>
+      <w:r>
+        <w:rPr>
+          <w:rFonts w:ascii="Cambria" w:eastAsia="Cambria" w:hAnsi="Cambria" w:cs="Cambria"/>
+          <w:color w:val="000000" w:themeColor="text1"/>
+          <w:sz w:val="24"/>
+          <w:lang w:val="en-US"/>
+        </w:rPr>
+        <w:t>systems</w:t>
+      </w:r>
+      <w:proofErr w:type="gramEnd"/>
+      <w:r>
+        <w:rPr>
+          <w:rFonts w:ascii="Cambria" w:eastAsia="Cambria" w:hAnsi="Cambria" w:cs="Cambria"/>
+          <w:color w:val="000000" w:themeColor="text1"/>
+          <w:sz w:val="24"/>
+          <w:lang w:val="en-US"/>
+        </w:rPr>
+        <w:t xml:space="preserve"> interactions, they introduce significant complexity and data requirements beyond the scope of the current usable data and time constraints. The idea is to create a robust and extensible baseline model which can later be expanded. </w:t>
       </w:r>
       <w:r>
         <w:rPr>
@@ -7286,6 +7512,7 @@
           <w:color w:val="000000" w:themeColor="text1"/>
         </w:rPr>
       </w:pPr>
+      <w:proofErr w:type="spellStart"/>
       <w:r>
         <w:rPr>
           <w:rFonts w:ascii="Cambria" w:eastAsia="Cambria" w:hAnsi="Cambria" w:cs="Cambria"/>
@@ -7294,6 +7521,7 @@
         </w:rPr>
         <w:t>XGBoost</w:t>
       </w:r>
+      <w:proofErr w:type="spellEnd"/>
     </w:p>
     <w:p>
       <w:pPr>
@@ -7307,6 +7535,7 @@
           <w:color w:val="000000" w:themeColor="text1"/>
         </w:rPr>
       </w:pPr>
+      <w:proofErr w:type="spellStart"/>
       <w:r>
         <w:rPr>
           <w:rFonts w:ascii="Cambria" w:eastAsia="Cambria" w:hAnsi="Cambria" w:cs="Cambria"/>
@@ -7315,6 +7544,7 @@
         </w:rPr>
         <w:t>LightGBM</w:t>
       </w:r>
+      <w:proofErr w:type="spellEnd"/>
     </w:p>
     <w:p>
       <w:pPr>
@@ -7341,7 +7571,57 @@
           <w:color w:val="000000" w:themeColor="text1"/>
           <w:lang w:val="en-US"/>
         </w:rPr>
-        <w:t>Other models may be tested however initially these models are well suited in theory due to their strong performance on structured datasets and ability to capture nonlinear interactions between variables such as delay propagation. Specifically, XGBoost is very popular, powerful, widely used in research and industry and has a history of performing well in many Kaggle competitions.</w:t>
+        <w:t xml:space="preserve">Other models may be </w:t>
+      </w:r>
+      <w:r>
+        <w:rPr>
+          <w:rFonts w:ascii="Cambria" w:eastAsia="Cambria" w:hAnsi="Cambria" w:cs="Cambria"/>
+          <w:color w:val="000000" w:themeColor="text1"/>
+          <w:lang w:val="en-US"/>
+        </w:rPr>
+        <w:t>tested</w:t>
+      </w:r>
+      <w:r>
+        <w:rPr>
+          <w:rFonts w:ascii="Cambria" w:eastAsia="Cambria" w:hAnsi="Cambria" w:cs="Cambria"/>
+          <w:color w:val="000000" w:themeColor="text1"/>
+          <w:lang w:val="en-US"/>
+        </w:rPr>
+        <w:t xml:space="preserve"> such as Linear Regression, K-Nearest Neighbors, or Decision Trees</w:t>
+      </w:r>
+      <w:r>
+        <w:rPr>
+          <w:rFonts w:ascii="Cambria" w:eastAsia="Cambria" w:hAnsi="Cambria" w:cs="Cambria"/>
+          <w:color w:val="000000" w:themeColor="text1"/>
+          <w:lang w:val="en-US"/>
+        </w:rPr>
+        <w:t>,</w:t>
+      </w:r>
+      <w:r>
+        <w:rPr>
+          <w:rFonts w:ascii="Cambria" w:eastAsia="Cambria" w:hAnsi="Cambria" w:cs="Cambria"/>
+          <w:color w:val="000000" w:themeColor="text1"/>
+          <w:lang w:val="en-US"/>
+        </w:rPr>
+        <w:t xml:space="preserve"> however initially these models are well suited in theory due to their strong performance on structured datasets and ability to capture nonlinear interactions between variables such as delay propagation. Specifically, </w:t>
+      </w:r>
+      <w:proofErr w:type="spellStart"/>
+      <w:r>
+        <w:rPr>
+          <w:rFonts w:ascii="Cambria" w:eastAsia="Cambria" w:hAnsi="Cambria" w:cs="Cambria"/>
+          <w:color w:val="000000" w:themeColor="text1"/>
+          <w:lang w:val="en-US"/>
+        </w:rPr>
+        <w:t>XGBoost</w:t>
+      </w:r>
+      <w:proofErr w:type="spellEnd"/>
+      <w:r>
+        <w:rPr>
+          <w:rFonts w:ascii="Cambria" w:eastAsia="Cambria" w:hAnsi="Cambria" w:cs="Cambria"/>
+          <w:color w:val="000000" w:themeColor="text1"/>
+          <w:lang w:val="en-US"/>
+        </w:rPr>
+        <w:t xml:space="preserve"> is very popular, powerful, widely used in research and industry and has a history of performing well in many Kaggle competitions.</w:t>
       </w:r>
     </w:p>
     <w:p>
@@ -7849,7 +8129,25 @@
           <w:color w:val="000000" w:themeColor="text1"/>
           <w:lang w:val="en-US"/>
         </w:rPr>
-        <w:t xml:space="preserve"> LNER, who decide how outputs are adopted.</w:t>
+        <w:t xml:space="preserve"> LNER, who </w:t>
+      </w:r>
+      <w:proofErr w:type="gramStart"/>
+      <w:r>
+        <w:rPr>
+          <w:rFonts w:ascii="Cambria" w:eastAsia="Cambria" w:hAnsi="Cambria" w:cs="Cambria"/>
+          <w:color w:val="000000" w:themeColor="text1"/>
+          <w:lang w:val="en-US"/>
+        </w:rPr>
+        <w:t>decide</w:t>
+      </w:r>
+      <w:proofErr w:type="gramEnd"/>
+      <w:r>
+        <w:rPr>
+          <w:rFonts w:ascii="Cambria" w:eastAsia="Cambria" w:hAnsi="Cambria" w:cs="Cambria"/>
+          <w:color w:val="000000" w:themeColor="text1"/>
+          <w:lang w:val="en-US"/>
+        </w:rPr>
+        <w:t xml:space="preserve"> how outputs are adopted.</w:t>
       </w:r>
     </w:p>
     <w:p>
@@ -9047,6 +9345,7 @@
           <w:lang w:val="en-US"/>
         </w:rPr>
       </w:pPr>
+      <w:proofErr w:type="gramStart"/>
       <w:r>
         <w:rPr>
           <w:rFonts w:ascii="Calibri" w:hAnsi="Calibri" w:cs="Calibri"/>
@@ -9054,7 +9353,17 @@
           <w:szCs w:val="20"/>
           <w:lang w:val="en-US"/>
         </w:rPr>
-        <w:t>Evaluate model performance</w:t>
+        <w:t>Evaluate</w:t>
+      </w:r>
+      <w:proofErr w:type="gramEnd"/>
+      <w:r>
+        <w:rPr>
+          <w:rFonts w:ascii="Calibri" w:hAnsi="Calibri" w:cs="Calibri"/>
+          <w:sz w:val="22"/>
+          <w:szCs w:val="20"/>
+          <w:lang w:val="en-US"/>
+        </w:rPr>
+        <w:t xml:space="preserve"> model performance</w:t>
       </w:r>
     </w:p>
     <w:p>
@@ -9373,7 +9682,23 @@
           <w:szCs w:val="18"/>
           <w:lang w:val="en-US"/>
         </w:rPr>
-        <w:t>Each role has been assigned a colour and will be used to identify the primary role responsible for a specific task</w:t>
+        <w:t xml:space="preserve">Each role has been assigned a </w:t>
+      </w:r>
+      <w:proofErr w:type="spellStart"/>
+      <w:r>
+        <w:rPr>
+          <w:szCs w:val="18"/>
+          <w:lang w:val="en-US"/>
+        </w:rPr>
+        <w:t>colour</w:t>
+      </w:r>
+      <w:proofErr w:type="spellEnd"/>
+      <w:r>
+        <w:rPr>
+          <w:szCs w:val="18"/>
+          <w:lang w:val="en-US"/>
+        </w:rPr>
+        <w:t xml:space="preserve"> and will be used to identify the primary role responsible for a specific task</w:t>
       </w:r>
     </w:p>
     <w:p>
@@ -11567,7 +11892,27 @@
                 <w:color w:val="auto"/>
                 <w:lang w:val="en-US"/>
               </w:rPr>
-              <w:t>1.3.3,  1.3.6</w:t>
+              <w:t>1.3.3</w:t>
+            </w:r>
+            <w:proofErr w:type="gramStart"/>
+            <w:r>
+              <w:rPr>
+                <w:b/>
+                <w:bCs/>
+                <w:color w:val="auto"/>
+                <w:lang w:val="en-US"/>
+              </w:rPr>
+              <w:t>,  1</w:t>
+            </w:r>
+            <w:proofErr w:type="gramEnd"/>
+            <w:r>
+              <w:rPr>
+                <w:b/>
+                <w:bCs/>
+                <w:color w:val="auto"/>
+                <w:lang w:val="en-US"/>
+              </w:rPr>
+              <w:t>.3.6</w:t>
             </w:r>
           </w:p>
         </w:tc>
@@ -14661,7 +15006,15 @@
           <w:p/>
           <w:p>
             <w:r>
-              <w:t>Use GridSearch to tune hyperparameters or make use of ensemble learning.</w:t>
+              <w:t xml:space="preserve">Use </w:t>
+            </w:r>
+            <w:proofErr w:type="spellStart"/>
+            <w:r>
+              <w:t>GridSearch</w:t>
+            </w:r>
+            <w:proofErr w:type="spellEnd"/>
+            <w:r>
+              <w:t xml:space="preserve"> to tune hyperparameters or make use of ensemble learning.</w:t>
             </w:r>
           </w:p>
         </w:tc>
@@ -14970,7 +15323,35 @@
         <w:rPr>
           <w:lang w:val="en-US"/>
         </w:rPr>
-        <w:t xml:space="preserve"> to share progress on tasks and prioritise next steps. A</w:t>
+        <w:t xml:space="preserve"> to share progress on tasks and </w:t>
+      </w:r>
+      <w:proofErr w:type="spellStart"/>
+      <w:r>
+        <w:rPr>
+          <w:lang w:val="en-US"/>
+        </w:rPr>
+        <w:t>prioritise</w:t>
+      </w:r>
+      <w:proofErr w:type="spellEnd"/>
+      <w:r>
+        <w:rPr>
+          <w:lang w:val="en-US"/>
+        </w:rPr>
+        <w:t xml:space="preserve"> </w:t>
+      </w:r>
+      <w:proofErr w:type="gramStart"/>
+      <w:r>
+        <w:rPr>
+          <w:lang w:val="en-US"/>
+        </w:rPr>
+        <w:t>next</w:t>
+      </w:r>
+      <w:proofErr w:type="gramEnd"/>
+      <w:r>
+        <w:rPr>
+          <w:lang w:val="en-US"/>
+        </w:rPr>
+        <w:t xml:space="preserve"> steps. A</w:t>
       </w:r>
       <w:r>
         <w:rPr>
@@ -15255,7 +15636,21 @@
               <w:rPr>
                 <w:lang w:val="en-US"/>
               </w:rPr>
-              <w:t>, availability, and shared/finalised set of interview questions</w:t>
+              <w:t>, availability, and shared/</w:t>
+            </w:r>
+            <w:proofErr w:type="spellStart"/>
+            <w:r>
+              <w:rPr>
+                <w:lang w:val="en-US"/>
+              </w:rPr>
+              <w:t>finalised</w:t>
+            </w:r>
+            <w:proofErr w:type="spellEnd"/>
+            <w:r>
+              <w:rPr>
+                <w:lang w:val="en-US"/>
+              </w:rPr>
+              <w:t xml:space="preserve"> set of interview questions</w:t>
             </w:r>
           </w:p>
         </w:tc>
@@ -15439,7 +15834,21 @@
               <w:rPr>
                 <w:lang w:val="en-US"/>
               </w:rPr>
-              <w:t>Finalizing expected approach, finalizing roles and sharing all findings so far</w:t>
+              <w:t xml:space="preserve">Finalizing </w:t>
+            </w:r>
+            <w:proofErr w:type="gramStart"/>
+            <w:r>
+              <w:rPr>
+                <w:lang w:val="en-US"/>
+              </w:rPr>
+              <w:t>expected</w:t>
+            </w:r>
+            <w:proofErr w:type="gramEnd"/>
+            <w:r>
+              <w:rPr>
+                <w:lang w:val="en-US"/>
+              </w:rPr>
+              <w:t xml:space="preserve"> approach, finalizing roles and sharing all findings so far</w:t>
             </w:r>
           </w:p>
         </w:tc>
@@ -16159,7 +16568,49 @@
         <w:rPr>
           <w:lang w:val="en-US"/>
         </w:rPr>
-        <w:t>As outlined in 2.4, many different sources for data were considered, however we decided use the Historical Service Performance (HSP) api for train data and Open-Meteo for weather data. At the time of writing this, HSP data prior to 2026 potentially may have been wiped, so the data collected so far will be the only data available to use for now.</w:t>
+        <w:t xml:space="preserve">As outlined in 2.4, many different sources for data were considered, however we decided </w:t>
+      </w:r>
+      <w:proofErr w:type="gramStart"/>
+      <w:r>
+        <w:rPr>
+          <w:lang w:val="en-US"/>
+        </w:rPr>
+        <w:t>use</w:t>
+      </w:r>
+      <w:proofErr w:type="gramEnd"/>
+      <w:r>
+        <w:rPr>
+          <w:lang w:val="en-US"/>
+        </w:rPr>
+        <w:t xml:space="preserve"> the Historical Service Performance (HSP) </w:t>
+      </w:r>
+      <w:proofErr w:type="spellStart"/>
+      <w:r>
+        <w:rPr>
+          <w:lang w:val="en-US"/>
+        </w:rPr>
+        <w:t>api</w:t>
+      </w:r>
+      <w:proofErr w:type="spellEnd"/>
+      <w:r>
+        <w:rPr>
+          <w:lang w:val="en-US"/>
+        </w:rPr>
+        <w:t xml:space="preserve"> for train data and Open-</w:t>
+      </w:r>
+      <w:proofErr w:type="spellStart"/>
+      <w:r>
+        <w:rPr>
+          <w:lang w:val="en-US"/>
+        </w:rPr>
+        <w:t>Meteo</w:t>
+      </w:r>
+      <w:proofErr w:type="spellEnd"/>
+      <w:r>
+        <w:rPr>
+          <w:lang w:val="en-US"/>
+        </w:rPr>
+        <w:t xml:space="preserve"> for weather data. At the time of writing this, HSP data prior to 2026 potentially may have been wiped, so the data collected so far will be the only data available to use for now.</w:t>
       </w:r>
       <w:r>
         <w:rPr>
@@ -16178,7 +16629,49 @@
         <w:rPr>
           <w:lang w:val="en-US"/>
         </w:rPr>
-        <w:t>Documentation on the HSP api and Open-Meteo are available in the references which can be used to see the body of requests and responses.</w:t>
+        <w:t xml:space="preserve">Documentation on the HSP </w:t>
+      </w:r>
+      <w:proofErr w:type="spellStart"/>
+      <w:r>
+        <w:rPr>
+          <w:lang w:val="en-US"/>
+        </w:rPr>
+        <w:t>api</w:t>
+      </w:r>
+      <w:proofErr w:type="spellEnd"/>
+      <w:r>
+        <w:rPr>
+          <w:lang w:val="en-US"/>
+        </w:rPr>
+        <w:t xml:space="preserve"> and Open-</w:t>
+      </w:r>
+      <w:proofErr w:type="spellStart"/>
+      <w:r>
+        <w:rPr>
+          <w:lang w:val="en-US"/>
+        </w:rPr>
+        <w:t>Meteo</w:t>
+      </w:r>
+      <w:proofErr w:type="spellEnd"/>
+      <w:r>
+        <w:rPr>
+          <w:lang w:val="en-US"/>
+        </w:rPr>
+        <w:t xml:space="preserve"> are available in </w:t>
+      </w:r>
+      <w:proofErr w:type="gramStart"/>
+      <w:r>
+        <w:rPr>
+          <w:lang w:val="en-US"/>
+        </w:rPr>
+        <w:t>the references</w:t>
+      </w:r>
+      <w:proofErr w:type="gramEnd"/>
+      <w:r>
+        <w:rPr>
+          <w:lang w:val="en-US"/>
+        </w:rPr>
+        <w:t xml:space="preserve"> which can be used to see the body of requests and responses.</w:t>
       </w:r>
     </w:p>
     <w:p>
@@ -16328,7 +16821,21 @@
         <w:rPr>
           <w:lang w:val="en-US"/>
         </w:rPr>
-        <w:t xml:space="preserve">Using the service metrics api, we can query trains that have a specific origin and destination between a time and date. The response </w:t>
+        <w:t xml:space="preserve">Using the service metrics </w:t>
+      </w:r>
+      <w:proofErr w:type="spellStart"/>
+      <w:r>
+        <w:rPr>
+          <w:lang w:val="en-US"/>
+        </w:rPr>
+        <w:t>api</w:t>
+      </w:r>
+      <w:proofErr w:type="spellEnd"/>
+      <w:r>
+        <w:rPr>
+          <w:lang w:val="en-US"/>
+        </w:rPr>
+        <w:t xml:space="preserve">, we can query trains that have a specific origin and destination between a time and date. The response </w:t>
       </w:r>
       <w:r>
         <w:rPr>
@@ -16373,7 +16880,7 @@
           <w:lang w:val="en-US"/>
         </w:rPr>
         <w:drawing>
-          <wp:anchor distT="0" distB="0" distL="114300" distR="114300" simplePos="0" relativeHeight="251776001" behindDoc="0" locked="0" layoutInCell="1" allowOverlap="1" wp14:anchorId="2CAF93DA" wp14:editId="129A685D">
+          <wp:anchor distT="0" distB="0" distL="114300" distR="114300" simplePos="0" relativeHeight="251776001" behindDoc="0" locked="0" layoutInCell="1" allowOverlap="1" wp14:anchorId="2CAF93DA" wp14:editId="5ED554FF">
             <wp:simplePos x="0" y="0"/>
             <wp:positionH relativeFrom="margin">
               <wp:align>center</wp:align>
@@ -16442,7 +16949,21 @@
         <w:rPr>
           <w:lang w:val="en-US"/>
         </w:rPr>
-        <w:t>We wrote a function that would make this process easier and automatic and can be explored further by examining the ipynb notebook.</w:t>
+        <w:t xml:space="preserve">We wrote a function that would make this process easier and automatic and can be explored further by examining the </w:t>
+      </w:r>
+      <w:proofErr w:type="spellStart"/>
+      <w:r>
+        <w:rPr>
+          <w:lang w:val="en-US"/>
+        </w:rPr>
+        <w:t>ipynb</w:t>
+      </w:r>
+      <w:proofErr w:type="spellEnd"/>
+      <w:r>
+        <w:rPr>
+          <w:lang w:val="en-US"/>
+        </w:rPr>
+        <w:t xml:space="preserve"> notebook.</w:t>
       </w:r>
     </w:p>
     <w:p>
@@ -16732,20 +17253,48 @@
         <w:rPr>
           <w:lang w:val="en-US"/>
         </w:rPr>
-        <w:t xml:space="preserve"> whereas responses for 2025 are used to create a pandas dataframe where we split every journey into segments (where each row is the information between its departure from the last station and arrival at the next station). </w:t>
-      </w:r>
-    </w:p>
-    <w:p>
-      <w:pPr>
-        <w:rPr>
-          <w:lang w:val="en-US"/>
-        </w:rPr>
-      </w:pPr>
-      <w:r>
-        <w:rPr>
-          <w:lang w:val="en-US"/>
-        </w:rPr>
-        <w:t>This is a simplified version of this process, however the specifics can be explored by examining the data collection notebook.</w:t>
+        <w:t xml:space="preserve"> whereas responses for 2025 are used to create a pandas </w:t>
+      </w:r>
+      <w:proofErr w:type="spellStart"/>
+      <w:r>
+        <w:rPr>
+          <w:lang w:val="en-US"/>
+        </w:rPr>
+        <w:t>dataframe</w:t>
+      </w:r>
+      <w:proofErr w:type="spellEnd"/>
+      <w:r>
+        <w:rPr>
+          <w:lang w:val="en-US"/>
+        </w:rPr>
+        <w:t xml:space="preserve"> where we split every journey into segments (where each row is the information between its departure from the last station and arrival at the next station). </w:t>
+      </w:r>
+    </w:p>
+    <w:p>
+      <w:pPr>
+        <w:rPr>
+          <w:lang w:val="en-US"/>
+        </w:rPr>
+      </w:pPr>
+      <w:r>
+        <w:rPr>
+          <w:lang w:val="en-US"/>
+        </w:rPr>
+        <w:t xml:space="preserve">This is a simplified version of this </w:t>
+      </w:r>
+      <w:proofErr w:type="gramStart"/>
+      <w:r>
+        <w:rPr>
+          <w:lang w:val="en-US"/>
+        </w:rPr>
+        <w:t>process,</w:t>
+      </w:r>
+      <w:proofErr w:type="gramEnd"/>
+      <w:r>
+        <w:rPr>
+          <w:lang w:val="en-US"/>
+        </w:rPr>
+        <w:t xml:space="preserve"> however the specifics can be explored by examining the data collection notebook.</w:t>
       </w:r>
     </w:p>
     <w:p>
@@ -17045,9 +17594,23 @@
           <w:szCs w:val="32"/>
           <w:lang w:val="en-US"/>
         </w:rPr>
-        <w:t>Weather Data – Open-Meteo</w:t>
+        <w:t>Weather Data – Open-</w:t>
+      </w:r>
+      <w:proofErr w:type="spellStart"/>
+      <w:r>
+        <w:rPr>
+          <w:rFonts w:ascii="Calibri" w:eastAsia="Calibri" w:hAnsi="Calibri" w:cs="Calibri"/>
+          <w:b/>
+          <w:bCs/>
+          <w:color w:val="FF0000"/>
+          <w:sz w:val="32"/>
+          <w:szCs w:val="32"/>
+          <w:lang w:val="en-US"/>
+        </w:rPr>
+        <w:t>Meteo</w:t>
       </w:r>
       <w:bookmarkEnd w:id="23"/>
+      <w:proofErr w:type="spellEnd"/>
     </w:p>
     <w:p>
       <w:pPr>
@@ -17085,11 +17648,33 @@
           <w:lang w:val="en-US"/>
         </w:rPr>
       </w:pPr>
-      <w:r>
-        <w:rPr>
-          <w:lang w:val="en-US"/>
-        </w:rPr>
-        <w:t>Next we use the coordinates of each station in order to join weather data such as, precipitation, windspeed and temperature at specific times to the segments in the dataset.</w:t>
+      <w:proofErr w:type="gramStart"/>
+      <w:r>
+        <w:rPr>
+          <w:lang w:val="en-US"/>
+        </w:rPr>
+        <w:t>Next</w:t>
+      </w:r>
+      <w:proofErr w:type="gramEnd"/>
+      <w:r>
+        <w:rPr>
+          <w:lang w:val="en-US"/>
+        </w:rPr>
+        <w:t xml:space="preserve"> we use the coordinates of each station </w:t>
+      </w:r>
+      <w:proofErr w:type="gramStart"/>
+      <w:r>
+        <w:rPr>
+          <w:lang w:val="en-US"/>
+        </w:rPr>
+        <w:t>in order to</w:t>
+      </w:r>
+      <w:proofErr w:type="gramEnd"/>
+      <w:r>
+        <w:rPr>
+          <w:lang w:val="en-US"/>
+        </w:rPr>
+        <w:t xml:space="preserve"> join weather data such as, precipitation, windspeed and temperature at specific times to the segments in the dataset.</w:t>
       </w:r>
     </w:p>
     <w:p>
@@ -17555,7 +18140,49 @@
               <w:rPr>
                 <w:lang w:val="en-US"/>
               </w:rPr>
-              <w:t>Unique Run id used to identify a specific train on a specific day(calculated from The first 8 numbers is the date in format yyyymmdd)</w:t>
+              <w:t>Unique Run id used to identify a specific train on a specific </w:t>
+            </w:r>
+            <w:proofErr w:type="gramStart"/>
+            <w:r>
+              <w:rPr>
+                <w:lang w:val="en-US"/>
+              </w:rPr>
+              <w:t>day(</w:t>
+            </w:r>
+            <w:proofErr w:type="gramEnd"/>
+            <w:r>
+              <w:rPr>
+                <w:lang w:val="en-US"/>
+              </w:rPr>
+              <w:t>calculated from </w:t>
+            </w:r>
+            <w:proofErr w:type="gramStart"/>
+            <w:r>
+              <w:rPr>
+                <w:lang w:val="en-US"/>
+              </w:rPr>
+              <w:t>The</w:t>
+            </w:r>
+            <w:proofErr w:type="gramEnd"/>
+            <w:r>
+              <w:rPr>
+                <w:lang w:val="en-US"/>
+              </w:rPr>
+              <w:t> first 8 numbers is the date in format </w:t>
+            </w:r>
+            <w:proofErr w:type="spellStart"/>
+            <w:r>
+              <w:rPr>
+                <w:lang w:val="en-US"/>
+              </w:rPr>
+              <w:t>yyyymmdd</w:t>
+            </w:r>
+            <w:proofErr w:type="spellEnd"/>
+            <w:r>
+              <w:rPr>
+                <w:lang w:val="en-US"/>
+              </w:rPr>
+              <w:t>)</w:t>
             </w:r>
             <w:r>
               <w:t> </w:t>
@@ -17583,12 +18210,14 @@
             <w:pPr>
               <w:jc w:val="center"/>
             </w:pPr>
+            <w:proofErr w:type="spellStart"/>
             <w:r>
               <w:rPr>
                 <w:lang w:val="en-US"/>
               </w:rPr>
               <w:t>from_station</w:t>
             </w:r>
+            <w:proofErr w:type="spellEnd"/>
           </w:p>
         </w:tc>
         <w:tc>
@@ -17635,12 +18264,14 @@
             <w:pPr>
               <w:jc w:val="center"/>
             </w:pPr>
+            <w:proofErr w:type="spellStart"/>
             <w:r>
               <w:rPr>
                 <w:lang w:val="en-US"/>
               </w:rPr>
               <w:t>to_station</w:t>
             </w:r>
+            <w:proofErr w:type="spellEnd"/>
           </w:p>
         </w:tc>
         <w:tc>
@@ -17687,12 +18318,14 @@
             <w:pPr>
               <w:jc w:val="center"/>
             </w:pPr>
+            <w:proofErr w:type="spellStart"/>
             <w:r>
               <w:rPr>
                 <w:lang w:val="en-US"/>
               </w:rPr>
               <w:t>late_canc_reason</w:t>
             </w:r>
+            <w:proofErr w:type="spellEnd"/>
           </w:p>
         </w:tc>
         <w:tc>
@@ -17733,12 +18366,14 @@
             <w:pPr>
               <w:jc w:val="center"/>
             </w:pPr>
+            <w:proofErr w:type="spellStart"/>
             <w:r>
               <w:rPr>
                 <w:lang w:val="en-US"/>
               </w:rPr>
               <w:t>total_stops_in_run</w:t>
             </w:r>
+            <w:proofErr w:type="spellEnd"/>
           </w:p>
         </w:tc>
         <w:tc>
@@ -17757,7 +18392,21 @@
               <w:rPr>
                 <w:lang w:val="en-US"/>
               </w:rPr>
-              <w:t>Total number of stations  within the train journey</w:t>
+              <w:t>Total number of </w:t>
+            </w:r>
+            <w:proofErr w:type="gramStart"/>
+            <w:r>
+              <w:rPr>
+                <w:lang w:val="en-US"/>
+              </w:rPr>
+              <w:t>stations  within</w:t>
+            </w:r>
+            <w:proofErr w:type="gramEnd"/>
+            <w:r>
+              <w:rPr>
+                <w:lang w:val="en-US"/>
+              </w:rPr>
+              <w:t> the train journey</w:t>
             </w:r>
             <w:r>
               <w:t> </w:t>
@@ -17785,12 +18434,14 @@
             <w:pPr>
               <w:jc w:val="center"/>
             </w:pPr>
+            <w:proofErr w:type="spellStart"/>
             <w:r>
               <w:rPr>
                 <w:lang w:val="en-US"/>
               </w:rPr>
               <w:t>remaining_stops_after_this</w:t>
             </w:r>
+            <w:proofErr w:type="spellEnd"/>
           </w:p>
         </w:tc>
         <w:tc>
@@ -17805,6 +18456,7 @@
             <w:hideMark/>
           </w:tcPr>
           <w:p>
+            <w:proofErr w:type="gramStart"/>
             <w:r>
               <w:rPr>
                 <w:lang w:val="en-US"/>
@@ -17815,7 +18467,14 @@
               <w:rPr>
                 <w:lang w:val="en-US"/>
               </w:rPr>
-              <w:t>mount of stops left after the segment</w:t>
+              <w:t>mount</w:t>
+            </w:r>
+            <w:proofErr w:type="gramEnd"/>
+            <w:r>
+              <w:rPr>
+                <w:lang w:val="en-US"/>
+              </w:rPr>
+              <w:t> of stops left after the segment</w:t>
             </w:r>
           </w:p>
         </w:tc>
@@ -17840,12 +18499,14 @@
             <w:pPr>
               <w:jc w:val="center"/>
             </w:pPr>
+            <w:proofErr w:type="spellStart"/>
             <w:r>
               <w:rPr>
                 <w:lang w:val="en-US"/>
               </w:rPr>
               <w:t>date_of_service</w:t>
             </w:r>
+            <w:proofErr w:type="spellEnd"/>
           </w:p>
         </w:tc>
         <w:tc>
@@ -17947,12 +18608,14 @@
             <w:pPr>
               <w:jc w:val="center"/>
             </w:pPr>
+            <w:proofErr w:type="spellStart"/>
             <w:r>
               <w:rPr>
                 <w:lang w:val="en-US"/>
               </w:rPr>
               <w:t>day_of_week</w:t>
             </w:r>
+            <w:proofErr w:type="spellEnd"/>
           </w:p>
         </w:tc>
         <w:tc>
@@ -17971,7 +18634,21 @@
               <w:rPr>
                 <w:lang w:val="en-US"/>
               </w:rPr>
-              <w:t>Number representing the day of the week(from 1-7)</w:t>
+              <w:t>Number representing the day of the </w:t>
+            </w:r>
+            <w:proofErr w:type="gramStart"/>
+            <w:r>
+              <w:rPr>
+                <w:lang w:val="en-US"/>
+              </w:rPr>
+              <w:t>week(</w:t>
+            </w:r>
+            <w:proofErr w:type="gramEnd"/>
+            <w:r>
+              <w:rPr>
+                <w:lang w:val="en-US"/>
+              </w:rPr>
+              <w:t>from 1-7)</w:t>
             </w:r>
             <w:r>
               <w:t> </w:t>
@@ -17999,12 +18676,14 @@
             <w:pPr>
               <w:jc w:val="center"/>
             </w:pPr>
+            <w:proofErr w:type="spellStart"/>
             <w:r>
               <w:rPr>
                 <w:lang w:val="en-US"/>
               </w:rPr>
               <w:t>day_of_month</w:t>
             </w:r>
+            <w:proofErr w:type="spellEnd"/>
           </w:p>
         </w:tc>
         <w:tc>
@@ -18023,7 +18702,21 @@
               <w:rPr>
                 <w:lang w:val="en-US"/>
               </w:rPr>
-              <w:t>Number representing the day within a month(from 1-31)</w:t>
+              <w:t>Number representing the day within a </w:t>
+            </w:r>
+            <w:proofErr w:type="gramStart"/>
+            <w:r>
+              <w:rPr>
+                <w:lang w:val="en-US"/>
+              </w:rPr>
+              <w:t>month(</w:t>
+            </w:r>
+            <w:proofErr w:type="gramEnd"/>
+            <w:r>
+              <w:rPr>
+                <w:lang w:val="en-US"/>
+              </w:rPr>
+              <w:t>from 1-31)</w:t>
             </w:r>
             <w:r>
               <w:t> </w:t>
@@ -18051,12 +18744,14 @@
             <w:pPr>
               <w:jc w:val="center"/>
             </w:pPr>
+            <w:proofErr w:type="spellStart"/>
             <w:r>
               <w:rPr>
                 <w:lang w:val="en-US"/>
               </w:rPr>
               <w:t>from_sched_arrival_min</w:t>
             </w:r>
+            <w:proofErr w:type="spellEnd"/>
           </w:p>
         </w:tc>
         <w:tc>
@@ -18115,12 +18810,14 @@
             <w:pPr>
               <w:jc w:val="center"/>
             </w:pPr>
+            <w:proofErr w:type="spellStart"/>
             <w:r>
               <w:rPr>
                 <w:lang w:val="en-US"/>
               </w:rPr>
               <w:t>from_actual_arrival_min</w:t>
             </w:r>
+            <w:proofErr w:type="spellEnd"/>
           </w:p>
         </w:tc>
         <w:tc>
@@ -18188,12 +18885,14 @@
             <w:pPr>
               <w:jc w:val="center"/>
             </w:pPr>
+            <w:proofErr w:type="spellStart"/>
             <w:r>
               <w:rPr>
                 <w:lang w:val="en-US"/>
               </w:rPr>
               <w:t>from_sched_departure_min</w:t>
             </w:r>
+            <w:proofErr w:type="spellEnd"/>
           </w:p>
         </w:tc>
         <w:tc>
@@ -18230,13 +18929,27 @@
               <w:rPr>
                 <w:lang w:val="en-US"/>
               </w:rPr>
-              <w:t xml:space="preserve"> (from station)</w:t>
-            </w:r>
-            <w:r>
-              <w:rPr>
-                <w:lang w:val="en-US"/>
-              </w:rPr>
-              <w:t>  in minutes</w:t>
+              <w:t xml:space="preserve"> (from </w:t>
+            </w:r>
+            <w:proofErr w:type="gramStart"/>
+            <w:r>
+              <w:rPr>
+                <w:lang w:val="en-US"/>
+              </w:rPr>
+              <w:t>station)</w:t>
+            </w:r>
+            <w:r>
+              <w:rPr>
+                <w:lang w:val="en-US"/>
+              </w:rPr>
+              <w:t>  in</w:t>
+            </w:r>
+            <w:proofErr w:type="gramEnd"/>
+            <w:r>
+              <w:rPr>
+                <w:lang w:val="en-US"/>
+              </w:rPr>
+              <w:t> minutes</w:t>
             </w:r>
           </w:p>
         </w:tc>
@@ -18261,12 +18974,14 @@
             <w:pPr>
               <w:jc w:val="center"/>
             </w:pPr>
+            <w:proofErr w:type="spellStart"/>
             <w:r>
               <w:rPr>
                 <w:lang w:val="en-US"/>
               </w:rPr>
               <w:t>from_actual_departure_min</w:t>
             </w:r>
+            <w:proofErr w:type="spellEnd"/>
           </w:p>
         </w:tc>
         <w:tc>
@@ -18334,12 +19049,14 @@
             <w:pPr>
               <w:jc w:val="center"/>
             </w:pPr>
+            <w:proofErr w:type="spellStart"/>
             <w:r>
               <w:rPr>
                 <w:lang w:val="en-US"/>
               </w:rPr>
               <w:t>to_sched_arrival_min</w:t>
             </w:r>
+            <w:proofErr w:type="spellEnd"/>
           </w:p>
         </w:tc>
         <w:tc>
@@ -18366,6 +19083,7 @@
               </w:rPr>
               <w:t xml:space="preserve">at </w:t>
             </w:r>
+            <w:proofErr w:type="spellStart"/>
             <w:r>
               <w:rPr>
                 <w:lang w:val="en-US"/>
@@ -18382,7 +19100,14 @@
               <w:rPr>
                 <w:lang w:val="en-US"/>
               </w:rPr>
-              <w:t>station in minutes</w:t>
+              <w:t>station</w:t>
+            </w:r>
+            <w:proofErr w:type="spellEnd"/>
+            <w:r>
+              <w:rPr>
+                <w:lang w:val="en-US"/>
+              </w:rPr>
+              <w:t> in minutes</w:t>
             </w:r>
           </w:p>
         </w:tc>
@@ -18407,12 +19132,14 @@
             <w:pPr>
               <w:jc w:val="center"/>
             </w:pPr>
+            <w:proofErr w:type="spellStart"/>
             <w:r>
               <w:rPr>
                 <w:lang w:val="en-US"/>
               </w:rPr>
               <w:t>to_actual_arrival_min</w:t>
             </w:r>
+            <w:proofErr w:type="spellEnd"/>
           </w:p>
         </w:tc>
         <w:tc>
@@ -18433,6 +19160,7 @@
               </w:rPr>
               <w:t xml:space="preserve">A train’s actual arrival time at </w:t>
             </w:r>
+            <w:proofErr w:type="spellStart"/>
             <w:r>
               <w:rPr>
                 <w:lang w:val="en-US"/>
@@ -18443,7 +19171,14 @@
               <w:rPr>
                 <w:lang w:val="en-US"/>
               </w:rPr>
-              <w:t>station in minutes</w:t>
+              <w:t>station</w:t>
+            </w:r>
+            <w:proofErr w:type="spellEnd"/>
+            <w:r>
+              <w:rPr>
+                <w:lang w:val="en-US"/>
+              </w:rPr>
+              <w:t xml:space="preserve"> in minutes</w:t>
             </w:r>
           </w:p>
         </w:tc>
@@ -18468,12 +19203,14 @@
             <w:pPr>
               <w:jc w:val="center"/>
             </w:pPr>
+            <w:proofErr w:type="spellStart"/>
             <w:r>
               <w:rPr>
                 <w:lang w:val="en-US"/>
               </w:rPr>
               <w:t>to_sched_departure_min</w:t>
             </w:r>
+            <w:proofErr w:type="spellEnd"/>
           </w:p>
         </w:tc>
         <w:tc>
@@ -18498,13 +19235,27 @@
               <w:rPr>
                 <w:lang w:val="en-US"/>
               </w:rPr>
-              <w:t>at to_</w:t>
-            </w:r>
-            <w:r>
-              <w:rPr>
-                <w:lang w:val="en-US"/>
-              </w:rPr>
-              <w:t>station in minute</w:t>
+              <w:t xml:space="preserve">at </w:t>
+            </w:r>
+            <w:proofErr w:type="spellStart"/>
+            <w:r>
+              <w:rPr>
+                <w:lang w:val="en-US"/>
+              </w:rPr>
+              <w:t>to_</w:t>
+            </w:r>
+            <w:r>
+              <w:rPr>
+                <w:lang w:val="en-US"/>
+              </w:rPr>
+              <w:t>station</w:t>
+            </w:r>
+            <w:proofErr w:type="spellEnd"/>
+            <w:r>
+              <w:rPr>
+                <w:lang w:val="en-US"/>
+              </w:rPr>
+              <w:t xml:space="preserve"> in minute</w:t>
             </w:r>
             <w:r>
               <w:t> </w:t>
@@ -18535,12 +19286,14 @@
             <w:pPr>
               <w:jc w:val="center"/>
             </w:pPr>
+            <w:proofErr w:type="spellStart"/>
             <w:r>
               <w:rPr>
                 <w:lang w:val="en-US"/>
               </w:rPr>
               <w:t>to_actual_departure_min</w:t>
             </w:r>
+            <w:proofErr w:type="spellEnd"/>
           </w:p>
         </w:tc>
         <w:tc>
@@ -18565,13 +19318,27 @@
               <w:rPr>
                 <w:lang w:val="en-US"/>
               </w:rPr>
-              <w:t>at to_s</w:t>
-            </w:r>
-            <w:r>
-              <w:rPr>
-                <w:lang w:val="en-US"/>
-              </w:rPr>
-              <w:t>tation in minutes</w:t>
+              <w:t xml:space="preserve">at </w:t>
+            </w:r>
+            <w:proofErr w:type="spellStart"/>
+            <w:r>
+              <w:rPr>
+                <w:lang w:val="en-US"/>
+              </w:rPr>
+              <w:t>to_s</w:t>
+            </w:r>
+            <w:r>
+              <w:rPr>
+                <w:lang w:val="en-US"/>
+              </w:rPr>
+              <w:t>tation</w:t>
+            </w:r>
+            <w:proofErr w:type="spellEnd"/>
+            <w:r>
+              <w:rPr>
+                <w:lang w:val="en-US"/>
+              </w:rPr>
+              <w:t xml:space="preserve"> in minutes</w:t>
             </w:r>
           </w:p>
         </w:tc>
@@ -18596,6 +19363,7 @@
             <w:pPr>
               <w:jc w:val="center"/>
             </w:pPr>
+            <w:proofErr w:type="spellStart"/>
             <w:r>
               <w:rPr>
                 <w:lang w:val="en-US"/>
@@ -18603,6 +19371,7 @@
               <w:lastRenderedPageBreak/>
               <w:t>propagated_delay_min</w:t>
             </w:r>
+            <w:proofErr w:type="spellEnd"/>
           </w:p>
         </w:tc>
         <w:tc>
@@ -18639,12 +19408,14 @@
             <w:pPr>
               <w:jc w:val="center"/>
             </w:pPr>
+            <w:proofErr w:type="spellStart"/>
             <w:r>
               <w:rPr>
                 <w:lang w:val="en-US"/>
               </w:rPr>
               <w:t>end_segment_delay_min</w:t>
             </w:r>
+            <w:proofErr w:type="spellEnd"/>
           </w:p>
         </w:tc>
         <w:tc>
@@ -18685,12 +19456,14 @@
             <w:pPr>
               <w:jc w:val="center"/>
             </w:pPr>
+            <w:proofErr w:type="spellStart"/>
             <w:r>
               <w:rPr>
                 <w:lang w:val="en-US"/>
               </w:rPr>
               <w:t>cum_delay_min</w:t>
             </w:r>
+            <w:proofErr w:type="spellEnd"/>
           </w:p>
         </w:tc>
         <w:tc>
@@ -18709,7 +19482,21 @@
               <w:rPr>
                 <w:lang w:val="en-US"/>
               </w:rPr>
-              <w:t>The Total delay accumulated in the train’s journey (calculated from sum of propagated_delay_min grouped by rid)</w:t>
+              <w:t>The Total delay accumulated in the train’s journey (calculated from sum of </w:t>
+            </w:r>
+            <w:proofErr w:type="spellStart"/>
+            <w:r>
+              <w:rPr>
+                <w:lang w:val="en-US"/>
+              </w:rPr>
+              <w:t>propagated_delay_min</w:t>
+            </w:r>
+            <w:proofErr w:type="spellEnd"/>
+            <w:r>
+              <w:rPr>
+                <w:lang w:val="en-US"/>
+              </w:rPr>
+              <w:t> grouped by rid)</w:t>
             </w:r>
             <w:r>
               <w:t> </w:t>
@@ -18737,12 +19524,14 @@
             <w:pPr>
               <w:jc w:val="center"/>
             </w:pPr>
+            <w:proofErr w:type="spellStart"/>
             <w:r>
               <w:rPr>
                 <w:lang w:val="en-US"/>
               </w:rPr>
               <w:t>leg_duration_min</w:t>
             </w:r>
+            <w:proofErr w:type="spellEnd"/>
           </w:p>
         </w:tc>
         <w:tc>
@@ -18789,12 +19578,14 @@
             <w:pPr>
               <w:jc w:val="center"/>
             </w:pPr>
+            <w:proofErr w:type="spellStart"/>
             <w:r>
               <w:rPr>
                 <w:lang w:val="en-US"/>
               </w:rPr>
               <w:t>arrival_delay_min</w:t>
             </w:r>
+            <w:proofErr w:type="spellEnd"/>
           </w:p>
         </w:tc>
         <w:tc>
@@ -18841,12 +19632,14 @@
             <w:pPr>
               <w:jc w:val="center"/>
             </w:pPr>
+            <w:proofErr w:type="spellStart"/>
             <w:r>
               <w:rPr>
                 <w:lang w:val="en-US"/>
               </w:rPr>
               <w:t>prev_train_leg_delay_min</w:t>
             </w:r>
+            <w:proofErr w:type="spellEnd"/>
           </w:p>
         </w:tc>
         <w:tc>
@@ -18893,12 +19686,14 @@
             <w:pPr>
               <w:jc w:val="center"/>
             </w:pPr>
+            <w:proofErr w:type="spellStart"/>
             <w:r>
               <w:rPr>
                 <w:lang w:val="en-US"/>
               </w:rPr>
               <w:t>prev_train_cum_delay_min</w:t>
             </w:r>
+            <w:proofErr w:type="spellEnd"/>
           </w:p>
         </w:tc>
         <w:tc>
@@ -18945,12 +19740,14 @@
             <w:pPr>
               <w:jc w:val="center"/>
             </w:pPr>
+            <w:proofErr w:type="spellStart"/>
             <w:r>
               <w:rPr>
                 <w:lang w:val="en-US"/>
               </w:rPr>
               <w:t>prev_train_segment_duration_min</w:t>
             </w:r>
+            <w:proofErr w:type="spellEnd"/>
           </w:p>
         </w:tc>
         <w:tc>
@@ -18997,12 +19794,14 @@
             <w:pPr>
               <w:jc w:val="center"/>
             </w:pPr>
+            <w:proofErr w:type="spellStart"/>
             <w:r>
               <w:rPr>
                 <w:lang w:val="en-US"/>
               </w:rPr>
               <w:t>prev_train_end_segment_delay_min</w:t>
             </w:r>
+            <w:proofErr w:type="spellEnd"/>
           </w:p>
         </w:tc>
         <w:tc>
@@ -19049,12 +19848,14 @@
             <w:pPr>
               <w:jc w:val="center"/>
             </w:pPr>
+            <w:proofErr w:type="spellStart"/>
             <w:r>
               <w:rPr>
                 <w:lang w:val="en-US"/>
               </w:rPr>
               <w:t>historical_avg_propagated_delay_min</w:t>
             </w:r>
+            <w:proofErr w:type="spellEnd"/>
           </w:p>
         </w:tc>
         <w:tc>
@@ -19101,12 +19902,14 @@
             <w:pPr>
               <w:jc w:val="center"/>
             </w:pPr>
+            <w:proofErr w:type="spellStart"/>
             <w:r>
               <w:rPr>
                 <w:lang w:val="en-US"/>
               </w:rPr>
               <w:t>historical_avg_leg_duration_min</w:t>
             </w:r>
+            <w:proofErr w:type="spellEnd"/>
           </w:p>
         </w:tc>
         <w:tc>
@@ -19165,12 +19968,14 @@
             <w:pPr>
               <w:jc w:val="center"/>
             </w:pPr>
+            <w:proofErr w:type="spellStart"/>
             <w:r>
               <w:rPr>
                 <w:lang w:val="en-US"/>
               </w:rPr>
               <w:t>historical_avg_cum_delay_min</w:t>
             </w:r>
+            <w:proofErr w:type="spellEnd"/>
           </w:p>
         </w:tc>
         <w:tc>
@@ -19217,12 +20022,14 @@
             <w:pPr>
               <w:jc w:val="center"/>
             </w:pPr>
+            <w:proofErr w:type="spellStart"/>
             <w:r>
               <w:rPr>
                 <w:lang w:val="en-US"/>
               </w:rPr>
               <w:t>historical_avg_arrival_delay_min</w:t>
             </w:r>
+            <w:proofErr w:type="spellEnd"/>
           </w:p>
         </w:tc>
         <w:tc>
@@ -19269,12 +20076,14 @@
             <w:pPr>
               <w:jc w:val="center"/>
             </w:pPr>
+            <w:proofErr w:type="spellStart"/>
             <w:r>
               <w:rPr>
                 <w:lang w:val="en-US"/>
               </w:rPr>
               <w:t>delay_historical_difference</w:t>
             </w:r>
+            <w:proofErr w:type="spellEnd"/>
           </w:p>
         </w:tc>
         <w:tc>
@@ -19293,7 +20102,35 @@
               <w:rPr>
                 <w:lang w:val="en-US"/>
               </w:rPr>
-              <w:t>the difference between the current delay time and historical average (calculated from propagated_delay_min − historical_avg_propagated_delay_min)</w:t>
+              <w:t>the difference between the current delay time and historical average (calculated from </w:t>
+            </w:r>
+            <w:proofErr w:type="spellStart"/>
+            <w:r>
+              <w:rPr>
+                <w:lang w:val="en-US"/>
+              </w:rPr>
+              <w:t>propagated_delay_min</w:t>
+            </w:r>
+            <w:proofErr w:type="spellEnd"/>
+            <w:r>
+              <w:rPr>
+                <w:lang w:val="en-US"/>
+              </w:rPr>
+              <w:t> − </w:t>
+            </w:r>
+            <w:proofErr w:type="spellStart"/>
+            <w:r>
+              <w:rPr>
+                <w:lang w:val="en-US"/>
+              </w:rPr>
+              <w:t>historical_avg_propagated_delay_min</w:t>
+            </w:r>
+            <w:proofErr w:type="spellEnd"/>
+            <w:r>
+              <w:rPr>
+                <w:lang w:val="en-US"/>
+              </w:rPr>
+              <w:t>)</w:t>
             </w:r>
             <w:r>
               <w:t> </w:t>
@@ -19321,12 +20158,14 @@
             <w:pPr>
               <w:jc w:val="center"/>
             </w:pPr>
+            <w:proofErr w:type="spellStart"/>
             <w:r>
               <w:rPr>
                 <w:lang w:val="en-US"/>
               </w:rPr>
               <w:t>from_temp</w:t>
             </w:r>
+            <w:proofErr w:type="spellEnd"/>
           </w:p>
         </w:tc>
         <w:tc>
@@ -19373,6 +20212,7 @@
             <w:pPr>
               <w:jc w:val="center"/>
             </w:pPr>
+            <w:proofErr w:type="spellStart"/>
             <w:r>
               <w:rPr>
                 <w:lang w:val="en-US"/>
@@ -19385,6 +20225,7 @@
               </w:rPr>
               <w:t>precip</w:t>
             </w:r>
+            <w:proofErr w:type="spellEnd"/>
           </w:p>
         </w:tc>
         <w:tc>
@@ -19443,12 +20284,14 @@
             <w:pPr>
               <w:jc w:val="center"/>
             </w:pPr>
+            <w:proofErr w:type="spellStart"/>
             <w:r>
               <w:rPr>
                 <w:lang w:val="en-US"/>
               </w:rPr>
               <w:t>from_wind</w:t>
             </w:r>
+            <w:proofErr w:type="spellEnd"/>
           </w:p>
         </w:tc>
         <w:tc>
@@ -19495,12 +20338,14 @@
             <w:pPr>
               <w:jc w:val="center"/>
             </w:pPr>
+            <w:proofErr w:type="spellStart"/>
             <w:r>
               <w:rPr>
                 <w:lang w:val="en-US"/>
               </w:rPr>
               <w:t>to_temp</w:t>
             </w:r>
+            <w:proofErr w:type="spellEnd"/>
           </w:p>
         </w:tc>
         <w:tc>
@@ -19547,6 +20392,7 @@
             <w:pPr>
               <w:jc w:val="center"/>
             </w:pPr>
+            <w:proofErr w:type="spellStart"/>
             <w:r>
               <w:rPr>
                 <w:lang w:val="en-US"/>
@@ -19559,6 +20405,7 @@
               </w:rPr>
               <w:t>precip</w:t>
             </w:r>
+            <w:proofErr w:type="spellEnd"/>
           </w:p>
         </w:tc>
         <w:tc>
@@ -19617,12 +20464,14 @@
             <w:pPr>
               <w:jc w:val="center"/>
             </w:pPr>
+            <w:proofErr w:type="spellStart"/>
             <w:r>
               <w:rPr>
                 <w:lang w:val="en-US"/>
               </w:rPr>
               <w:t>to_wind</w:t>
             </w:r>
+            <w:proofErr w:type="spellEnd"/>
           </w:p>
         </w:tc>
         <w:tc>
@@ -19887,7 +20736,21 @@
         <w:rPr>
           <w:lang w:val="en-US"/>
         </w:rPr>
-        <w:t xml:space="preserve"> we wanted to see which segments (From station and To station) are mostly affected by delays</w:t>
+        <w:t xml:space="preserve"> we wanted to see which segments (From station and </w:t>
+      </w:r>
+      <w:proofErr w:type="gramStart"/>
+      <w:r>
+        <w:rPr>
+          <w:lang w:val="en-US"/>
+        </w:rPr>
+        <w:t>To</w:t>
+      </w:r>
+      <w:proofErr w:type="gramEnd"/>
+      <w:r>
+        <w:rPr>
+          <w:lang w:val="en-US"/>
+        </w:rPr>
+        <w:t xml:space="preserve"> station) are mostly affected by delays</w:t>
       </w:r>
     </w:p>
     <w:p>
@@ -19926,12 +20789,22 @@
         </w:rPr>
         <w:t xml:space="preserve">A darker red </w:t>
       </w:r>
-      <w:r>
-        <w:rPr>
-          <w:lang w:val="en-US"/>
-        </w:rPr>
-        <w:t>colour,</w:t>
-      </w:r>
+      <w:proofErr w:type="spellStart"/>
+      <w:proofErr w:type="gramStart"/>
+      <w:r>
+        <w:rPr>
+          <w:lang w:val="en-US"/>
+        </w:rPr>
+        <w:t>colour</w:t>
+      </w:r>
+      <w:proofErr w:type="spellEnd"/>
+      <w:r>
+        <w:rPr>
+          <w:lang w:val="en-US"/>
+        </w:rPr>
+        <w:t>,</w:t>
+      </w:r>
+      <w:proofErr w:type="gramEnd"/>
       <w:r>
         <w:rPr>
           <w:lang w:val="en-US"/>
@@ -20002,13 +20875,27 @@
         <w:rPr>
           <w:lang w:val="en-US"/>
         </w:rPr>
-        <w:t xml:space="preserve"> used in order </w:t>
-      </w:r>
-      <w:r>
-        <w:rPr>
-          <w:lang w:val="en-US"/>
-        </w:rPr>
-        <w:t xml:space="preserve">to make the </w:t>
+        <w:t xml:space="preserve"> used </w:t>
+      </w:r>
+      <w:proofErr w:type="gramStart"/>
+      <w:r>
+        <w:rPr>
+          <w:lang w:val="en-US"/>
+        </w:rPr>
+        <w:t xml:space="preserve">in order </w:t>
+      </w:r>
+      <w:r>
+        <w:rPr>
+          <w:lang w:val="en-US"/>
+        </w:rPr>
+        <w:t>to</w:t>
+      </w:r>
+      <w:proofErr w:type="gramEnd"/>
+      <w:r>
+        <w:rPr>
+          <w:lang w:val="en-US"/>
+        </w:rPr>
+        <w:t xml:space="preserve"> make the </w:t>
       </w:r>
       <w:r>
         <w:rPr>
@@ -21436,7 +22323,35 @@
         <w:rPr>
           <w:lang w:val="en-US"/>
         </w:rPr>
-        <w:t>London King’s Cross - Grantham experience the greatest average delay with other segments such as Retford -  Doncaster and St Neots -  Peterborough, having relatively substantial delays</w:t>
+        <w:t xml:space="preserve">London King’s Cross - Grantham experience the greatest average delay with other segments such as Retford </w:t>
+      </w:r>
+      <w:proofErr w:type="gramStart"/>
+      <w:r>
+        <w:rPr>
+          <w:lang w:val="en-US"/>
+        </w:rPr>
+        <w:t>-  Doncaster</w:t>
+      </w:r>
+      <w:proofErr w:type="gramEnd"/>
+      <w:r>
+        <w:rPr>
+          <w:lang w:val="en-US"/>
+        </w:rPr>
+        <w:t xml:space="preserve"> and St Neots </w:t>
+      </w:r>
+      <w:proofErr w:type="gramStart"/>
+      <w:r>
+        <w:rPr>
+          <w:lang w:val="en-US"/>
+        </w:rPr>
+        <w:t>-  Peterborough</w:t>
+      </w:r>
+      <w:proofErr w:type="gramEnd"/>
+      <w:r>
+        <w:rPr>
+          <w:lang w:val="en-US"/>
+        </w:rPr>
+        <w:t>, having relatively substantial delays</w:t>
       </w:r>
       <w:r>
         <w:rPr>
@@ -21479,13 +22394,77 @@
         <w:rPr>
           <w:lang w:val="en-US"/>
         </w:rPr>
-        <w:t xml:space="preserve"> darker coloured</w:t>
-      </w:r>
-      <w:r>
-        <w:rPr>
-          <w:lang w:val="en-US"/>
-        </w:rPr>
-        <w:t xml:space="preserve"> segments specifically to see the relationship between delays and many factors such as weather conditions present in our dataset, such as temperature, precipitation, and windspeed. A time series on how cumulative delays of train journeys changes based on the segment of track would be very useful for seeing which segments of track are particularly problematic which could then be further investigated to prevent future delays and </w:t>
+        <w:t xml:space="preserve"> darker </w:t>
+      </w:r>
+      <w:proofErr w:type="spellStart"/>
+      <w:r>
+        <w:rPr>
+          <w:lang w:val="en-US"/>
+        </w:rPr>
+        <w:t>coloured</w:t>
+      </w:r>
+      <w:proofErr w:type="spellEnd"/>
+      <w:r>
+        <w:rPr>
+          <w:lang w:val="en-US"/>
+        </w:rPr>
+        <w:t xml:space="preserve"> segments specifically </w:t>
+      </w:r>
+      <w:proofErr w:type="gramStart"/>
+      <w:r>
+        <w:rPr>
+          <w:lang w:val="en-US"/>
+        </w:rPr>
+        <w:t>to see</w:t>
+      </w:r>
+      <w:proofErr w:type="gramEnd"/>
+      <w:r>
+        <w:rPr>
+          <w:lang w:val="en-US"/>
+        </w:rPr>
+        <w:t xml:space="preserve"> the relationship between delays and many factors such as weather conditions present in our dataset, such as temperature, precipitation, and windspeed. </w:t>
+      </w:r>
+      <w:proofErr w:type="gramStart"/>
+      <w:r>
+        <w:rPr>
+          <w:lang w:val="en-US"/>
+        </w:rPr>
+        <w:t>A time</w:t>
+      </w:r>
+      <w:proofErr w:type="gramEnd"/>
+      <w:r>
+        <w:rPr>
+          <w:lang w:val="en-US"/>
+        </w:rPr>
+        <w:t xml:space="preserve"> series on how cumulative delays of train journeys </w:t>
+      </w:r>
+      <w:proofErr w:type="gramStart"/>
+      <w:r>
+        <w:rPr>
+          <w:lang w:val="en-US"/>
+        </w:rPr>
+        <w:t>changes</w:t>
+      </w:r>
+      <w:proofErr w:type="gramEnd"/>
+      <w:r>
+        <w:rPr>
+          <w:lang w:val="en-US"/>
+        </w:rPr>
+        <w:t xml:space="preserve"> based on the segment of track would be very useful for seeing which segments of track are particularly </w:t>
+      </w:r>
+      <w:proofErr w:type="gramStart"/>
+      <w:r>
+        <w:rPr>
+          <w:lang w:val="en-US"/>
+        </w:rPr>
+        <w:t>problematic</w:t>
+      </w:r>
+      <w:proofErr w:type="gramEnd"/>
+      <w:r>
+        <w:rPr>
+          <w:lang w:val="en-US"/>
+        </w:rPr>
+        <w:t xml:space="preserve"> which could then be further investigated to prevent future delays and </w:t>
       </w:r>
       <w:r>
         <w:rPr>
@@ -21527,7 +22506,35 @@
         <w:rPr>
           <w:lang w:val="en-US"/>
         </w:rPr>
-        <w:t>Other factors such as day of week/month or historical averages will also be looked at in order to gain as much understanding as possible and for discovering the best features to keep for the classification and regression machine learning models.</w:t>
+        <w:t xml:space="preserve">Other factors such as day of week/month or historical averages will also be looked at </w:t>
+      </w:r>
+      <w:proofErr w:type="gramStart"/>
+      <w:r>
+        <w:rPr>
+          <w:lang w:val="en-US"/>
+        </w:rPr>
+        <w:t>in order to</w:t>
+      </w:r>
+      <w:proofErr w:type="gramEnd"/>
+      <w:r>
+        <w:rPr>
+          <w:lang w:val="en-US"/>
+        </w:rPr>
+        <w:t xml:space="preserve"> gain as much understanding as possible and </w:t>
+      </w:r>
+      <w:proofErr w:type="gramStart"/>
+      <w:r>
+        <w:rPr>
+          <w:lang w:val="en-US"/>
+        </w:rPr>
+        <w:t>for discovering</w:t>
+      </w:r>
+      <w:proofErr w:type="gramEnd"/>
+      <w:r>
+        <w:rPr>
+          <w:lang w:val="en-US"/>
+        </w:rPr>
+        <w:t xml:space="preserve"> the best features to keep for the classification and regression machine learning models.</w:t>
       </w:r>
     </w:p>
     <w:p/>
@@ -21541,6 +22548,9 @@
     <w:p/>
     <w:p>
       <w:r>
+        <w:rPr>
+          <w:noProof/>
+        </w:rPr>
         <w:drawing>
           <wp:inline distT="0" distB="0" distL="0" distR="0" wp14:anchorId="363E523F" wp14:editId="4DDFFE43">
             <wp:extent cx="5734050" cy="2979420"/>
@@ -21582,6 +22592,9 @@
     <w:p/>
     <w:p>
       <w:r>
+        <w:rPr>
+          <w:noProof/>
+        </w:rPr>
         <w:lastRenderedPageBreak/>
         <w:drawing>
           <wp:inline distT="0" distB="0" distL="0" distR="0" wp14:anchorId="0B22CCC8" wp14:editId="42EFE92D">
@@ -21625,6 +22638,9 @@
     <w:p/>
     <w:p>
       <w:r>
+        <w:rPr>
+          <w:noProof/>
+        </w:rPr>
         <w:drawing>
           <wp:inline distT="0" distB="0" distL="0" distR="0" wp14:anchorId="3A0C2257" wp14:editId="5647A937">
             <wp:extent cx="5734050" cy="2976880"/>
@@ -21666,6 +22682,9 @@
     <w:p/>
     <w:p>
       <w:r>
+        <w:rPr>
+          <w:noProof/>
+        </w:rPr>
         <w:lastRenderedPageBreak/>
         <w:drawing>
           <wp:inline distT="0" distB="0" distL="0" distR="0" wp14:anchorId="1ECA0EC6" wp14:editId="253BA548">
@@ -21747,52 +22766,70 @@
       </w:r>
     </w:p>
     <w:p>
+      <w:proofErr w:type="spellStart"/>
       <w:r>
         <w:t>prev_train_leg_delay_min</w:t>
       </w:r>
-    </w:p>
-    <w:p>
+      <w:proofErr w:type="spellEnd"/>
+    </w:p>
+    <w:p>
+      <w:proofErr w:type="spellStart"/>
       <w:r>
         <w:t>prev_train_cum_delay_min</w:t>
       </w:r>
-    </w:p>
-    <w:p>
+      <w:proofErr w:type="spellEnd"/>
+    </w:p>
+    <w:p>
+      <w:proofErr w:type="spellStart"/>
       <w:r>
         <w:t>prev_train_segment_duration_min</w:t>
       </w:r>
-    </w:p>
-    <w:p>
+      <w:proofErr w:type="spellEnd"/>
+    </w:p>
+    <w:p>
+      <w:proofErr w:type="spellStart"/>
       <w:r>
         <w:t>prev_train_end_segment_delay_min</w:t>
       </w:r>
-    </w:p>
-    <w:p>
+      <w:proofErr w:type="spellEnd"/>
+    </w:p>
+    <w:p>
+      <w:proofErr w:type="spellStart"/>
       <w:r>
         <w:t>historical_avg_propagated_delay_min</w:t>
       </w:r>
-    </w:p>
-    <w:p>
+      <w:proofErr w:type="spellEnd"/>
+    </w:p>
+    <w:p>
+      <w:proofErr w:type="spellStart"/>
       <w:r>
         <w:t>historical_avg_leg_duration_min</w:t>
       </w:r>
-    </w:p>
-    <w:p>
+      <w:proofErr w:type="spellEnd"/>
+    </w:p>
+    <w:p>
+      <w:proofErr w:type="spellStart"/>
       <w:r>
         <w:t>historical_avg_cum_delay_min</w:t>
       </w:r>
-    </w:p>
-    <w:p>
+      <w:proofErr w:type="spellEnd"/>
+    </w:p>
+    <w:p>
+      <w:proofErr w:type="spellStart"/>
       <w:r>
         <w:t>historical_avg_arrival_delay_min</w:t>
       </w:r>
-    </w:p>
-    <w:p>
+      <w:proofErr w:type="spellEnd"/>
+    </w:p>
+    <w:p>
+      <w:proofErr w:type="spellStart"/>
       <w:r>
         <w:rPr>
           <w:lang w:val="en-US"/>
         </w:rPr>
         <w:t>to_sched_arrival_min</w:t>
       </w:r>
+      <w:proofErr w:type="spellEnd"/>
     </w:p>
     <w:p>
       <w:pPr>
@@ -22075,8 +23112,13 @@
     <w:p/>
     <w:p>
       <w:r>
-        <w:t>Open-Meteo</w:t>
-      </w:r>
+        <w:t>Open-</w:t>
+      </w:r>
+      <w:proofErr w:type="spellStart"/>
+      <w:r>
+        <w:t>Meteo</w:t>
+      </w:r>
+      <w:proofErr w:type="spellEnd"/>
       <w:r>
         <w:t xml:space="preserve"> (20</w:t>
       </w:r>
@@ -22144,8 +23186,15 @@
       <w:r>
         <w:t>) ‘</w:t>
       </w:r>
-      <w:r>
-        <w:t>Darwin:Push Port</w:t>
+      <w:proofErr w:type="spellStart"/>
+      <w:proofErr w:type="gramStart"/>
+      <w:r>
+        <w:t>Darwin:Push</w:t>
+      </w:r>
+      <w:proofErr w:type="spellEnd"/>
+      <w:proofErr w:type="gramEnd"/>
+      <w:r>
+        <w:t xml:space="preserve"> Port</w:t>
       </w:r>
       <w:r>
         <w:t>’.</w:t>
@@ -22202,8 +23251,15 @@
       <w:r>
         <w:t>) ‘</w:t>
       </w:r>
-      <w:r>
-        <w:t>Darwin:Schedule Element</w:t>
+      <w:proofErr w:type="spellStart"/>
+      <w:proofErr w:type="gramStart"/>
+      <w:r>
+        <w:t>Darwin:Schedule</w:t>
+      </w:r>
+      <w:proofErr w:type="spellEnd"/>
+      <w:proofErr w:type="gramEnd"/>
+      <w:r>
+        <w:t xml:space="preserve"> Element</w:t>
       </w:r>
       <w:r>
         <w:t>’.</w:t>
@@ -22601,7 +23657,7 @@
         <w:noProof/>
         <w:color w:val="EE0000"/>
       </w:rPr>
-      <w:t>6. Exploratory Data Analysis</w:t>
+      <w:t>4. Project Planning</w:t>
     </w:r>
     <w:r>
       <w:rPr>
@@ -34815,6 +35871,7 @@
   <w:style w:type="character" w:default="1" w:styleId="DefaultParagraphFont">
     <w:name w:val="Default Paragraph Font"/>
     <w:uiPriority w:val="1"/>
+    <w:semiHidden/>
     <w:unhideWhenUsed/>
   </w:style>
   <w:style w:type="table" w:default="1" w:styleId="TableNormal">

</xml_diff>